<commit_message>
updated communications server module, and made some tweaks to the client module
</commit_message>
<xml_diff>
--- a/Communications SRS.docx
+++ b/Communications SRS.docx
@@ -1,6 +1,6 @@
 
 <file path=word/document.xml><?xml version="1.0" encoding="utf-8"?>
-<w:document xmlns:wpc="http://schemas.microsoft.com/office/word/2010/wordprocessingCanvas" xmlns:cx="http://schemas.microsoft.com/office/drawing/2014/chartex" xmlns:cx1="http://schemas.microsoft.com/office/drawing/2015/9/8/chartex" xmlns:cx2="http://schemas.microsoft.com/office/drawing/2015/10/21/chartex" xmlns:cx3="http://schemas.microsoft.com/office/drawing/2016/5/9/chartex" xmlns:cx4="http://schemas.microsoft.com/office/drawing/2016/5/10/chartex" xmlns:cx5="http://schemas.microsoft.com/office/drawing/2016/5/11/chartex" xmlns:cx6="http://schemas.microsoft.com/office/drawing/2016/5/12/chartex" xmlns:cx7="http://schemas.microsoft.com/office/drawing/2016/5/13/chartex" xmlns:cx8="http://schemas.microsoft.com/office/drawing/2016/5/14/chartex" xmlns:mc="http://schemas.openxmlformats.org/markup-compatibility/2006" xmlns:aink="http://schemas.microsoft.com/office/drawing/2016/ink" xmlns:am3d="http://schemas.microsoft.com/office/drawing/2017/model3d" xmlns:o="urn:schemas-microsoft-com:office:office" xmlns:oel="http://schemas.microsoft.com/office/2019/extlst" xmlns:r="http://schemas.openxmlformats.org/officeDocument/2006/relationships" xmlns:m="http://schemas.openxmlformats.org/officeDocument/2006/math" xmlns:v="urn:schemas-microsoft-com:vml" xmlns:wp14="http://schemas.microsoft.com/office/word/2010/wordprocessingDrawing" xmlns:wp="http://schemas.openxmlformats.org/drawingml/2006/wordprocessingDrawing" xmlns:w10="urn:schemas-microsoft-com:office:word" xmlns:w="http://schemas.openxmlformats.org/wordprocessingml/2006/main" xmlns:w14="http://schemas.microsoft.com/office/word/2010/wordml" xmlns:w15="http://schemas.microsoft.com/office/word/2012/wordml" xmlns:w16cex="http://schemas.microsoft.com/office/word/2018/wordml/cex" xmlns:w16cid="http://schemas.microsoft.com/office/word/2016/wordml/cid" xmlns:w16="http://schemas.microsoft.com/office/word/2018/wordml" xmlns:w16sdtdh="http://schemas.microsoft.com/office/word/2020/wordml/sdtdatahash" xmlns:w16se="http://schemas.microsoft.com/office/word/2015/wordml/symex" xmlns:wpg="http://schemas.microsoft.com/office/word/2010/wordprocessingGroup" xmlns:wpi="http://schemas.microsoft.com/office/word/2010/wordprocessingInk" xmlns:wne="http://schemas.microsoft.com/office/word/2006/wordml" xmlns:wps="http://schemas.microsoft.com/office/word/2010/wordprocessingShape" mc:Ignorable="w14 w15 w16se w16cid w16 w16cex w16sdtdh wp14">
+<w:document xmlns:wpc="http://schemas.microsoft.com/office/word/2010/wordprocessingCanvas" xmlns:cx="http://schemas.microsoft.com/office/drawing/2014/chartex" xmlns:cx1="http://schemas.microsoft.com/office/drawing/2015/9/8/chartex" xmlns:cx2="http://schemas.microsoft.com/office/drawing/2015/10/21/chartex" xmlns:cx3="http://schemas.microsoft.com/office/drawing/2016/5/9/chartex" xmlns:cx4="http://schemas.microsoft.com/office/drawing/2016/5/10/chartex" xmlns:cx5="http://schemas.microsoft.com/office/drawing/2016/5/11/chartex" xmlns:cx6="http://schemas.microsoft.com/office/drawing/2016/5/12/chartex" xmlns:cx7="http://schemas.microsoft.com/office/drawing/2016/5/13/chartex" xmlns:cx8="http://schemas.microsoft.com/office/drawing/2016/5/14/chartex" xmlns:mc="http://schemas.openxmlformats.org/markup-compatibility/2006" xmlns:aink="http://schemas.microsoft.com/office/drawing/2016/ink" xmlns:am3d="http://schemas.microsoft.com/office/drawing/2017/model3d" xmlns:o="urn:schemas-microsoft-com:office:office" xmlns:oel="http://schemas.microsoft.com/office/2019/extlst" xmlns:r="http://schemas.openxmlformats.org/officeDocument/2006/relationships" xmlns:m="http://schemas.openxmlformats.org/officeDocument/2006/math" xmlns:v="urn:schemas-microsoft-com:vml" xmlns:wp14="http://schemas.microsoft.com/office/word/2010/wordprocessingDrawing" xmlns:wp="http://schemas.openxmlformats.org/drawingml/2006/wordprocessingDrawing" xmlns:w10="urn:schemas-microsoft-com:office:word" xmlns:w="http://schemas.openxmlformats.org/wordprocessingml/2006/main" xmlns:w14="http://schemas.microsoft.com/office/word/2010/wordml" xmlns:w15="http://schemas.microsoft.com/office/word/2012/wordml" xmlns:w16cex="http://schemas.microsoft.com/office/word/2018/wordml/cex" xmlns:w16cid="http://schemas.microsoft.com/office/word/2016/wordml/cid" xmlns:w16="http://schemas.microsoft.com/office/word/2018/wordml" xmlns:w16du="http://schemas.microsoft.com/office/word/2023/wordml/word16du" xmlns:w16sdtdh="http://schemas.microsoft.com/office/word/2020/wordml/sdtdatahash" xmlns:w16sdtfl="http://schemas.microsoft.com/office/word/2024/wordml/sdtformatlock" xmlns:w16se="http://schemas.microsoft.com/office/word/2015/wordml/symex" xmlns:wpg="http://schemas.microsoft.com/office/word/2010/wordprocessingGroup" xmlns:wpi="http://schemas.microsoft.com/office/word/2010/wordprocessingInk" xmlns:wne="http://schemas.microsoft.com/office/word/2006/wordml" xmlns:wps="http://schemas.microsoft.com/office/word/2010/wordprocessingShape" mc:Ignorable="w14 w15 w16se w16cid w16 w16cex w16sdtdh w16sdtfl w16du wp14">
   <w:body>
     <w:p>
       <w:pPr>
@@ -4716,7 +4716,25 @@
           <w:sz w:val="20"/>
           <w:szCs w:val="20"/>
         </w:rPr>
-        <w:t>The system will be organized into 3 major modules: the Client application module, the IT module, and the communication service  module.</w:t>
+        <w:t xml:space="preserve">The system will be organized into 3 major modules: the Client application module, the IT module, and the communication </w:t>
+      </w:r>
+      <w:proofErr w:type="gramStart"/>
+      <w:r>
+        <w:rPr>
+          <w:rFonts w:ascii="Times New Roman" w:eastAsia="Times New Roman" w:hAnsi="Times New Roman" w:cs="Times New Roman"/>
+          <w:sz w:val="20"/>
+          <w:szCs w:val="20"/>
+        </w:rPr>
+        <w:t>service  module</w:t>
+      </w:r>
+      <w:proofErr w:type="gramEnd"/>
+      <w:r>
+        <w:rPr>
+          <w:rFonts w:ascii="Times New Roman" w:eastAsia="Times New Roman" w:hAnsi="Times New Roman" w:cs="Times New Roman"/>
+          <w:sz w:val="20"/>
+          <w:szCs w:val="20"/>
+        </w:rPr>
+        <w:t>.</w:t>
       </w:r>
     </w:p>
     <w:p>
@@ -5298,7 +5316,7 @@
           <w:sz w:val="20"/>
           <w:szCs w:val="20"/>
         </w:rPr>
-        <w:t xml:space="preserve">The </w:t>
+        <w:t>The Login Module (</w:t>
       </w:r>
       <w:r>
         <w:rPr>
@@ -5306,7 +5324,7 @@
           <w:sz w:val="20"/>
           <w:szCs w:val="20"/>
         </w:rPr>
-        <w:t>Login</w:t>
+        <w:t>L</w:t>
       </w:r>
       <w:r>
         <w:rPr>
@@ -5314,7 +5332,7 @@
           <w:sz w:val="20"/>
           <w:szCs w:val="20"/>
         </w:rPr>
-        <w:t xml:space="preserve"> Module (CM) contains a login menu to allow users to log into the communications app. This menu is displayed upon loading the client, (?) unless the server notes the user as currently logged in on that client.</w:t>
+        <w:t>M) contains a login menu to allow users to log into the communications app. This menu is displayed upon loading the client, (?) unless the server notes the user as currently logged in on that client.</w:t>
       </w:r>
     </w:p>
     <w:p>
@@ -5398,15 +5416,7 @@
           <w:sz w:val="20"/>
           <w:szCs w:val="20"/>
         </w:rPr>
-        <w:t xml:space="preserve">On a successful login, the user will be directed to </w:t>
-      </w:r>
-      <w:r>
-        <w:rPr>
-          <w:rFonts w:ascii="Times New Roman" w:hAnsi="Times New Roman" w:cs="Times New Roman"/>
-          <w:sz w:val="20"/>
-          <w:szCs w:val="20"/>
-        </w:rPr>
-        <w:t xml:space="preserve">their respective role’s user interface </w:t>
+        <w:t xml:space="preserve">On a successful login, the user will be directed to their respective role’s user interface </w:t>
       </w:r>
     </w:p>
     <w:p>
@@ -5490,7 +5500,39 @@
           <w:sz w:val="20"/>
           <w:szCs w:val="20"/>
         </w:rPr>
-        <w:t>The CM contains a communications menu to allow users to communicate with other users. This menu is displayed upon loading the client (?) only when the server notes the user as currently logged in on that client.</w:t>
+        <w:t>The C</w:t>
+      </w:r>
+      <w:r>
+        <w:rPr>
+          <w:rFonts w:ascii="Times New Roman" w:hAnsi="Times New Roman" w:cs="Times New Roman"/>
+          <w:sz w:val="20"/>
+          <w:szCs w:val="20"/>
+        </w:rPr>
+        <w:t xml:space="preserve">lient </w:t>
+      </w:r>
+      <w:r>
+        <w:rPr>
+          <w:rFonts w:ascii="Times New Roman" w:hAnsi="Times New Roman" w:cs="Times New Roman"/>
+          <w:sz w:val="20"/>
+          <w:szCs w:val="20"/>
+        </w:rPr>
+        <w:t>M</w:t>
+      </w:r>
+      <w:r>
+        <w:rPr>
+          <w:rFonts w:ascii="Times New Roman" w:hAnsi="Times New Roman" w:cs="Times New Roman"/>
+          <w:sz w:val="20"/>
+          <w:szCs w:val="20"/>
+        </w:rPr>
+        <w:t>odule (CM)</w:t>
+      </w:r>
+      <w:r>
+        <w:rPr>
+          <w:rFonts w:ascii="Times New Roman" w:hAnsi="Times New Roman" w:cs="Times New Roman"/>
+          <w:sz w:val="20"/>
+          <w:szCs w:val="20"/>
+        </w:rPr>
+        <w:t xml:space="preserve"> contains a communications menu to allow users to communicate with other users. This menu is displayed upon loading the client (?) only when the server notes the user as currently logged in on that client.</w:t>
       </w:r>
     </w:p>
     <w:p>
@@ -5511,23 +5553,7 @@
           <w:sz w:val="20"/>
           <w:szCs w:val="20"/>
         </w:rPr>
-        <w:t>The communications menu contains a list of</w:t>
-      </w:r>
-      <w:r>
-        <w:rPr>
-          <w:rFonts w:ascii="Times New Roman" w:hAnsi="Times New Roman" w:cs="Times New Roman"/>
-          <w:sz w:val="20"/>
-          <w:szCs w:val="20"/>
-        </w:rPr>
-        <w:t xml:space="preserve"> chats the user is </w:t>
-      </w:r>
-      <w:r>
-        <w:rPr>
-          <w:rFonts w:ascii="Times New Roman" w:hAnsi="Times New Roman" w:cs="Times New Roman"/>
-          <w:sz w:val="20"/>
-          <w:szCs w:val="20"/>
-        </w:rPr>
-        <w:t>a part of</w:t>
+        <w:t>The CM must be able to secure a connection to send and receive signals from the CSM</w:t>
       </w:r>
     </w:p>
     <w:p>
@@ -5548,7 +5574,23 @@
           <w:sz w:val="20"/>
           <w:szCs w:val="20"/>
         </w:rPr>
-        <w:t>The user can select any chat in this list to open it (see section 3.1.2.3)</w:t>
+        <w:t>The communications menu contains a list of</w:t>
+      </w:r>
+      <w:r>
+        <w:rPr>
+          <w:rFonts w:ascii="Times New Roman" w:hAnsi="Times New Roman" w:cs="Times New Roman"/>
+          <w:sz w:val="20"/>
+          <w:szCs w:val="20"/>
+        </w:rPr>
+        <w:t xml:space="preserve"> chats the user is </w:t>
+      </w:r>
+      <w:r>
+        <w:rPr>
+          <w:rFonts w:ascii="Times New Roman" w:hAnsi="Times New Roman" w:cs="Times New Roman"/>
+          <w:sz w:val="20"/>
+          <w:szCs w:val="20"/>
+        </w:rPr>
+        <w:t>a part of</w:t>
       </w:r>
     </w:p>
     <w:p>
@@ -5569,7 +5611,7 @@
           <w:sz w:val="20"/>
           <w:szCs w:val="20"/>
         </w:rPr>
-        <w:t>Each chat in this list indicates if it contains unread messages</w:t>
+        <w:t>The user can select any chat in this list to open it (see section 3.1.2.3)</w:t>
       </w:r>
     </w:p>
     <w:p>
@@ -5590,39 +5632,7 @@
           <w:sz w:val="20"/>
           <w:szCs w:val="20"/>
         </w:rPr>
-        <w:t>(?) The list is ordered from the one with the</w:t>
-      </w:r>
-      <w:r>
-        <w:rPr>
-          <w:rFonts w:ascii="Times New Roman" w:hAnsi="Times New Roman" w:cs="Times New Roman"/>
-          <w:sz w:val="20"/>
-          <w:szCs w:val="20"/>
-        </w:rPr>
-        <w:t xml:space="preserve"> most recent date contained in the most recent message or creation date</w:t>
-      </w:r>
-      <w:r>
-        <w:rPr>
-          <w:rFonts w:ascii="Times New Roman" w:hAnsi="Times New Roman" w:cs="Times New Roman"/>
-          <w:sz w:val="20"/>
-          <w:szCs w:val="20"/>
-        </w:rPr>
-        <w:t xml:space="preserve">, to the one </w:t>
-      </w:r>
-      <w:r>
-        <w:rPr>
-          <w:rFonts w:ascii="Times New Roman" w:hAnsi="Times New Roman" w:cs="Times New Roman"/>
-          <w:sz w:val="20"/>
-          <w:szCs w:val="20"/>
-        </w:rPr>
-        <w:t>that is the oldest</w:t>
-      </w:r>
-      <w:r>
-        <w:rPr>
-          <w:rFonts w:ascii="Times New Roman" w:hAnsi="Times New Roman" w:cs="Times New Roman"/>
-          <w:sz w:val="20"/>
-          <w:szCs w:val="20"/>
-        </w:rPr>
-        <w:t>. Chats can be pinned to the top of this list</w:t>
+        <w:t>Each chat in this list indicates if it contains unread messages</w:t>
       </w:r>
     </w:p>
     <w:p>
@@ -5643,7 +5653,39 @@
           <w:sz w:val="20"/>
           <w:szCs w:val="20"/>
         </w:rPr>
-        <w:t>The server can signal to the client if this list needs to be updated, and in turn the client will update it, displaying the most up to date information</w:t>
+        <w:t>(?) The list is ordered from the one with the</w:t>
+      </w:r>
+      <w:r>
+        <w:rPr>
+          <w:rFonts w:ascii="Times New Roman" w:hAnsi="Times New Roman" w:cs="Times New Roman"/>
+          <w:sz w:val="20"/>
+          <w:szCs w:val="20"/>
+        </w:rPr>
+        <w:t xml:space="preserve"> most recent date contained in the most recent message or creation date</w:t>
+      </w:r>
+      <w:r>
+        <w:rPr>
+          <w:rFonts w:ascii="Times New Roman" w:hAnsi="Times New Roman" w:cs="Times New Roman"/>
+          <w:sz w:val="20"/>
+          <w:szCs w:val="20"/>
+        </w:rPr>
+        <w:t xml:space="preserve">, to the one </w:t>
+      </w:r>
+      <w:r>
+        <w:rPr>
+          <w:rFonts w:ascii="Times New Roman" w:hAnsi="Times New Roman" w:cs="Times New Roman"/>
+          <w:sz w:val="20"/>
+          <w:szCs w:val="20"/>
+        </w:rPr>
+        <w:t>that is the oldest</w:t>
+      </w:r>
+      <w:r>
+        <w:rPr>
+          <w:rFonts w:ascii="Times New Roman" w:hAnsi="Times New Roman" w:cs="Times New Roman"/>
+          <w:sz w:val="20"/>
+          <w:szCs w:val="20"/>
+        </w:rPr>
+        <w:t>. Chats can be pinned to the top of this list</w:t>
       </w:r>
     </w:p>
     <w:p>
@@ -5664,7 +5706,7 @@
           <w:sz w:val="20"/>
           <w:szCs w:val="20"/>
         </w:rPr>
-        <w:t>The communications menu contains a new chat button, which creates a chat between you, and the users specified.</w:t>
+        <w:t>The server can signal to the client if this list needs to be updated, and in turn the client will update it, displaying the most up to date information</w:t>
       </w:r>
     </w:p>
     <w:p>
@@ -5685,31 +5727,7 @@
           <w:sz w:val="20"/>
           <w:szCs w:val="20"/>
         </w:rPr>
-        <w:t>Only inputting 1 user</w:t>
-      </w:r>
-      <w:r>
-        <w:rPr>
-          <w:rFonts w:ascii="Times New Roman" w:hAnsi="Times New Roman" w:cs="Times New Roman"/>
-          <w:sz w:val="20"/>
-          <w:szCs w:val="20"/>
-        </w:rPr>
-        <w:t>name</w:t>
-      </w:r>
-      <w:r>
-        <w:rPr>
-          <w:rFonts w:ascii="Times New Roman" w:hAnsi="Times New Roman" w:cs="Times New Roman"/>
-          <w:sz w:val="20"/>
-          <w:szCs w:val="20"/>
-        </w:rPr>
-        <w:t xml:space="preserve"> </w:t>
-      </w:r>
-      <w:r>
-        <w:rPr>
-          <w:rFonts w:ascii="Times New Roman" w:hAnsi="Times New Roman" w:cs="Times New Roman"/>
-          <w:sz w:val="20"/>
-          <w:szCs w:val="20"/>
-        </w:rPr>
-        <w:t>defaults the chat’s designation as a private message chat. A user can select for the chat to be a group chat, designating it as a group message chat</w:t>
+        <w:t>The communications menu contains a new chat button, which creates a chat between you, and the users specified.</w:t>
       </w:r>
     </w:p>
     <w:p>
@@ -5730,7 +5748,31 @@
           <w:sz w:val="20"/>
           <w:szCs w:val="20"/>
         </w:rPr>
-        <w:t>Inputting multiple usernames defaults the chat’s designation as a group message chat. This cannot be designated as anything other than a group message chat</w:t>
+        <w:t>Only inputting 1 user</w:t>
+      </w:r>
+      <w:r>
+        <w:rPr>
+          <w:rFonts w:ascii="Times New Roman" w:hAnsi="Times New Roman" w:cs="Times New Roman"/>
+          <w:sz w:val="20"/>
+          <w:szCs w:val="20"/>
+        </w:rPr>
+        <w:t>name</w:t>
+      </w:r>
+      <w:r>
+        <w:rPr>
+          <w:rFonts w:ascii="Times New Roman" w:hAnsi="Times New Roman" w:cs="Times New Roman"/>
+          <w:sz w:val="20"/>
+          <w:szCs w:val="20"/>
+        </w:rPr>
+        <w:t xml:space="preserve"> </w:t>
+      </w:r>
+      <w:r>
+        <w:rPr>
+          <w:rFonts w:ascii="Times New Roman" w:hAnsi="Times New Roman" w:cs="Times New Roman"/>
+          <w:sz w:val="20"/>
+          <w:szCs w:val="20"/>
+        </w:rPr>
+        <w:t>defaults the chat’s designation as a private message chat. A user can select for the chat to be a group chat, designating it as a group message chat</w:t>
       </w:r>
     </w:p>
     <w:p>
@@ -5751,7 +5793,7 @@
           <w:sz w:val="20"/>
           <w:szCs w:val="20"/>
         </w:rPr>
-        <w:t>Upon creating the new chat, the client will send the request to the server, creating the chat.</w:t>
+        <w:t>Inputting multiple usernames defaults the chat’s designation as a group message chat. This cannot be designated as anything other than a group message chat</w:t>
       </w:r>
     </w:p>
     <w:p>
@@ -5772,15 +5814,7 @@
           <w:sz w:val="20"/>
           <w:szCs w:val="20"/>
         </w:rPr>
-        <w:t xml:space="preserve">The communications menu </w:t>
-      </w:r>
-      <w:r>
-        <w:rPr>
-          <w:rFonts w:ascii="Times New Roman" w:hAnsi="Times New Roman" w:cs="Times New Roman"/>
-          <w:sz w:val="20"/>
-          <w:szCs w:val="20"/>
-        </w:rPr>
-        <w:t>contains a profile button, displaying the user’s username, and a button to logout of the account</w:t>
+        <w:t>Upon creating the new chat, the client will send the request to the server, creating the chat.</w:t>
       </w:r>
     </w:p>
     <w:p>
@@ -5801,7 +5835,15 @@
           <w:sz w:val="20"/>
           <w:szCs w:val="20"/>
         </w:rPr>
-        <w:t>The logout button re-directs to the login menu upon being selected</w:t>
+        <w:t xml:space="preserve">The communications menu </w:t>
+      </w:r>
+      <w:r>
+        <w:rPr>
+          <w:rFonts w:ascii="Times New Roman" w:hAnsi="Times New Roman" w:cs="Times New Roman"/>
+          <w:sz w:val="20"/>
+          <w:szCs w:val="20"/>
+        </w:rPr>
+        <w:t>contains a profile button, displaying the user’s username, and a button to logout of the account</w:t>
       </w:r>
     </w:p>
     <w:p>
@@ -5822,8 +5864,7 @@
           <w:sz w:val="20"/>
           <w:szCs w:val="20"/>
         </w:rPr>
-        <w:lastRenderedPageBreak/>
-        <w:t>The communications menu contains a chat menu, displaying a specific chat, selected from the list of chats the user is involved in (see section 3.1.2.2.1)</w:t>
+        <w:t>The logout button re-directs to the login menu upon being selected</w:t>
       </w:r>
     </w:p>
     <w:p>
@@ -5844,7 +5885,8 @@
           <w:sz w:val="20"/>
           <w:szCs w:val="20"/>
         </w:rPr>
-        <w:t>The chat selected must be designated as a private or a group chat.</w:t>
+        <w:lastRenderedPageBreak/>
+        <w:t>The communications menu contains a chat menu, displaying a specific chat, selected from the list of chats the user is involved in (see section 3.1.2.2.1)</w:t>
       </w:r>
     </w:p>
     <w:p>
@@ -5865,7 +5907,7 @@
           <w:sz w:val="20"/>
           <w:szCs w:val="20"/>
         </w:rPr>
-        <w:t>In this menu, the user can see a scrollable view of all messages previously sent in the chat.</w:t>
+        <w:t>The chat selected must be designated as a private or a group chat.</w:t>
       </w:r>
     </w:p>
     <w:p>
@@ -5886,7 +5928,7 @@
           <w:sz w:val="20"/>
           <w:szCs w:val="20"/>
         </w:rPr>
-        <w:t>Each message displays the username of the sender, and the message sent</w:t>
+        <w:t>In this menu, the user can see a scrollable view of all messages previously sent in the chat.</w:t>
       </w:r>
     </w:p>
     <w:p>
@@ -5907,7 +5949,7 @@
           <w:sz w:val="20"/>
           <w:szCs w:val="20"/>
         </w:rPr>
-        <w:t>Messages sent while the user was offline are indicated, and the client signals to the server that the user has seen these messages</w:t>
+        <w:t>Each message displays the username of the sender, and the message sent</w:t>
       </w:r>
     </w:p>
     <w:p>
@@ -5928,7 +5970,7 @@
           <w:sz w:val="20"/>
           <w:szCs w:val="20"/>
         </w:rPr>
-        <w:t>Whenever a new message is sent from the server, this view is updated, displaying the new message at the forefront</w:t>
+        <w:t>Messages sent while the user was offline are indicated, and the client signals to the server that the user has seen these messages</w:t>
       </w:r>
     </w:p>
     <w:p>
@@ -5949,7 +5991,7 @@
           <w:sz w:val="20"/>
           <w:szCs w:val="20"/>
         </w:rPr>
-        <w:t>The chat menu contains a message box allowing the user to write a message, and a button to send it.</w:t>
+        <w:t>Whenever a new message is sent from the server, this view is updated, displaying the new message at the forefront</w:t>
       </w:r>
     </w:p>
     <w:p>
@@ -5970,6 +6012,27 @@
           <w:sz w:val="20"/>
           <w:szCs w:val="20"/>
         </w:rPr>
+        <w:t>The chat menu contains a message box allowing the user to write a message, and a button to send it.</w:t>
+      </w:r>
+    </w:p>
+    <w:p>
+      <w:pPr>
+        <w:numPr>
+          <w:ilvl w:val="3"/>
+          <w:numId w:val="1"/>
+        </w:numPr>
+        <w:rPr>
+          <w:rFonts w:ascii="Times New Roman" w:hAnsi="Times New Roman" w:cs="Times New Roman"/>
+          <w:sz w:val="20"/>
+          <w:szCs w:val="20"/>
+        </w:rPr>
+      </w:pPr>
+      <w:r>
+        <w:rPr>
+          <w:rFonts w:ascii="Times New Roman" w:hAnsi="Times New Roman" w:cs="Times New Roman"/>
+          <w:sz w:val="20"/>
+          <w:szCs w:val="20"/>
+        </w:rPr>
         <w:t xml:space="preserve">When a message is sent, it is sent to the server to update the client of </w:t>
       </w:r>
       <w:r>
@@ -5995,6 +6058,35 @@
           <w:szCs w:val="20"/>
         </w:rPr>
         <w:t>involved in the chat</w:t>
+      </w:r>
+    </w:p>
+    <w:p>
+      <w:pPr>
+        <w:numPr>
+          <w:ilvl w:val="3"/>
+          <w:numId w:val="1"/>
+        </w:numPr>
+        <w:rPr>
+          <w:rFonts w:ascii="Times New Roman" w:hAnsi="Times New Roman" w:cs="Times New Roman"/>
+          <w:sz w:val="20"/>
+          <w:szCs w:val="20"/>
+        </w:rPr>
+      </w:pPr>
+      <w:r>
+        <w:rPr>
+          <w:rFonts w:ascii="Times New Roman" w:hAnsi="Times New Roman" w:cs="Times New Roman"/>
+          <w:sz w:val="20"/>
+          <w:szCs w:val="20"/>
+        </w:rPr>
+        <w:t>When a message is sent, the date and time stamp at that moment is sent to the server ensure messages are displayed in order</w:t>
+      </w:r>
+      <w:r>
+        <w:rPr>
+          <w:rFonts w:ascii="Times New Roman" w:hAnsi="Times New Roman" w:cs="Times New Roman"/>
+          <w:sz w:val="20"/>
+          <w:szCs w:val="20"/>
+        </w:rPr>
+        <w:t xml:space="preserve"> (? Should this be a time stamp when the message is sent or the server receives it?)</w:t>
       </w:r>
     </w:p>
     <w:p>
@@ -6236,20 +6328,67 @@
         <w:spacing w:before="240" w:after="60" w:line="240" w:lineRule="auto"/>
         <w:rPr>
           <w:rFonts w:ascii="Times New Roman" w:eastAsia="Times New Roman" w:hAnsi="Times New Roman" w:cs="Times New Roman"/>
-          <w:sz w:val="24"/>
-          <w:szCs w:val="24"/>
-        </w:rPr>
-      </w:pPr>
-      <w:r>
-        <w:rPr>
-          <w:rFonts w:ascii="Times New Roman" w:eastAsia="Times New Roman" w:hAnsi="Times New Roman" w:cs="Times New Roman"/>
           <w:b/>
           <w:bCs/>
           <w:color w:val="000000"/>
           <w:sz w:val="24"/>
           <w:szCs w:val="24"/>
         </w:rPr>
-        <w:t>Communication Service Module Requirements:</w:t>
+      </w:pPr>
+      <w:r>
+        <w:rPr>
+          <w:rFonts w:ascii="Times New Roman" w:eastAsia="Times New Roman" w:hAnsi="Times New Roman" w:cs="Times New Roman"/>
+          <w:b/>
+          <w:bCs/>
+          <w:color w:val="000000"/>
+          <w:sz w:val="24"/>
+          <w:szCs w:val="24"/>
+        </w:rPr>
+        <w:t>Communication</w:t>
+      </w:r>
+      <w:r>
+        <w:rPr>
+          <w:rFonts w:ascii="Times New Roman" w:eastAsia="Times New Roman" w:hAnsi="Times New Roman" w:cs="Times New Roman"/>
+          <w:b/>
+          <w:bCs/>
+          <w:color w:val="000000"/>
+          <w:sz w:val="24"/>
+          <w:szCs w:val="24"/>
+        </w:rPr>
+        <w:t>s</w:t>
+      </w:r>
+      <w:r>
+        <w:rPr>
+          <w:rFonts w:ascii="Times New Roman" w:eastAsia="Times New Roman" w:hAnsi="Times New Roman" w:cs="Times New Roman"/>
+          <w:b/>
+          <w:bCs/>
+          <w:color w:val="000000"/>
+          <w:sz w:val="24"/>
+          <w:szCs w:val="24"/>
+        </w:rPr>
+        <w:t xml:space="preserve"> </w:t>
+      </w:r>
+      <w:r>
+        <w:rPr>
+          <w:rFonts w:ascii="Times New Roman" w:eastAsia="Times New Roman" w:hAnsi="Times New Roman" w:cs="Times New Roman"/>
+          <w:b/>
+          <w:bCs/>
+          <w:color w:val="000000"/>
+          <w:sz w:val="24"/>
+          <w:szCs w:val="24"/>
+        </w:rPr>
+        <w:t>Server</w:t>
+      </w:r>
+      <w:r>
+        <w:rPr>
+          <w:rFonts w:ascii="Times New Roman" w:eastAsia="Times New Roman" w:hAnsi="Times New Roman" w:cs="Times New Roman"/>
+          <w:b/>
+          <w:bCs/>
+          <w:color w:val="000000"/>
+          <w:sz w:val="24"/>
+          <w:szCs w:val="24"/>
+        </w:rPr>
+        <w:t xml:space="preserve"> Module Requirements:</w:t>
       </w:r>
     </w:p>
     <w:p>
@@ -6258,16 +6397,26 @@
           <w:ilvl w:val="3"/>
           <w:numId w:val="1"/>
         </w:numPr>
-        <w:spacing w:before="80" w:line="240" w:lineRule="auto"/>
-        <w:jc w:val="both"/>
-      </w:pPr>
-      <w:r>
-        <w:rPr>
-          <w:rFonts w:ascii="Times New Roman" w:eastAsia="Times New Roman" w:hAnsi="Times New Roman" w:cs="Times New Roman"/>
-          <w:sz w:val="20"/>
-          <w:szCs w:val="20"/>
-        </w:rPr>
-        <w:t>Application shall store all message in a document</w:t>
+        <w:rPr>
+          <w:sz w:val="20"/>
+          <w:szCs w:val="20"/>
+        </w:rPr>
+      </w:pPr>
+      <w:r>
+        <w:rPr>
+          <w:rFonts w:ascii="Times New Roman" w:eastAsia="Times New Roman" w:hAnsi="Times New Roman" w:cs="Times New Roman"/>
+          <w:sz w:val="20"/>
+          <w:szCs w:val="20"/>
+        </w:rPr>
+        <w:t xml:space="preserve">The Communications Server Module (CSM) </w:t>
+      </w:r>
+      <w:r>
+        <w:rPr>
+          <w:rFonts w:ascii="Times New Roman" w:eastAsia="Times New Roman" w:hAnsi="Times New Roman" w:cs="Times New Roman"/>
+          <w:sz w:val="20"/>
+          <w:szCs w:val="20"/>
+        </w:rPr>
+        <w:t>can store messages locally to in text files</w:t>
       </w:r>
     </w:p>
     <w:p>
@@ -6276,20 +6425,26 @@
           <w:ilvl w:val="3"/>
           <w:numId w:val="1"/>
         </w:numPr>
-        <w:spacing w:before="80" w:line="240" w:lineRule="auto"/>
-        <w:jc w:val="both"/>
-        <w:rPr>
-          <w:sz w:val="20"/>
-          <w:szCs w:val="20"/>
-        </w:rPr>
-      </w:pPr>
-      <w:r>
-        <w:rPr>
-          <w:rFonts w:ascii="Times New Roman" w:eastAsia="Times New Roman" w:hAnsi="Times New Roman" w:cs="Times New Roman"/>
-          <w:sz w:val="20"/>
-          <w:szCs w:val="20"/>
-        </w:rPr>
-        <w:t>Application shall maintain message order within each conversation</w:t>
+        <w:rPr>
+          <w:sz w:val="20"/>
+          <w:szCs w:val="20"/>
+        </w:rPr>
+      </w:pPr>
+      <w:r>
+        <w:rPr>
+          <w:rFonts w:ascii="Times New Roman" w:eastAsia="Times New Roman" w:hAnsi="Times New Roman" w:cs="Times New Roman"/>
+          <w:sz w:val="20"/>
+          <w:szCs w:val="20"/>
+        </w:rPr>
+        <w:t>The format of these files will be comma-separated with the following fields: User ID, Username, Message, date and time stam</w:t>
+      </w:r>
+      <w:r>
+        <w:rPr>
+          <w:rFonts w:ascii="Times New Roman" w:eastAsia="Times New Roman" w:hAnsi="Times New Roman" w:cs="Times New Roman"/>
+          <w:sz w:val="20"/>
+          <w:szCs w:val="20"/>
+        </w:rPr>
+        <w:t>p.</w:t>
       </w:r>
     </w:p>
     <w:p>
@@ -6298,34 +6453,238 @@
           <w:ilvl w:val="3"/>
           <w:numId w:val="1"/>
         </w:numPr>
-        <w:spacing w:before="80" w:line="240" w:lineRule="auto"/>
-        <w:jc w:val="both"/>
-        <w:rPr>
-          <w:sz w:val="20"/>
-          <w:szCs w:val="20"/>
-        </w:rPr>
-      </w:pPr>
-      <w:r>
-        <w:rPr>
-          <w:rFonts w:ascii="Times New Roman" w:eastAsia="Times New Roman" w:hAnsi="Times New Roman" w:cs="Times New Roman"/>
-          <w:sz w:val="20"/>
-          <w:szCs w:val="20"/>
-        </w:rPr>
-        <w:t>Application shall support offline message storage.</w:t>
-      </w:r>
-    </w:p>
-    <w:p>
-      <w:pPr>
-        <w:spacing w:before="80" w:line="240" w:lineRule="auto"/>
-        <w:ind w:left="1440"/>
-        <w:jc w:val="both"/>
-        <w:rPr>
-          <w:rFonts w:ascii="Times New Roman" w:eastAsia="Times New Roman" w:hAnsi="Times New Roman" w:cs="Times New Roman"/>
-          <w:color w:val="7030A0"/>
-          <w:sz w:val="20"/>
-          <w:szCs w:val="20"/>
-        </w:rPr>
-      </w:pPr>
+        <w:rPr>
+          <w:sz w:val="20"/>
+          <w:szCs w:val="20"/>
+        </w:rPr>
+      </w:pPr>
+      <w:r>
+        <w:rPr>
+          <w:rFonts w:ascii="Times New Roman" w:eastAsia="Times New Roman" w:hAnsi="Times New Roman" w:cs="Times New Roman"/>
+          <w:sz w:val="20"/>
+          <w:szCs w:val="20"/>
+        </w:rPr>
+        <w:t>The CSM must be able to secure a connection to the LM, the CM, and the IM</w:t>
+      </w:r>
+    </w:p>
+    <w:p>
+      <w:pPr>
+        <w:numPr>
+          <w:ilvl w:val="3"/>
+          <w:numId w:val="1"/>
+        </w:numPr>
+        <w:rPr>
+          <w:sz w:val="20"/>
+          <w:szCs w:val="20"/>
+        </w:rPr>
+      </w:pPr>
+      <w:r>
+        <w:rPr>
+          <w:rFonts w:ascii="Times New Roman" w:eastAsia="Times New Roman" w:hAnsi="Times New Roman" w:cs="Times New Roman"/>
+          <w:sz w:val="20"/>
+          <w:szCs w:val="20"/>
+        </w:rPr>
+        <w:t xml:space="preserve">The CSM must be able to </w:t>
+      </w:r>
+      <w:proofErr w:type="spellStart"/>
+      <w:r>
+        <w:rPr>
+          <w:rFonts w:ascii="Times New Roman" w:eastAsia="Times New Roman" w:hAnsi="Times New Roman" w:cs="Times New Roman"/>
+          <w:sz w:val="20"/>
+          <w:szCs w:val="20"/>
+        </w:rPr>
+        <w:t>conncurrently</w:t>
+      </w:r>
+      <w:proofErr w:type="spellEnd"/>
+      <w:r>
+        <w:rPr>
+          <w:rFonts w:ascii="Times New Roman" w:eastAsia="Times New Roman" w:hAnsi="Times New Roman" w:cs="Times New Roman"/>
+          <w:sz w:val="20"/>
+          <w:szCs w:val="20"/>
+        </w:rPr>
+        <w:t xml:space="preserve"> support multiple LM’s, CM’s, and IM’s</w:t>
+      </w:r>
+    </w:p>
+    <w:p>
+      <w:pPr>
+        <w:numPr>
+          <w:ilvl w:val="3"/>
+          <w:numId w:val="1"/>
+        </w:numPr>
+        <w:rPr>
+          <w:sz w:val="20"/>
+          <w:szCs w:val="20"/>
+        </w:rPr>
+      </w:pPr>
+      <w:r>
+        <w:rPr>
+          <w:rFonts w:ascii="Times New Roman" w:eastAsia="Times New Roman" w:hAnsi="Times New Roman" w:cs="Times New Roman"/>
+          <w:sz w:val="20"/>
+          <w:szCs w:val="20"/>
+        </w:rPr>
+        <w:t>(?) The CSM stores usernames and passwords for account authentications, to be compared with usernames and passwords sent from the LM</w:t>
+      </w:r>
+    </w:p>
+    <w:p>
+      <w:pPr>
+        <w:numPr>
+          <w:ilvl w:val="3"/>
+          <w:numId w:val="1"/>
+        </w:numPr>
+        <w:rPr>
+          <w:sz w:val="20"/>
+          <w:szCs w:val="20"/>
+        </w:rPr>
+      </w:pPr>
+      <w:r>
+        <w:rPr>
+          <w:rFonts w:ascii="Times New Roman" w:eastAsia="Times New Roman" w:hAnsi="Times New Roman" w:cs="Times New Roman"/>
+          <w:sz w:val="20"/>
+          <w:szCs w:val="20"/>
+        </w:rPr>
+        <w:t>Upon succeeding or failing authentication, the CSM will signal so to the LM.</w:t>
+      </w:r>
+    </w:p>
+    <w:p>
+      <w:pPr>
+        <w:numPr>
+          <w:ilvl w:val="3"/>
+          <w:numId w:val="1"/>
+        </w:numPr>
+        <w:rPr>
+          <w:sz w:val="20"/>
+          <w:szCs w:val="20"/>
+        </w:rPr>
+      </w:pPr>
+      <w:r>
+        <w:rPr>
+          <w:rFonts w:ascii="Times New Roman" w:eastAsia="Times New Roman" w:hAnsi="Times New Roman" w:cs="Times New Roman"/>
+          <w:sz w:val="20"/>
+          <w:szCs w:val="20"/>
+        </w:rPr>
+        <w:t>Upon succeeding authentications, the CSM marks the user as online</w:t>
+      </w:r>
+    </w:p>
+    <w:p>
+      <w:pPr>
+        <w:numPr>
+          <w:ilvl w:val="3"/>
+          <w:numId w:val="1"/>
+        </w:numPr>
+        <w:rPr>
+          <w:sz w:val="20"/>
+          <w:szCs w:val="20"/>
+        </w:rPr>
+      </w:pPr>
+      <w:r>
+        <w:rPr>
+          <w:rFonts w:ascii="Times New Roman" w:eastAsia="Times New Roman" w:hAnsi="Times New Roman" w:cs="Times New Roman"/>
+          <w:sz w:val="20"/>
+          <w:szCs w:val="20"/>
+        </w:rPr>
+        <w:t>The CSM must send the messages to be displayed by the CM in the chronological order of their date and time stamps.</w:t>
+      </w:r>
+    </w:p>
+    <w:p>
+      <w:pPr>
+        <w:numPr>
+          <w:ilvl w:val="3"/>
+          <w:numId w:val="1"/>
+        </w:numPr>
+        <w:rPr>
+          <w:sz w:val="20"/>
+          <w:szCs w:val="20"/>
+        </w:rPr>
+      </w:pPr>
+      <w:r>
+        <w:rPr>
+          <w:rFonts w:ascii="Times New Roman" w:eastAsia="Times New Roman" w:hAnsi="Times New Roman" w:cs="Times New Roman"/>
+          <w:sz w:val="20"/>
+          <w:szCs w:val="20"/>
+        </w:rPr>
+        <w:t>The CSM must send to the CM the most up to date list of chats for the online user. This will be updated if the CSM receives a message that would change that status.</w:t>
+      </w:r>
+    </w:p>
+    <w:p>
+      <w:pPr>
+        <w:numPr>
+          <w:ilvl w:val="3"/>
+          <w:numId w:val="1"/>
+        </w:numPr>
+        <w:rPr>
+          <w:sz w:val="20"/>
+          <w:szCs w:val="20"/>
+        </w:rPr>
+      </w:pPr>
+      <w:r>
+        <w:rPr>
+          <w:rFonts w:ascii="Times New Roman" w:eastAsia="Times New Roman" w:hAnsi="Times New Roman" w:cs="Times New Roman"/>
+          <w:sz w:val="20"/>
+          <w:szCs w:val="20"/>
+        </w:rPr>
+        <w:t>The CSM must store all messages</w:t>
+      </w:r>
+    </w:p>
+    <w:p>
+      <w:pPr>
+        <w:numPr>
+          <w:ilvl w:val="3"/>
+          <w:numId w:val="1"/>
+        </w:numPr>
+        <w:rPr>
+          <w:sz w:val="20"/>
+          <w:szCs w:val="20"/>
+        </w:rPr>
+      </w:pPr>
+      <w:r>
+        <w:rPr>
+          <w:rFonts w:ascii="Times New Roman" w:eastAsia="Times New Roman" w:hAnsi="Times New Roman" w:cs="Times New Roman"/>
+          <w:sz w:val="20"/>
+          <w:szCs w:val="20"/>
+        </w:rPr>
+        <w:lastRenderedPageBreak/>
+        <w:t>The CSM must keep track of messages that were sent to a user while they were offline, to ensure the user is displayed unseen messages in the CM</w:t>
+      </w:r>
+    </w:p>
+    <w:p>
+      <w:pPr>
+        <w:numPr>
+          <w:ilvl w:val="3"/>
+          <w:numId w:val="1"/>
+        </w:numPr>
+        <w:rPr>
+          <w:sz w:val="20"/>
+          <w:szCs w:val="20"/>
+        </w:rPr>
+      </w:pPr>
+      <w:r>
+        <w:rPr>
+          <w:rFonts w:ascii="Times New Roman" w:eastAsia="Times New Roman" w:hAnsi="Times New Roman" w:cs="Times New Roman"/>
+          <w:sz w:val="20"/>
+          <w:szCs w:val="20"/>
+        </w:rPr>
+        <w:t>The CSM can send the message logs on request by the IM</w:t>
+      </w:r>
+    </w:p>
+    <w:p>
+      <w:pPr>
+        <w:numPr>
+          <w:ilvl w:val="3"/>
+          <w:numId w:val="1"/>
+        </w:numPr>
+        <w:rPr>
+          <w:sz w:val="20"/>
+          <w:szCs w:val="20"/>
+        </w:rPr>
+      </w:pPr>
+      <w:r>
+        <w:rPr>
+          <w:rFonts w:ascii="Times New Roman" w:eastAsia="Times New Roman" w:hAnsi="Times New Roman" w:cs="Times New Roman"/>
+          <w:sz w:val="20"/>
+          <w:szCs w:val="20"/>
+        </w:rPr>
+        <w:t>Upon a user logging out, the CM will signal to the CSM in which the CSM marks the user as offline.</w:t>
+      </w:r>
     </w:p>
     <w:p>
       <w:pPr>
@@ -6835,7 +7194,7 @@
 </file>
 
 <file path=word/endnotes.xml><?xml version="1.0" encoding="utf-8"?>
-<w:endnotes xmlns:wpc="http://schemas.microsoft.com/office/word/2010/wordprocessingCanvas" xmlns:cx="http://schemas.microsoft.com/office/drawing/2014/chartex" xmlns:cx1="http://schemas.microsoft.com/office/drawing/2015/9/8/chartex" xmlns:cx2="http://schemas.microsoft.com/office/drawing/2015/10/21/chartex" xmlns:cx3="http://schemas.microsoft.com/office/drawing/2016/5/9/chartex" xmlns:cx4="http://schemas.microsoft.com/office/drawing/2016/5/10/chartex" xmlns:cx5="http://schemas.microsoft.com/office/drawing/2016/5/11/chartex" xmlns:cx6="http://schemas.microsoft.com/office/drawing/2016/5/12/chartex" xmlns:cx7="http://schemas.microsoft.com/office/drawing/2016/5/13/chartex" xmlns:cx8="http://schemas.microsoft.com/office/drawing/2016/5/14/chartex" xmlns:mc="http://schemas.openxmlformats.org/markup-compatibility/2006" xmlns:aink="http://schemas.microsoft.com/office/drawing/2016/ink" xmlns:am3d="http://schemas.microsoft.com/office/drawing/2017/model3d" xmlns:o="urn:schemas-microsoft-com:office:office" xmlns:oel="http://schemas.microsoft.com/office/2019/extlst" xmlns:r="http://schemas.openxmlformats.org/officeDocument/2006/relationships" xmlns:m="http://schemas.openxmlformats.org/officeDocument/2006/math" xmlns:v="urn:schemas-microsoft-com:vml" xmlns:wp14="http://schemas.microsoft.com/office/word/2010/wordprocessingDrawing" xmlns:wp="http://schemas.openxmlformats.org/drawingml/2006/wordprocessingDrawing" xmlns:w10="urn:schemas-microsoft-com:office:word" xmlns:w="http://schemas.openxmlformats.org/wordprocessingml/2006/main" xmlns:w14="http://schemas.microsoft.com/office/word/2010/wordml" xmlns:w15="http://schemas.microsoft.com/office/word/2012/wordml" xmlns:w16cex="http://schemas.microsoft.com/office/word/2018/wordml/cex" xmlns:w16cid="http://schemas.microsoft.com/office/word/2016/wordml/cid" xmlns:w16="http://schemas.microsoft.com/office/word/2018/wordml" xmlns:w16sdtdh="http://schemas.microsoft.com/office/word/2020/wordml/sdtdatahash" xmlns:w16se="http://schemas.microsoft.com/office/word/2015/wordml/symex" xmlns:wpg="http://schemas.microsoft.com/office/word/2010/wordprocessingGroup" xmlns:wpi="http://schemas.microsoft.com/office/word/2010/wordprocessingInk" xmlns:wne="http://schemas.microsoft.com/office/word/2006/wordml" xmlns:wps="http://schemas.microsoft.com/office/word/2010/wordprocessingShape" mc:Ignorable="w14 w15 w16se w16cid w16 w16cex w16sdtdh wp14">
+<w:endnotes xmlns:wpc="http://schemas.microsoft.com/office/word/2010/wordprocessingCanvas" xmlns:cx="http://schemas.microsoft.com/office/drawing/2014/chartex" xmlns:cx1="http://schemas.microsoft.com/office/drawing/2015/9/8/chartex" xmlns:cx2="http://schemas.microsoft.com/office/drawing/2015/10/21/chartex" xmlns:cx3="http://schemas.microsoft.com/office/drawing/2016/5/9/chartex" xmlns:cx4="http://schemas.microsoft.com/office/drawing/2016/5/10/chartex" xmlns:cx5="http://schemas.microsoft.com/office/drawing/2016/5/11/chartex" xmlns:cx6="http://schemas.microsoft.com/office/drawing/2016/5/12/chartex" xmlns:cx7="http://schemas.microsoft.com/office/drawing/2016/5/13/chartex" xmlns:cx8="http://schemas.microsoft.com/office/drawing/2016/5/14/chartex" xmlns:mc="http://schemas.openxmlformats.org/markup-compatibility/2006" xmlns:aink="http://schemas.microsoft.com/office/drawing/2016/ink" xmlns:am3d="http://schemas.microsoft.com/office/drawing/2017/model3d" xmlns:o="urn:schemas-microsoft-com:office:office" xmlns:oel="http://schemas.microsoft.com/office/2019/extlst" xmlns:r="http://schemas.openxmlformats.org/officeDocument/2006/relationships" xmlns:m="http://schemas.openxmlformats.org/officeDocument/2006/math" xmlns:v="urn:schemas-microsoft-com:vml" xmlns:wp14="http://schemas.microsoft.com/office/word/2010/wordprocessingDrawing" xmlns:wp="http://schemas.openxmlformats.org/drawingml/2006/wordprocessingDrawing" xmlns:w10="urn:schemas-microsoft-com:office:word" xmlns:w="http://schemas.openxmlformats.org/wordprocessingml/2006/main" xmlns:w14="http://schemas.microsoft.com/office/word/2010/wordml" xmlns:w15="http://schemas.microsoft.com/office/word/2012/wordml" xmlns:w16cex="http://schemas.microsoft.com/office/word/2018/wordml/cex" xmlns:w16cid="http://schemas.microsoft.com/office/word/2016/wordml/cid" xmlns:w16="http://schemas.microsoft.com/office/word/2018/wordml" xmlns:w16du="http://schemas.microsoft.com/office/word/2023/wordml/word16du" xmlns:w16sdtdh="http://schemas.microsoft.com/office/word/2020/wordml/sdtdatahash" xmlns:w16sdtfl="http://schemas.microsoft.com/office/word/2024/wordml/sdtformatlock" xmlns:w16se="http://schemas.microsoft.com/office/word/2015/wordml/symex" xmlns:wpg="http://schemas.microsoft.com/office/word/2010/wordprocessingGroup" xmlns:wpi="http://schemas.microsoft.com/office/word/2010/wordprocessingInk" xmlns:wne="http://schemas.microsoft.com/office/word/2006/wordml" xmlns:wps="http://schemas.microsoft.com/office/word/2010/wordprocessingShape" mc:Ignorable="w14 w15 w16se w16cid w16 w16cex w16sdtdh w16sdtfl w16du wp14">
   <w:endnote w:type="separator" w:id="-1">
     <w:p>
       <w:pPr>
@@ -6860,7 +7219,7 @@
 </file>
 
 <file path=word/footnotes.xml><?xml version="1.0" encoding="utf-8"?>
-<w:footnotes xmlns:wpc="http://schemas.microsoft.com/office/word/2010/wordprocessingCanvas" xmlns:cx="http://schemas.microsoft.com/office/drawing/2014/chartex" xmlns:cx1="http://schemas.microsoft.com/office/drawing/2015/9/8/chartex" xmlns:cx2="http://schemas.microsoft.com/office/drawing/2015/10/21/chartex" xmlns:cx3="http://schemas.microsoft.com/office/drawing/2016/5/9/chartex" xmlns:cx4="http://schemas.microsoft.com/office/drawing/2016/5/10/chartex" xmlns:cx5="http://schemas.microsoft.com/office/drawing/2016/5/11/chartex" xmlns:cx6="http://schemas.microsoft.com/office/drawing/2016/5/12/chartex" xmlns:cx7="http://schemas.microsoft.com/office/drawing/2016/5/13/chartex" xmlns:cx8="http://schemas.microsoft.com/office/drawing/2016/5/14/chartex" xmlns:mc="http://schemas.openxmlformats.org/markup-compatibility/2006" xmlns:aink="http://schemas.microsoft.com/office/drawing/2016/ink" xmlns:am3d="http://schemas.microsoft.com/office/drawing/2017/model3d" xmlns:o="urn:schemas-microsoft-com:office:office" xmlns:oel="http://schemas.microsoft.com/office/2019/extlst" xmlns:r="http://schemas.openxmlformats.org/officeDocument/2006/relationships" xmlns:m="http://schemas.openxmlformats.org/officeDocument/2006/math" xmlns:v="urn:schemas-microsoft-com:vml" xmlns:wp14="http://schemas.microsoft.com/office/word/2010/wordprocessingDrawing" xmlns:wp="http://schemas.openxmlformats.org/drawingml/2006/wordprocessingDrawing" xmlns:w10="urn:schemas-microsoft-com:office:word" xmlns:w="http://schemas.openxmlformats.org/wordprocessingml/2006/main" xmlns:w14="http://schemas.microsoft.com/office/word/2010/wordml" xmlns:w15="http://schemas.microsoft.com/office/word/2012/wordml" xmlns:w16cex="http://schemas.microsoft.com/office/word/2018/wordml/cex" xmlns:w16cid="http://schemas.microsoft.com/office/word/2016/wordml/cid" xmlns:w16="http://schemas.microsoft.com/office/word/2018/wordml" xmlns:w16sdtdh="http://schemas.microsoft.com/office/word/2020/wordml/sdtdatahash" xmlns:w16se="http://schemas.microsoft.com/office/word/2015/wordml/symex" xmlns:wpg="http://schemas.microsoft.com/office/word/2010/wordprocessingGroup" xmlns:wpi="http://schemas.microsoft.com/office/word/2010/wordprocessingInk" xmlns:wne="http://schemas.microsoft.com/office/word/2006/wordml" xmlns:wps="http://schemas.microsoft.com/office/word/2010/wordprocessingShape" mc:Ignorable="w14 w15 w16se w16cid w16 w16cex w16sdtdh wp14">
+<w:footnotes xmlns:wpc="http://schemas.microsoft.com/office/word/2010/wordprocessingCanvas" xmlns:cx="http://schemas.microsoft.com/office/drawing/2014/chartex" xmlns:cx1="http://schemas.microsoft.com/office/drawing/2015/9/8/chartex" xmlns:cx2="http://schemas.microsoft.com/office/drawing/2015/10/21/chartex" xmlns:cx3="http://schemas.microsoft.com/office/drawing/2016/5/9/chartex" xmlns:cx4="http://schemas.microsoft.com/office/drawing/2016/5/10/chartex" xmlns:cx5="http://schemas.microsoft.com/office/drawing/2016/5/11/chartex" xmlns:cx6="http://schemas.microsoft.com/office/drawing/2016/5/12/chartex" xmlns:cx7="http://schemas.microsoft.com/office/drawing/2016/5/13/chartex" xmlns:cx8="http://schemas.microsoft.com/office/drawing/2016/5/14/chartex" xmlns:mc="http://schemas.openxmlformats.org/markup-compatibility/2006" xmlns:aink="http://schemas.microsoft.com/office/drawing/2016/ink" xmlns:am3d="http://schemas.microsoft.com/office/drawing/2017/model3d" xmlns:o="urn:schemas-microsoft-com:office:office" xmlns:oel="http://schemas.microsoft.com/office/2019/extlst" xmlns:r="http://schemas.openxmlformats.org/officeDocument/2006/relationships" xmlns:m="http://schemas.openxmlformats.org/officeDocument/2006/math" xmlns:v="urn:schemas-microsoft-com:vml" xmlns:wp14="http://schemas.microsoft.com/office/word/2010/wordprocessingDrawing" xmlns:wp="http://schemas.openxmlformats.org/drawingml/2006/wordprocessingDrawing" xmlns:w10="urn:schemas-microsoft-com:office:word" xmlns:w="http://schemas.openxmlformats.org/wordprocessingml/2006/main" xmlns:w14="http://schemas.microsoft.com/office/word/2010/wordml" xmlns:w15="http://schemas.microsoft.com/office/word/2012/wordml" xmlns:w16cex="http://schemas.microsoft.com/office/word/2018/wordml/cex" xmlns:w16cid="http://schemas.microsoft.com/office/word/2016/wordml/cid" xmlns:w16="http://schemas.microsoft.com/office/word/2018/wordml" xmlns:w16du="http://schemas.microsoft.com/office/word/2023/wordml/word16du" xmlns:w16sdtdh="http://schemas.microsoft.com/office/word/2020/wordml/sdtdatahash" xmlns:w16sdtfl="http://schemas.microsoft.com/office/word/2024/wordml/sdtformatlock" xmlns:w16se="http://schemas.microsoft.com/office/word/2015/wordml/symex" xmlns:wpg="http://schemas.microsoft.com/office/word/2010/wordprocessingGroup" xmlns:wpi="http://schemas.microsoft.com/office/word/2010/wordprocessingInk" xmlns:wne="http://schemas.microsoft.com/office/word/2006/wordml" xmlns:wps="http://schemas.microsoft.com/office/word/2010/wordprocessingShape" mc:Ignorable="w14 w15 w16se w16cid w16 w16cex w16sdtdh w16sdtfl w16du wp14">
   <w:footnote w:type="separator" w:id="-1">
     <w:p>
       <w:pPr>
@@ -6885,13 +7244,13 @@
 </file>
 
 <file path=word/header1.xml><?xml version="1.0" encoding="utf-8"?>
-<w:hdr xmlns:wpc="http://schemas.microsoft.com/office/word/2010/wordprocessingCanvas" xmlns:cx="http://schemas.microsoft.com/office/drawing/2014/chartex" xmlns:cx1="http://schemas.microsoft.com/office/drawing/2015/9/8/chartex" xmlns:cx2="http://schemas.microsoft.com/office/drawing/2015/10/21/chartex" xmlns:cx3="http://schemas.microsoft.com/office/drawing/2016/5/9/chartex" xmlns:cx4="http://schemas.microsoft.com/office/drawing/2016/5/10/chartex" xmlns:cx5="http://schemas.microsoft.com/office/drawing/2016/5/11/chartex" xmlns:cx6="http://schemas.microsoft.com/office/drawing/2016/5/12/chartex" xmlns:cx7="http://schemas.microsoft.com/office/drawing/2016/5/13/chartex" xmlns:cx8="http://schemas.microsoft.com/office/drawing/2016/5/14/chartex" xmlns:mc="http://schemas.openxmlformats.org/markup-compatibility/2006" xmlns:aink="http://schemas.microsoft.com/office/drawing/2016/ink" xmlns:am3d="http://schemas.microsoft.com/office/drawing/2017/model3d" xmlns:o="urn:schemas-microsoft-com:office:office" xmlns:oel="http://schemas.microsoft.com/office/2019/extlst" xmlns:r="http://schemas.openxmlformats.org/officeDocument/2006/relationships" xmlns:m="http://schemas.openxmlformats.org/officeDocument/2006/math" xmlns:v="urn:schemas-microsoft-com:vml" xmlns:wp14="http://schemas.microsoft.com/office/word/2010/wordprocessingDrawing" xmlns:wp="http://schemas.openxmlformats.org/drawingml/2006/wordprocessingDrawing" xmlns:w10="urn:schemas-microsoft-com:office:word" xmlns:w="http://schemas.openxmlformats.org/wordprocessingml/2006/main" xmlns:w14="http://schemas.microsoft.com/office/word/2010/wordml" xmlns:w15="http://schemas.microsoft.com/office/word/2012/wordml" xmlns:w16cex="http://schemas.microsoft.com/office/word/2018/wordml/cex" xmlns:w16cid="http://schemas.microsoft.com/office/word/2016/wordml/cid" xmlns:w16="http://schemas.microsoft.com/office/word/2018/wordml" xmlns:w16sdtdh="http://schemas.microsoft.com/office/word/2020/wordml/sdtdatahash" xmlns:w16se="http://schemas.microsoft.com/office/word/2015/wordml/symex" xmlns:wpg="http://schemas.microsoft.com/office/word/2010/wordprocessingGroup" xmlns:wpi="http://schemas.microsoft.com/office/word/2010/wordprocessingInk" xmlns:wne="http://schemas.microsoft.com/office/word/2006/wordml" xmlns:wps="http://schemas.microsoft.com/office/word/2010/wordprocessingShape" mc:Ignorable="w14 w15 w16se w16cid w16 w16cex w16sdtdh wp14">
+<w:hdr xmlns:wpc="http://schemas.microsoft.com/office/word/2010/wordprocessingCanvas" xmlns:cx="http://schemas.microsoft.com/office/drawing/2014/chartex" xmlns:cx1="http://schemas.microsoft.com/office/drawing/2015/9/8/chartex" xmlns:cx2="http://schemas.microsoft.com/office/drawing/2015/10/21/chartex" xmlns:cx3="http://schemas.microsoft.com/office/drawing/2016/5/9/chartex" xmlns:cx4="http://schemas.microsoft.com/office/drawing/2016/5/10/chartex" xmlns:cx5="http://schemas.microsoft.com/office/drawing/2016/5/11/chartex" xmlns:cx6="http://schemas.microsoft.com/office/drawing/2016/5/12/chartex" xmlns:cx7="http://schemas.microsoft.com/office/drawing/2016/5/13/chartex" xmlns:cx8="http://schemas.microsoft.com/office/drawing/2016/5/14/chartex" xmlns:mc="http://schemas.openxmlformats.org/markup-compatibility/2006" xmlns:aink="http://schemas.microsoft.com/office/drawing/2016/ink" xmlns:am3d="http://schemas.microsoft.com/office/drawing/2017/model3d" xmlns:o="urn:schemas-microsoft-com:office:office" xmlns:oel="http://schemas.microsoft.com/office/2019/extlst" xmlns:r="http://schemas.openxmlformats.org/officeDocument/2006/relationships" xmlns:m="http://schemas.openxmlformats.org/officeDocument/2006/math" xmlns:v="urn:schemas-microsoft-com:vml" xmlns:wp14="http://schemas.microsoft.com/office/word/2010/wordprocessingDrawing" xmlns:wp="http://schemas.openxmlformats.org/drawingml/2006/wordprocessingDrawing" xmlns:w10="urn:schemas-microsoft-com:office:word" xmlns:w="http://schemas.openxmlformats.org/wordprocessingml/2006/main" xmlns:w14="http://schemas.microsoft.com/office/word/2010/wordml" xmlns:w15="http://schemas.microsoft.com/office/word/2012/wordml" xmlns:w16cex="http://schemas.microsoft.com/office/word/2018/wordml/cex" xmlns:w16cid="http://schemas.microsoft.com/office/word/2016/wordml/cid" xmlns:w16="http://schemas.microsoft.com/office/word/2018/wordml" xmlns:w16du="http://schemas.microsoft.com/office/word/2023/wordml/word16du" xmlns:w16sdtdh="http://schemas.microsoft.com/office/word/2020/wordml/sdtdatahash" xmlns:w16sdtfl="http://schemas.microsoft.com/office/word/2024/wordml/sdtformatlock" xmlns:w16se="http://schemas.microsoft.com/office/word/2015/wordml/symex" xmlns:wpg="http://schemas.microsoft.com/office/word/2010/wordprocessingGroup" xmlns:wpi="http://schemas.microsoft.com/office/word/2010/wordprocessingInk" xmlns:wne="http://schemas.microsoft.com/office/word/2006/wordml" xmlns:wps="http://schemas.microsoft.com/office/word/2010/wordprocessingShape" mc:Ignorable="w14 w15 w16se w16cid w16 w16cex w16sdtdh w16sdtfl w16du wp14">
   <w:p/>
 </w:hdr>
 </file>
 
 <file path=word/numbering.xml><?xml version="1.0" encoding="utf-8"?>
-<w:numbering xmlns:wpc="http://schemas.microsoft.com/office/word/2010/wordprocessingCanvas" xmlns:cx="http://schemas.microsoft.com/office/drawing/2014/chartex" xmlns:cx1="http://schemas.microsoft.com/office/drawing/2015/9/8/chartex" xmlns:cx2="http://schemas.microsoft.com/office/drawing/2015/10/21/chartex" xmlns:cx3="http://schemas.microsoft.com/office/drawing/2016/5/9/chartex" xmlns:cx4="http://schemas.microsoft.com/office/drawing/2016/5/10/chartex" xmlns:cx5="http://schemas.microsoft.com/office/drawing/2016/5/11/chartex" xmlns:cx6="http://schemas.microsoft.com/office/drawing/2016/5/12/chartex" xmlns:cx7="http://schemas.microsoft.com/office/drawing/2016/5/13/chartex" xmlns:cx8="http://schemas.microsoft.com/office/drawing/2016/5/14/chartex" xmlns:mc="http://schemas.openxmlformats.org/markup-compatibility/2006" xmlns:aink="http://schemas.microsoft.com/office/drawing/2016/ink" xmlns:am3d="http://schemas.microsoft.com/office/drawing/2017/model3d" xmlns:o="urn:schemas-microsoft-com:office:office" xmlns:oel="http://schemas.microsoft.com/office/2019/extlst" xmlns:r="http://schemas.openxmlformats.org/officeDocument/2006/relationships" xmlns:m="http://schemas.openxmlformats.org/officeDocument/2006/math" xmlns:v="urn:schemas-microsoft-com:vml" xmlns:wp14="http://schemas.microsoft.com/office/word/2010/wordprocessingDrawing" xmlns:wp="http://schemas.openxmlformats.org/drawingml/2006/wordprocessingDrawing" xmlns:w10="urn:schemas-microsoft-com:office:word" xmlns:w="http://schemas.openxmlformats.org/wordprocessingml/2006/main" xmlns:w14="http://schemas.microsoft.com/office/word/2010/wordml" xmlns:w15="http://schemas.microsoft.com/office/word/2012/wordml" xmlns:w16cex="http://schemas.microsoft.com/office/word/2018/wordml/cex" xmlns:w16cid="http://schemas.microsoft.com/office/word/2016/wordml/cid" xmlns:w16="http://schemas.microsoft.com/office/word/2018/wordml" xmlns:w16sdtdh="http://schemas.microsoft.com/office/word/2020/wordml/sdtdatahash" xmlns:w16se="http://schemas.microsoft.com/office/word/2015/wordml/symex" xmlns:wpg="http://schemas.microsoft.com/office/word/2010/wordprocessingGroup" xmlns:wpi="http://schemas.microsoft.com/office/word/2010/wordprocessingInk" xmlns:wne="http://schemas.microsoft.com/office/word/2006/wordml" xmlns:wps="http://schemas.microsoft.com/office/word/2010/wordprocessingShape" mc:Ignorable="w14 w15 w16se w16cid w16 w16cex w16sdtdh wp14">
+<w:numbering xmlns:wpc="http://schemas.microsoft.com/office/word/2010/wordprocessingCanvas" xmlns:cx="http://schemas.microsoft.com/office/drawing/2014/chartex" xmlns:cx1="http://schemas.microsoft.com/office/drawing/2015/9/8/chartex" xmlns:cx2="http://schemas.microsoft.com/office/drawing/2015/10/21/chartex" xmlns:cx3="http://schemas.microsoft.com/office/drawing/2016/5/9/chartex" xmlns:cx4="http://schemas.microsoft.com/office/drawing/2016/5/10/chartex" xmlns:cx5="http://schemas.microsoft.com/office/drawing/2016/5/11/chartex" xmlns:cx6="http://schemas.microsoft.com/office/drawing/2016/5/12/chartex" xmlns:cx7="http://schemas.microsoft.com/office/drawing/2016/5/13/chartex" xmlns:cx8="http://schemas.microsoft.com/office/drawing/2016/5/14/chartex" xmlns:mc="http://schemas.openxmlformats.org/markup-compatibility/2006" xmlns:aink="http://schemas.microsoft.com/office/drawing/2016/ink" xmlns:am3d="http://schemas.microsoft.com/office/drawing/2017/model3d" xmlns:o="urn:schemas-microsoft-com:office:office" xmlns:oel="http://schemas.microsoft.com/office/2019/extlst" xmlns:r="http://schemas.openxmlformats.org/officeDocument/2006/relationships" xmlns:m="http://schemas.openxmlformats.org/officeDocument/2006/math" xmlns:v="urn:schemas-microsoft-com:vml" xmlns:wp14="http://schemas.microsoft.com/office/word/2010/wordprocessingDrawing" xmlns:wp="http://schemas.openxmlformats.org/drawingml/2006/wordprocessingDrawing" xmlns:w10="urn:schemas-microsoft-com:office:word" xmlns:w="http://schemas.openxmlformats.org/wordprocessingml/2006/main" xmlns:w14="http://schemas.microsoft.com/office/word/2010/wordml" xmlns:w15="http://schemas.microsoft.com/office/word/2012/wordml" xmlns:w16cex="http://schemas.microsoft.com/office/word/2018/wordml/cex" xmlns:w16cid="http://schemas.microsoft.com/office/word/2016/wordml/cid" xmlns:w16="http://schemas.microsoft.com/office/word/2018/wordml" xmlns:w16du="http://schemas.microsoft.com/office/word/2023/wordml/word16du" xmlns:w16sdtdh="http://schemas.microsoft.com/office/word/2020/wordml/sdtdatahash" xmlns:w16sdtfl="http://schemas.microsoft.com/office/word/2024/wordml/sdtformatlock" xmlns:w16se="http://schemas.microsoft.com/office/word/2015/wordml/symex" xmlns:wpg="http://schemas.microsoft.com/office/word/2010/wordprocessingGroup" xmlns:wpi="http://schemas.microsoft.com/office/word/2010/wordprocessingInk" xmlns:wne="http://schemas.microsoft.com/office/word/2006/wordml" xmlns:wps="http://schemas.microsoft.com/office/word/2010/wordprocessingShape" mc:Ignorable="w14 w15 w16se w16cid w16 w16cex w16sdtdh w16sdtfl w16du wp14">
   <w:abstractNum w:abstractNumId="0" w15:restartNumberingAfterBreak="0">
     <w:nsid w:val="005E4362"/>
     <w:multiLevelType w:val="multilevel"/>
@@ -7946,7 +8305,7 @@
 </file>
 
 <file path=word/styles.xml><?xml version="1.0" encoding="utf-8"?>
-<w:styles xmlns:mc="http://schemas.openxmlformats.org/markup-compatibility/2006" xmlns:r="http://schemas.openxmlformats.org/officeDocument/2006/relationships" xmlns:w="http://schemas.openxmlformats.org/wordprocessingml/2006/main" xmlns:w14="http://schemas.microsoft.com/office/word/2010/wordml" xmlns:w15="http://schemas.microsoft.com/office/word/2012/wordml" xmlns:w16cex="http://schemas.microsoft.com/office/word/2018/wordml/cex" xmlns:w16cid="http://schemas.microsoft.com/office/word/2016/wordml/cid" xmlns:w16="http://schemas.microsoft.com/office/word/2018/wordml" xmlns:w16sdtdh="http://schemas.microsoft.com/office/word/2020/wordml/sdtdatahash" xmlns:w16se="http://schemas.microsoft.com/office/word/2015/wordml/symex" mc:Ignorable="w14 w15 w16se w16cid w16 w16cex w16sdtdh">
+<w:styles xmlns:mc="http://schemas.openxmlformats.org/markup-compatibility/2006" xmlns:r="http://schemas.openxmlformats.org/officeDocument/2006/relationships" xmlns:w="http://schemas.openxmlformats.org/wordprocessingml/2006/main" xmlns:w14="http://schemas.microsoft.com/office/word/2010/wordml" xmlns:w15="http://schemas.microsoft.com/office/word/2012/wordml" xmlns:w16cex="http://schemas.microsoft.com/office/word/2018/wordml/cex" xmlns:w16cid="http://schemas.microsoft.com/office/word/2016/wordml/cid" xmlns:w16="http://schemas.microsoft.com/office/word/2018/wordml" xmlns:w16du="http://schemas.microsoft.com/office/word/2023/wordml/word16du" xmlns:w16sdtdh="http://schemas.microsoft.com/office/word/2020/wordml/sdtdatahash" xmlns:w16sdtfl="http://schemas.microsoft.com/office/word/2024/wordml/sdtformatlock" xmlns:w16se="http://schemas.microsoft.com/office/word/2015/wordml/symex" mc:Ignorable="w14 w15 w16se w16cid w16 w16cex w16sdtdh w16sdtfl w16du">
   <w:docDefaults>
     <w:rPrDefault>
       <w:rPr>

</xml_diff>

<commit_message>
internal reqquirements and nonfunctional
</commit_message>
<xml_diff>
--- a/Communications SRS.docx
+++ b/Communications SRS.docx
@@ -180,7 +180,7 @@
     </w:p>
     <w:tbl>
       <w:tblPr>
-        <w:tblStyle w:val="a"/>
+        <w:tblStyle w:val="a5"/>
         <w:tblW w:w="8745" w:type="dxa"/>
         <w:tblInd w:w="0" w:type="dxa"/>
         <w:tblBorders>
@@ -4241,7 +4241,7 @@
     </w:sdt>
     <w:p>
       <w:pPr>
-        <w:pStyle w:val="Heading1"/>
+        <w:pStyle w:val="1"/>
         <w:keepLines w:val="0"/>
         <w:pageBreakBefore/>
         <w:numPr>
@@ -4299,7 +4299,7 @@
     </w:p>
     <w:p>
       <w:pPr>
-        <w:pStyle w:val="Heading2"/>
+        <w:pStyle w:val="2"/>
         <w:keepLines w:val="0"/>
         <w:numPr>
           <w:ilvl w:val="1"/>
@@ -4349,7 +4349,7 @@
     </w:p>
     <w:p>
       <w:pPr>
-        <w:pStyle w:val="Heading2"/>
+        <w:pStyle w:val="2"/>
         <w:keepLines w:val="0"/>
         <w:numPr>
           <w:ilvl w:val="1"/>
@@ -4401,7 +4401,7 @@
     </w:p>
     <w:p>
       <w:pPr>
-        <w:pStyle w:val="Heading2"/>
+        <w:pStyle w:val="2"/>
         <w:keepLines w:val="0"/>
         <w:numPr>
           <w:ilvl w:val="1"/>
@@ -4536,7 +4536,7 @@
     </w:p>
     <w:p>
       <w:pPr>
-        <w:pStyle w:val="Heading2"/>
+        <w:pStyle w:val="2"/>
         <w:keepLines w:val="0"/>
         <w:numPr>
           <w:ilvl w:val="1"/>
@@ -4585,7 +4585,7 @@
     </w:p>
     <w:p>
       <w:pPr>
-        <w:pStyle w:val="Heading1"/>
+        <w:pStyle w:val="1"/>
         <w:keepLines w:val="0"/>
         <w:pageBreakBefore/>
         <w:numPr>
@@ -4623,7 +4623,7 @@
     </w:p>
     <w:p>
       <w:pPr>
-        <w:pStyle w:val="Heading2"/>
+        <w:pStyle w:val="2"/>
         <w:keepLines w:val="0"/>
         <w:numPr>
           <w:ilvl w:val="1"/>
@@ -4671,7 +4671,7 @@
     </w:p>
     <w:p>
       <w:pPr>
-        <w:pStyle w:val="Heading2"/>
+        <w:pStyle w:val="2"/>
         <w:keepLines w:val="0"/>
         <w:numPr>
           <w:ilvl w:val="1"/>
@@ -4759,7 +4759,7 @@
     </w:p>
     <w:p>
       <w:pPr>
-        <w:pStyle w:val="Heading2"/>
+        <w:pStyle w:val="2"/>
         <w:keepLines w:val="0"/>
         <w:numPr>
           <w:ilvl w:val="1"/>
@@ -4895,7 +4895,7 @@
     </w:p>
     <w:p>
       <w:pPr>
-        <w:pStyle w:val="Heading2"/>
+        <w:pStyle w:val="2"/>
         <w:keepLines w:val="0"/>
         <w:numPr>
           <w:ilvl w:val="1"/>
@@ -5025,7 +5025,7 @@
     </w:p>
     <w:p>
       <w:pPr>
-        <w:pStyle w:val="Heading2"/>
+        <w:pStyle w:val="2"/>
         <w:keepLines w:val="0"/>
         <w:numPr>
           <w:ilvl w:val="1"/>
@@ -5121,7 +5121,7 @@
     </w:p>
     <w:p>
       <w:pPr>
-        <w:pStyle w:val="Heading1"/>
+        <w:pStyle w:val="1"/>
         <w:keepLines w:val="0"/>
         <w:pageBreakBefore/>
         <w:numPr>
@@ -5159,7 +5159,7 @@
     </w:p>
     <w:p>
       <w:pPr>
-        <w:pStyle w:val="Heading2"/>
+        <w:pStyle w:val="2"/>
         <w:keepLines w:val="0"/>
         <w:numPr>
           <w:ilvl w:val="1"/>
@@ -5189,7 +5189,7 @@
     </w:p>
     <w:p>
       <w:pPr>
-        <w:pStyle w:val="Heading3"/>
+        <w:pStyle w:val="3"/>
         <w:keepLines w:val="0"/>
         <w:numPr>
           <w:ilvl w:val="1"/>
@@ -6133,7 +6133,7 @@
     </w:p>
     <w:p>
       <w:pPr>
-        <w:pStyle w:val="Heading3"/>
+        <w:pStyle w:val="3"/>
         <w:keepLines w:val="0"/>
         <w:numPr>
           <w:ilvl w:val="2"/>
@@ -6319,7 +6319,7 @@
     </w:p>
     <w:p>
       <w:pPr>
-        <w:pStyle w:val="Heading3"/>
+        <w:pStyle w:val="3"/>
         <w:keepLines w:val="0"/>
         <w:numPr>
           <w:ilvl w:val="2"/>
@@ -6688,7 +6688,7 @@
     </w:p>
     <w:p>
       <w:pPr>
-        <w:pStyle w:val="Heading2"/>
+        <w:pStyle w:val="2"/>
         <w:keepLines w:val="0"/>
         <w:numPr>
           <w:ilvl w:val="1"/>
@@ -6805,7 +6805,7 @@
     </w:p>
     <w:p>
       <w:pPr>
-        <w:pStyle w:val="Heading2"/>
+        <w:pStyle w:val="2"/>
         <w:keepLines w:val="0"/>
         <w:numPr>
           <w:ilvl w:val="1"/>
@@ -6835,21 +6835,266 @@
     </w:p>
     <w:p>
       <w:pPr>
-        <w:spacing w:line="240" w:lineRule="auto"/>
-        <w:ind w:left="1440"/>
-        <w:rPr>
-          <w:rFonts w:ascii="Times New Roman" w:eastAsia="Times New Roman" w:hAnsi="Times New Roman" w:cs="Times New Roman"/>
-          <w:sz w:val="20"/>
-          <w:szCs w:val="20"/>
-        </w:rPr>
-      </w:pPr>
-      <w:r>
-        <w:rPr>
-          <w:rFonts w:ascii="Times New Roman" w:eastAsia="Times New Roman" w:hAnsi="Times New Roman" w:cs="Times New Roman"/>
-          <w:sz w:val="20"/>
-          <w:szCs w:val="20"/>
-        </w:rPr>
-        <w:t>The communication service module shall provide internal service interface to the client application module for message submission.</w:t>
+        <w:pStyle w:val="a6"/>
+        <w:ind w:left="720" w:firstLineChars="0" w:firstLine="720"/>
+        <w:rPr>
+          <w:rFonts w:ascii="Times New Roman" w:hAnsi="Times New Roman" w:cs="Times New Roman"/>
+          <w:sz w:val="20"/>
+          <w:szCs w:val="20"/>
+        </w:rPr>
+      </w:pPr>
+      <w:r>
+        <w:rPr>
+          <w:rFonts w:ascii="Times New Roman" w:hAnsi="Times New Roman" w:cs="Times New Roman"/>
+          <w:sz w:val="20"/>
+          <w:szCs w:val="20"/>
+        </w:rPr>
+        <w:t>The Communication service module shall provide internal service interfaces to the Client module and the IT module</w:t>
+      </w:r>
+    </w:p>
+    <w:p>
+      <w:pPr>
+        <w:pStyle w:val="a6"/>
+        <w:ind w:left="720" w:firstLineChars="0" w:firstLine="720"/>
+        <w:rPr>
+          <w:rFonts w:ascii="Times New Roman" w:hAnsi="Times New Roman" w:cs="Times New Roman"/>
+          <w:sz w:val="20"/>
+          <w:szCs w:val="20"/>
+          <w:lang w:eastAsia="zh-CN"/>
+        </w:rPr>
+      </w:pPr>
+      <w:r>
+        <w:rPr>
+          <w:rFonts w:ascii="Times New Roman" w:hAnsi="Times New Roman" w:cs="Times New Roman"/>
+          <w:sz w:val="20"/>
+          <w:szCs w:val="20"/>
+        </w:rPr>
+        <w:t xml:space="preserve">The Communication </w:t>
+      </w:r>
+      <w:r>
+        <w:rPr>
+          <w:rFonts w:ascii="Times New Roman" w:hAnsi="Times New Roman" w:cs="Times New Roman" w:hint="eastAsia"/>
+          <w:sz w:val="20"/>
+          <w:szCs w:val="20"/>
+          <w:lang w:eastAsia="zh-CN"/>
+        </w:rPr>
+        <w:t>service module shall provide username and password validation, return authentication and associated user session information.</w:t>
+      </w:r>
+    </w:p>
+    <w:p>
+      <w:pPr>
+        <w:pStyle w:val="a6"/>
+        <w:ind w:left="720" w:firstLineChars="0" w:firstLine="720"/>
+        <w:rPr>
+          <w:rFonts w:ascii="Times New Roman" w:hAnsi="Times New Roman" w:cs="Times New Roman"/>
+          <w:sz w:val="20"/>
+          <w:szCs w:val="20"/>
+          <w:lang w:eastAsia="zh-CN"/>
+        </w:rPr>
+      </w:pPr>
+      <w:r>
+        <w:rPr>
+          <w:rFonts w:ascii="Times New Roman" w:hAnsi="Times New Roman" w:cs="Times New Roman" w:hint="eastAsia"/>
+          <w:sz w:val="20"/>
+          <w:szCs w:val="20"/>
+          <w:lang w:eastAsia="zh-CN"/>
+        </w:rPr>
+        <w:t xml:space="preserve">The Communication service module shall provide </w:t>
+      </w:r>
+      <w:r>
+        <w:rPr>
+          <w:rFonts w:ascii="Times New Roman" w:hAnsi="Times New Roman" w:cs="Times New Roman"/>
+          <w:sz w:val="20"/>
+          <w:szCs w:val="20"/>
+          <w:lang w:eastAsia="zh-CN"/>
+        </w:rPr>
+        <w:t>a service</w:t>
+      </w:r>
+      <w:r>
+        <w:rPr>
+          <w:rFonts w:ascii="Times New Roman" w:hAnsi="Times New Roman" w:cs="Times New Roman" w:hint="eastAsia"/>
+          <w:sz w:val="20"/>
+          <w:szCs w:val="20"/>
+          <w:lang w:eastAsia="zh-CN"/>
+        </w:rPr>
+        <w:t xml:space="preserve"> to create private chats, group chats, add users to groups chats, retrieve user chat list.</w:t>
+      </w:r>
+    </w:p>
+    <w:p>
+      <w:pPr>
+        <w:pStyle w:val="a6"/>
+        <w:ind w:left="720" w:firstLineChars="0" w:firstLine="720"/>
+        <w:rPr>
+          <w:rFonts w:ascii="Times New Roman" w:hAnsi="Times New Roman" w:cs="Times New Roman"/>
+          <w:sz w:val="20"/>
+          <w:szCs w:val="20"/>
+          <w:lang w:eastAsia="zh-CN"/>
+        </w:rPr>
+      </w:pPr>
+      <w:r>
+        <w:rPr>
+          <w:rFonts w:ascii="Times New Roman" w:hAnsi="Times New Roman" w:cs="Times New Roman" w:hint="eastAsia"/>
+          <w:sz w:val="20"/>
+          <w:szCs w:val="20"/>
+          <w:lang w:eastAsia="zh-CN"/>
+        </w:rPr>
+        <w:t xml:space="preserve">The Communication service module shall provide a method to submit a message </w:t>
+      </w:r>
+      <w:r>
+        <w:rPr>
+          <w:rFonts w:ascii="Times New Roman" w:hAnsi="Times New Roman" w:cs="Times New Roman"/>
+          <w:sz w:val="20"/>
+          <w:szCs w:val="20"/>
+          <w:lang w:eastAsia="zh-CN"/>
+        </w:rPr>
+        <w:t>to a</w:t>
+      </w:r>
+      <w:r>
+        <w:rPr>
+          <w:rFonts w:ascii="Times New Roman" w:hAnsi="Times New Roman" w:cs="Times New Roman" w:hint="eastAsia"/>
+          <w:sz w:val="20"/>
+          <w:szCs w:val="20"/>
+          <w:lang w:eastAsia="zh-CN"/>
+        </w:rPr>
+        <w:t xml:space="preserve"> chat, store the message, maintain message order within the conversation and broadcast message to online users.</w:t>
+      </w:r>
+    </w:p>
+    <w:p>
+      <w:pPr>
+        <w:pStyle w:val="a6"/>
+        <w:ind w:left="720" w:firstLineChars="0" w:firstLine="720"/>
+        <w:rPr>
+          <w:rFonts w:ascii="Times New Roman" w:hAnsi="Times New Roman" w:cs="Times New Roman"/>
+          <w:sz w:val="20"/>
+          <w:szCs w:val="20"/>
+          <w:lang w:eastAsia="zh-CN"/>
+        </w:rPr>
+      </w:pPr>
+      <w:r>
+        <w:rPr>
+          <w:rFonts w:ascii="Times New Roman" w:hAnsi="Times New Roman" w:cs="Times New Roman" w:hint="eastAsia"/>
+          <w:sz w:val="20"/>
+          <w:szCs w:val="20"/>
+          <w:lang w:eastAsia="zh-CN"/>
+        </w:rPr>
+        <w:t xml:space="preserve">The Communication service module shall provide a method to retrieve message history, retrieve unread message, mark message as read. </w:t>
+      </w:r>
+    </w:p>
+    <w:p>
+      <w:pPr>
+        <w:pStyle w:val="a6"/>
+        <w:ind w:left="720" w:firstLineChars="0" w:firstLine="720"/>
+        <w:rPr>
+          <w:rFonts w:ascii="Times New Roman" w:hAnsi="Times New Roman" w:cs="Times New Roman"/>
+          <w:sz w:val="20"/>
+          <w:szCs w:val="20"/>
+          <w:lang w:eastAsia="zh-CN"/>
+        </w:rPr>
+      </w:pPr>
+      <w:r>
+        <w:rPr>
+          <w:rFonts w:ascii="Times New Roman" w:hAnsi="Times New Roman" w:cs="Times New Roman" w:hint="eastAsia"/>
+          <w:sz w:val="20"/>
+          <w:szCs w:val="20"/>
+          <w:lang w:eastAsia="zh-CN"/>
+        </w:rPr>
+        <w:t xml:space="preserve">The Communication Service module shall notify Client module when new message </w:t>
+      </w:r>
+      <w:r>
+        <w:rPr>
+          <w:rFonts w:ascii="Times New Roman" w:hAnsi="Times New Roman" w:cs="Times New Roman"/>
+          <w:sz w:val="20"/>
+          <w:szCs w:val="20"/>
+          <w:lang w:eastAsia="zh-CN"/>
+        </w:rPr>
+        <w:t>is received</w:t>
+      </w:r>
+      <w:r>
+        <w:rPr>
+          <w:rFonts w:ascii="Times New Roman" w:hAnsi="Times New Roman" w:cs="Times New Roman" w:hint="eastAsia"/>
+          <w:sz w:val="20"/>
+          <w:szCs w:val="20"/>
+          <w:lang w:eastAsia="zh-CN"/>
+        </w:rPr>
+        <w:t>, user is invited to a group chat.</w:t>
+      </w:r>
+    </w:p>
+    <w:p>
+      <w:pPr>
+        <w:pStyle w:val="a6"/>
+        <w:ind w:left="720" w:firstLineChars="0" w:firstLine="720"/>
+        <w:rPr>
+          <w:rFonts w:ascii="Times New Roman" w:hAnsi="Times New Roman" w:cs="Times New Roman"/>
+          <w:sz w:val="20"/>
+          <w:szCs w:val="20"/>
+          <w:lang w:eastAsia="zh-CN"/>
+        </w:rPr>
+      </w:pPr>
+      <w:r>
+        <w:rPr>
+          <w:rFonts w:ascii="Times New Roman" w:hAnsi="Times New Roman" w:cs="Times New Roman" w:hint="eastAsia"/>
+          <w:sz w:val="20"/>
+          <w:szCs w:val="20"/>
+          <w:lang w:eastAsia="zh-CN"/>
+        </w:rPr>
+        <w:t xml:space="preserve">The Communication service module shall provide internal access to the IT module to allow viewing all conversation, all users, message history by user, </w:t>
+      </w:r>
+      <w:r>
+        <w:rPr>
+          <w:rFonts w:ascii="Times New Roman" w:hAnsi="Times New Roman" w:cs="Times New Roman"/>
+          <w:sz w:val="20"/>
+          <w:szCs w:val="20"/>
+          <w:lang w:eastAsia="zh-CN"/>
+        </w:rPr>
+        <w:t>and</w:t>
+      </w:r>
+      <w:r>
+        <w:rPr>
+          <w:rFonts w:ascii="Times New Roman" w:hAnsi="Times New Roman" w:cs="Times New Roman" w:hint="eastAsia"/>
+          <w:sz w:val="20"/>
+          <w:szCs w:val="20"/>
+          <w:lang w:eastAsia="zh-CN"/>
+        </w:rPr>
+        <w:t xml:space="preserve"> message history by chat.</w:t>
+      </w:r>
+    </w:p>
+    <w:p>
+      <w:pPr>
+        <w:pStyle w:val="a6"/>
+        <w:ind w:left="720" w:firstLineChars="0" w:firstLine="720"/>
+        <w:rPr>
+          <w:rFonts w:ascii="Times New Roman" w:hAnsi="Times New Roman" w:cs="Times New Roman"/>
+          <w:sz w:val="20"/>
+          <w:szCs w:val="20"/>
+          <w:lang w:eastAsia="zh-CN"/>
+        </w:rPr>
+      </w:pPr>
+      <w:r>
+        <w:rPr>
+          <w:rFonts w:ascii="Times New Roman" w:hAnsi="Times New Roman" w:cs="Times New Roman" w:hint="eastAsia"/>
+          <w:sz w:val="20"/>
+          <w:szCs w:val="20"/>
+          <w:lang w:eastAsia="zh-CN"/>
+        </w:rPr>
+        <w:t xml:space="preserve">All messages shall be stored in structured </w:t>
+      </w:r>
+      <w:r>
+        <w:rPr>
+          <w:rFonts w:ascii="Times New Roman" w:hAnsi="Times New Roman" w:cs="Times New Roman"/>
+          <w:sz w:val="20"/>
+          <w:szCs w:val="20"/>
+          <w:lang w:eastAsia="zh-CN"/>
+        </w:rPr>
+        <w:t>documents</w:t>
+      </w:r>
+      <w:r>
+        <w:rPr>
+          <w:rFonts w:ascii="Times New Roman" w:hAnsi="Times New Roman" w:cs="Times New Roman" w:hint="eastAsia"/>
+          <w:sz w:val="20"/>
+          <w:szCs w:val="20"/>
+          <w:lang w:eastAsia="zh-CN"/>
+        </w:rPr>
+        <w:t>.</w:t>
       </w:r>
     </w:p>
     <w:p>
@@ -6882,7 +7127,7 @@
     </w:p>
     <w:p>
       <w:pPr>
-        <w:pStyle w:val="Heading1"/>
+        <w:pStyle w:val="1"/>
         <w:keepLines w:val="0"/>
         <w:pageBreakBefore/>
         <w:pBdr>
@@ -6917,7 +7162,7 @@
     </w:p>
     <w:p>
       <w:pPr>
-        <w:pStyle w:val="Heading2"/>
+        <w:pStyle w:val="2"/>
         <w:keepLines w:val="0"/>
         <w:numPr>
           <w:ilvl w:val="1"/>
@@ -6948,49 +7193,420 @@
     <w:p>
       <w:pPr>
         <w:spacing w:line="240" w:lineRule="auto"/>
-        <w:ind w:left="720" w:firstLine="720"/>
-        <w:rPr>
-          <w:rFonts w:ascii="Times New Roman" w:eastAsia="Times New Roman" w:hAnsi="Times New Roman" w:cs="Times New Roman"/>
-          <w:color w:val="7030A0"/>
-          <w:sz w:val="20"/>
-          <w:szCs w:val="20"/>
+        <w:ind w:left="1440" w:firstLine="720"/>
+        <w:rPr>
+          <w:rFonts w:ascii="Times New Roman" w:hAnsi="Times New Roman" w:cs="Times New Roman"/>
+          <w:color w:val="000000" w:themeColor="text1"/>
+          <w:sz w:val="20"/>
+          <w:szCs w:val="20"/>
+          <w:lang w:eastAsia="zh-CN"/>
         </w:rPr>
       </w:pPr>
       <w:bookmarkStart w:id="18" w:name="kix.fo7pbnaolupp" w:colFirst="0" w:colLast="0"/>
       <w:bookmarkEnd w:id="18"/>
       <w:r>
         <w:rPr>
-          <w:rFonts w:ascii="Times New Roman" w:eastAsia="Times New Roman" w:hAnsi="Times New Roman" w:cs="Times New Roman"/>
-          <w:color w:val="7030A0"/>
-          <w:sz w:val="20"/>
-          <w:szCs w:val="20"/>
-        </w:rPr>
-        <w:t>Example:</w:t>
+          <w:rFonts w:ascii="Times New Roman" w:hAnsi="Times New Roman" w:cs="Times New Roman" w:hint="eastAsia"/>
+          <w:color w:val="000000" w:themeColor="text1"/>
+          <w:sz w:val="20"/>
+          <w:szCs w:val="20"/>
+          <w:lang w:eastAsia="zh-CN"/>
+        </w:rPr>
+        <w:t xml:space="preserve">User passwords shall not be </w:t>
+      </w:r>
+      <w:r>
+        <w:rPr>
+          <w:rFonts w:ascii="Times New Roman" w:hAnsi="Times New Roman" w:cs="Times New Roman"/>
+          <w:color w:val="000000" w:themeColor="text1"/>
+          <w:sz w:val="20"/>
+          <w:szCs w:val="20"/>
+          <w:lang w:eastAsia="zh-CN"/>
+        </w:rPr>
+        <w:t>stored</w:t>
+      </w:r>
+      <w:r>
+        <w:rPr>
+          <w:rFonts w:ascii="Times New Roman" w:hAnsi="Times New Roman" w:cs="Times New Roman" w:hint="eastAsia"/>
+          <w:color w:val="000000" w:themeColor="text1"/>
+          <w:sz w:val="20"/>
+          <w:szCs w:val="20"/>
+          <w:lang w:eastAsia="zh-CN"/>
+        </w:rPr>
+        <w:t xml:space="preserve"> at a specific document.</w:t>
       </w:r>
     </w:p>
     <w:p>
       <w:pPr>
         <w:spacing w:line="240" w:lineRule="auto"/>
-        <w:ind w:left="720" w:firstLine="720"/>
-        <w:rPr>
-          <w:rFonts w:ascii="Times New Roman" w:eastAsia="Times New Roman" w:hAnsi="Times New Roman" w:cs="Times New Roman"/>
-          <w:sz w:val="20"/>
-          <w:szCs w:val="20"/>
-        </w:rPr>
-      </w:pPr>
-      <w:r>
-        <w:rPr>
-          <w:rFonts w:ascii="Times New Roman" w:eastAsia="Times New Roman" w:hAnsi="Times New Roman" w:cs="Times New Roman"/>
-          <w:color w:val="7030A0"/>
-          <w:sz w:val="20"/>
-          <w:szCs w:val="20"/>
-        </w:rPr>
-        <w:t>4.1.1 The System must encrypt data being transmitted over the Internet. </w:t>
-      </w:r>
-    </w:p>
-    <w:p>
-      <w:pPr>
-        <w:pStyle w:val="Heading2"/>
+        <w:ind w:left="1440" w:firstLine="720"/>
+        <w:rPr>
+          <w:rFonts w:ascii="Times New Roman" w:hAnsi="Times New Roman" w:cs="Times New Roman"/>
+          <w:color w:val="000000" w:themeColor="text1"/>
+          <w:sz w:val="20"/>
+          <w:szCs w:val="20"/>
+          <w:lang w:eastAsia="zh-CN"/>
+        </w:rPr>
+      </w:pPr>
+      <w:r>
+        <w:rPr>
+          <w:rFonts w:ascii="Times New Roman" w:hAnsi="Times New Roman" w:cs="Times New Roman" w:hint="eastAsia"/>
+          <w:color w:val="000000" w:themeColor="text1"/>
+          <w:sz w:val="20"/>
+          <w:szCs w:val="20"/>
+          <w:lang w:eastAsia="zh-CN"/>
+        </w:rPr>
+        <w:t xml:space="preserve">Authentication must be done before accessing any communication function. </w:t>
+      </w:r>
+    </w:p>
+    <w:p>
+      <w:pPr>
+        <w:spacing w:line="240" w:lineRule="auto"/>
+        <w:ind w:left="1440" w:firstLine="720"/>
+        <w:rPr>
+          <w:rFonts w:ascii="Times New Roman" w:hAnsi="Times New Roman" w:cs="Times New Roman"/>
+          <w:color w:val="000000" w:themeColor="text1"/>
+          <w:sz w:val="20"/>
+          <w:szCs w:val="20"/>
+          <w:lang w:eastAsia="zh-CN"/>
+        </w:rPr>
+      </w:pPr>
+      <w:r>
+        <w:rPr>
+          <w:rFonts w:ascii="Times New Roman" w:hAnsi="Times New Roman" w:cs="Times New Roman" w:hint="eastAsia"/>
+          <w:color w:val="000000" w:themeColor="text1"/>
+          <w:sz w:val="20"/>
+          <w:szCs w:val="20"/>
+          <w:lang w:eastAsia="zh-CN"/>
+        </w:rPr>
+        <w:t xml:space="preserve">The system shall prevent unauthorized access to chats. </w:t>
+      </w:r>
+    </w:p>
+    <w:p>
+      <w:pPr>
+        <w:spacing w:line="240" w:lineRule="auto"/>
+        <w:rPr>
+          <w:rFonts w:ascii="Times New Roman" w:hAnsi="Times New Roman" w:cs="Times New Roman"/>
+          <w:color w:val="000000" w:themeColor="text1"/>
+          <w:sz w:val="20"/>
+          <w:szCs w:val="20"/>
+          <w:lang w:eastAsia="zh-CN"/>
+        </w:rPr>
+      </w:pPr>
+      <w:r>
+        <w:rPr>
+          <w:rFonts w:ascii="Times New Roman" w:hAnsi="Times New Roman" w:cs="Times New Roman"/>
+          <w:color w:val="000000" w:themeColor="text1"/>
+          <w:sz w:val="20"/>
+          <w:szCs w:val="20"/>
+          <w:lang w:eastAsia="zh-CN"/>
+        </w:rPr>
+        <w:tab/>
+      </w:r>
+      <w:r>
+        <w:rPr>
+          <w:rFonts w:ascii="Times New Roman" w:hAnsi="Times New Roman" w:cs="Times New Roman"/>
+          <w:color w:val="000000" w:themeColor="text1"/>
+          <w:sz w:val="20"/>
+          <w:szCs w:val="20"/>
+          <w:lang w:eastAsia="zh-CN"/>
+        </w:rPr>
+        <w:tab/>
+      </w:r>
+      <w:r>
+        <w:rPr>
+          <w:rFonts w:ascii="Times New Roman" w:hAnsi="Times New Roman" w:cs="Times New Roman"/>
+          <w:color w:val="000000" w:themeColor="text1"/>
+          <w:sz w:val="20"/>
+          <w:szCs w:val="20"/>
+          <w:lang w:eastAsia="zh-CN"/>
+        </w:rPr>
+        <w:tab/>
+      </w:r>
+      <w:r>
+        <w:rPr>
+          <w:rFonts w:ascii="Times New Roman" w:hAnsi="Times New Roman" w:cs="Times New Roman" w:hint="eastAsia"/>
+          <w:color w:val="000000" w:themeColor="text1"/>
+          <w:sz w:val="20"/>
+          <w:szCs w:val="20"/>
+          <w:lang w:eastAsia="zh-CN"/>
+        </w:rPr>
+        <w:t>All communication between client and server shall be via TCP/IP.</w:t>
+      </w:r>
+    </w:p>
+    <w:p>
+      <w:pPr>
+        <w:spacing w:line="240" w:lineRule="auto"/>
+        <w:rPr>
+          <w:rFonts w:ascii="Times New Roman" w:hAnsi="Times New Roman" w:cs="Times New Roman"/>
+          <w:color w:val="000000" w:themeColor="text1"/>
+          <w:sz w:val="20"/>
+          <w:szCs w:val="20"/>
+          <w:lang w:eastAsia="zh-CN"/>
+        </w:rPr>
+      </w:pPr>
+      <w:r>
+        <w:rPr>
+          <w:rFonts w:ascii="Times New Roman" w:hAnsi="Times New Roman" w:cs="Times New Roman"/>
+          <w:color w:val="000000" w:themeColor="text1"/>
+          <w:sz w:val="20"/>
+          <w:szCs w:val="20"/>
+          <w:lang w:eastAsia="zh-CN"/>
+        </w:rPr>
+        <w:tab/>
+      </w:r>
+      <w:r>
+        <w:rPr>
+          <w:rFonts w:ascii="Times New Roman" w:hAnsi="Times New Roman" w:cs="Times New Roman"/>
+          <w:color w:val="000000" w:themeColor="text1"/>
+          <w:sz w:val="20"/>
+          <w:szCs w:val="20"/>
+          <w:lang w:eastAsia="zh-CN"/>
+        </w:rPr>
+        <w:tab/>
+      </w:r>
+      <w:r>
+        <w:rPr>
+          <w:rFonts w:ascii="Times New Roman" w:hAnsi="Times New Roman" w:cs="Times New Roman"/>
+          <w:color w:val="000000" w:themeColor="text1"/>
+          <w:sz w:val="20"/>
+          <w:szCs w:val="20"/>
+          <w:lang w:eastAsia="zh-CN"/>
+        </w:rPr>
+        <w:tab/>
+      </w:r>
+      <w:r>
+        <w:rPr>
+          <w:rFonts w:ascii="Times New Roman" w:hAnsi="Times New Roman" w:cs="Times New Roman" w:hint="eastAsia"/>
+          <w:color w:val="000000" w:themeColor="text1"/>
+          <w:sz w:val="20"/>
+          <w:szCs w:val="20"/>
+          <w:lang w:eastAsia="zh-CN"/>
+        </w:rPr>
+        <w:t>Users shall only view conversation in which they are participants.</w:t>
+      </w:r>
+    </w:p>
+    <w:p>
+      <w:pPr>
+        <w:spacing w:line="240" w:lineRule="auto"/>
+        <w:rPr>
+          <w:rFonts w:ascii="Times New Roman" w:hAnsi="Times New Roman" w:cs="Times New Roman"/>
+          <w:color w:val="000000" w:themeColor="text1"/>
+          <w:sz w:val="20"/>
+          <w:szCs w:val="20"/>
+          <w:lang w:eastAsia="zh-CN"/>
+        </w:rPr>
+      </w:pPr>
+      <w:r>
+        <w:rPr>
+          <w:rFonts w:ascii="Times New Roman" w:hAnsi="Times New Roman" w:cs="Times New Roman"/>
+          <w:color w:val="000000" w:themeColor="text1"/>
+          <w:sz w:val="20"/>
+          <w:szCs w:val="20"/>
+          <w:lang w:eastAsia="zh-CN"/>
+        </w:rPr>
+        <w:tab/>
+      </w:r>
+      <w:r>
+        <w:rPr>
+          <w:rFonts w:ascii="Times New Roman" w:hAnsi="Times New Roman" w:cs="Times New Roman"/>
+          <w:color w:val="000000" w:themeColor="text1"/>
+          <w:sz w:val="20"/>
+          <w:szCs w:val="20"/>
+          <w:lang w:eastAsia="zh-CN"/>
+        </w:rPr>
+        <w:tab/>
+      </w:r>
+      <w:r>
+        <w:rPr>
+          <w:rFonts w:ascii="Times New Roman" w:hAnsi="Times New Roman" w:cs="Times New Roman"/>
+          <w:color w:val="000000" w:themeColor="text1"/>
+          <w:sz w:val="20"/>
+          <w:szCs w:val="20"/>
+          <w:lang w:eastAsia="zh-CN"/>
+        </w:rPr>
+        <w:tab/>
+      </w:r>
+      <w:r>
+        <w:rPr>
+          <w:rFonts w:ascii="Times New Roman" w:hAnsi="Times New Roman" w:cs="Times New Roman" w:hint="eastAsia"/>
+          <w:color w:val="000000" w:themeColor="text1"/>
+          <w:sz w:val="20"/>
+          <w:szCs w:val="20"/>
+          <w:lang w:eastAsia="zh-CN"/>
+        </w:rPr>
+        <w:t>IT users shall be able to view all conversation.</w:t>
+      </w:r>
+    </w:p>
+    <w:p>
+      <w:pPr>
+        <w:spacing w:line="240" w:lineRule="auto"/>
+        <w:rPr>
+          <w:rFonts w:ascii="Times New Roman" w:hAnsi="Times New Roman" w:cs="Times New Roman"/>
+          <w:color w:val="000000" w:themeColor="text1"/>
+          <w:sz w:val="20"/>
+          <w:szCs w:val="20"/>
+          <w:lang w:eastAsia="zh-CN"/>
+        </w:rPr>
+      </w:pPr>
+      <w:r>
+        <w:rPr>
+          <w:rFonts w:ascii="Times New Roman" w:hAnsi="Times New Roman" w:cs="Times New Roman"/>
+          <w:color w:val="000000" w:themeColor="text1"/>
+          <w:sz w:val="20"/>
+          <w:szCs w:val="20"/>
+          <w:lang w:eastAsia="zh-CN"/>
+        </w:rPr>
+        <w:tab/>
+      </w:r>
+      <w:r>
+        <w:rPr>
+          <w:rFonts w:ascii="Times New Roman" w:hAnsi="Times New Roman" w:cs="Times New Roman"/>
+          <w:color w:val="000000" w:themeColor="text1"/>
+          <w:sz w:val="20"/>
+          <w:szCs w:val="20"/>
+          <w:lang w:eastAsia="zh-CN"/>
+        </w:rPr>
+        <w:tab/>
+      </w:r>
+      <w:r>
+        <w:rPr>
+          <w:rFonts w:ascii="Times New Roman" w:hAnsi="Times New Roman" w:cs="Times New Roman"/>
+          <w:color w:val="000000" w:themeColor="text1"/>
+          <w:sz w:val="20"/>
+          <w:szCs w:val="20"/>
+          <w:lang w:eastAsia="zh-CN"/>
+        </w:rPr>
+        <w:tab/>
+        <w:t>M</w:t>
+      </w:r>
+      <w:r>
+        <w:rPr>
+          <w:rFonts w:ascii="Times New Roman" w:hAnsi="Times New Roman" w:cs="Times New Roman" w:hint="eastAsia"/>
+          <w:color w:val="000000" w:themeColor="text1"/>
+          <w:sz w:val="20"/>
+          <w:szCs w:val="20"/>
+          <w:lang w:eastAsia="zh-CN"/>
+        </w:rPr>
+        <w:t>essage order shall be banned to modify.</w:t>
+      </w:r>
+    </w:p>
+    <w:p>
+      <w:pPr>
+        <w:spacing w:line="240" w:lineRule="auto"/>
+        <w:rPr>
+          <w:rFonts w:ascii="Times New Roman" w:hAnsi="Times New Roman" w:cs="Times New Roman"/>
+          <w:color w:val="000000" w:themeColor="text1"/>
+          <w:sz w:val="20"/>
+          <w:szCs w:val="20"/>
+          <w:lang w:eastAsia="zh-CN"/>
+        </w:rPr>
+      </w:pPr>
+      <w:r>
+        <w:rPr>
+          <w:rFonts w:ascii="Times New Roman" w:hAnsi="Times New Roman" w:cs="Times New Roman"/>
+          <w:color w:val="000000" w:themeColor="text1"/>
+          <w:sz w:val="20"/>
+          <w:szCs w:val="20"/>
+          <w:lang w:eastAsia="zh-CN"/>
+        </w:rPr>
+        <w:tab/>
+      </w:r>
+      <w:r>
+        <w:rPr>
+          <w:rFonts w:ascii="Times New Roman" w:hAnsi="Times New Roman" w:cs="Times New Roman"/>
+          <w:color w:val="000000" w:themeColor="text1"/>
+          <w:sz w:val="20"/>
+          <w:szCs w:val="20"/>
+          <w:lang w:eastAsia="zh-CN"/>
+        </w:rPr>
+        <w:tab/>
+      </w:r>
+      <w:r>
+        <w:rPr>
+          <w:rFonts w:ascii="Times New Roman" w:hAnsi="Times New Roman" w:cs="Times New Roman"/>
+          <w:color w:val="000000" w:themeColor="text1"/>
+          <w:sz w:val="20"/>
+          <w:szCs w:val="20"/>
+          <w:lang w:eastAsia="zh-CN"/>
+        </w:rPr>
+        <w:tab/>
+      </w:r>
+      <w:r>
+        <w:rPr>
+          <w:rFonts w:ascii="Times New Roman" w:hAnsi="Times New Roman" w:cs="Times New Roman" w:hint="eastAsia"/>
+          <w:color w:val="000000" w:themeColor="text1"/>
+          <w:sz w:val="20"/>
+          <w:szCs w:val="20"/>
+          <w:lang w:eastAsia="zh-CN"/>
+        </w:rPr>
+        <w:t xml:space="preserve">Message sent shall be banned </w:t>
+      </w:r>
+      <w:r>
+        <w:rPr>
+          <w:rFonts w:ascii="Times New Roman" w:hAnsi="Times New Roman" w:cs="Times New Roman"/>
+          <w:color w:val="000000" w:themeColor="text1"/>
+          <w:sz w:val="20"/>
+          <w:szCs w:val="20"/>
+          <w:lang w:eastAsia="zh-CN"/>
+        </w:rPr>
+        <w:t>from modifying</w:t>
+      </w:r>
+      <w:r>
+        <w:rPr>
+          <w:rFonts w:ascii="Times New Roman" w:hAnsi="Times New Roman" w:cs="Times New Roman" w:hint="eastAsia"/>
+          <w:color w:val="000000" w:themeColor="text1"/>
+          <w:sz w:val="20"/>
+          <w:szCs w:val="20"/>
+          <w:lang w:eastAsia="zh-CN"/>
+        </w:rPr>
+        <w:t>.</w:t>
+      </w:r>
+    </w:p>
+    <w:p>
+      <w:pPr>
+        <w:spacing w:line="240" w:lineRule="auto"/>
+        <w:rPr>
+          <w:rFonts w:ascii="Times New Roman" w:hAnsi="Times New Roman" w:cs="Times New Roman"/>
+          <w:color w:val="000000" w:themeColor="text1"/>
+          <w:sz w:val="20"/>
+          <w:szCs w:val="20"/>
+          <w:lang w:eastAsia="zh-CN"/>
+        </w:rPr>
+      </w:pPr>
+      <w:r>
+        <w:rPr>
+          <w:rFonts w:ascii="Times New Roman" w:hAnsi="Times New Roman" w:cs="Times New Roman"/>
+          <w:color w:val="000000" w:themeColor="text1"/>
+          <w:sz w:val="20"/>
+          <w:szCs w:val="20"/>
+          <w:lang w:eastAsia="zh-CN"/>
+        </w:rPr>
+        <w:tab/>
+      </w:r>
+      <w:r>
+        <w:rPr>
+          <w:rFonts w:ascii="Times New Roman" w:hAnsi="Times New Roman" w:cs="Times New Roman"/>
+          <w:color w:val="000000" w:themeColor="text1"/>
+          <w:sz w:val="20"/>
+          <w:szCs w:val="20"/>
+          <w:lang w:eastAsia="zh-CN"/>
+        </w:rPr>
+        <w:tab/>
+      </w:r>
+      <w:r>
+        <w:rPr>
+          <w:rFonts w:ascii="Times New Roman" w:hAnsi="Times New Roman" w:cs="Times New Roman"/>
+          <w:color w:val="000000" w:themeColor="text1"/>
+          <w:sz w:val="20"/>
+          <w:szCs w:val="20"/>
+          <w:lang w:eastAsia="zh-CN"/>
+        </w:rPr>
+        <w:tab/>
+      </w:r>
+    </w:p>
+    <w:p>
+      <w:pPr>
+        <w:pStyle w:val="2"/>
         <w:keepLines w:val="0"/>
         <w:numPr>
           <w:ilvl w:val="1"/>
@@ -6998,11 +7614,12 @@
         </w:numPr>
         <w:spacing w:before="240" w:after="60" w:line="240" w:lineRule="auto"/>
         <w:rPr>
-          <w:rFonts w:ascii="Times New Roman" w:eastAsia="Times New Roman" w:hAnsi="Times New Roman" w:cs="Times New Roman"/>
+          <w:rFonts w:ascii="Times New Roman" w:hAnsi="Times New Roman" w:cs="Times New Roman"/>
           <w:b/>
           <w:bCs/>
           <w:sz w:val="24"/>
           <w:szCs w:val="24"/>
+          <w:lang w:eastAsia="zh-CN"/>
         </w:rPr>
       </w:pPr>
       <w:bookmarkStart w:id="19" w:name="_4yj8k4bg0hqt" w:colFirst="0" w:colLast="0"/>
@@ -7020,97 +7637,229 @@
     </w:p>
     <w:p>
       <w:pPr>
-        <w:spacing w:line="240" w:lineRule="auto"/>
-        <w:ind w:left="1440"/>
-        <w:rPr>
-          <w:rFonts w:ascii="Times New Roman" w:eastAsia="Times New Roman" w:hAnsi="Times New Roman" w:cs="Times New Roman"/>
-          <w:color w:val="7030A0"/>
-          <w:sz w:val="20"/>
-          <w:szCs w:val="20"/>
-        </w:rPr>
-      </w:pPr>
-      <w:bookmarkStart w:id="20" w:name="kix.k2on5amvmapj" w:colFirst="0" w:colLast="0"/>
-      <w:bookmarkEnd w:id="20"/>
-      <w:r>
-        <w:rPr>
-          <w:rFonts w:ascii="Times New Roman" w:eastAsia="Times New Roman" w:hAnsi="Times New Roman" w:cs="Times New Roman"/>
-          <w:color w:val="7030A0"/>
-          <w:sz w:val="20"/>
-          <w:szCs w:val="20"/>
-        </w:rPr>
-        <w:t>Example:</w:t>
-      </w:r>
-    </w:p>
-    <w:p>
-      <w:pPr>
-        <w:spacing w:line="240" w:lineRule="auto"/>
-        <w:ind w:left="1440"/>
-        <w:rPr>
-          <w:rFonts w:ascii="Times New Roman" w:eastAsia="Times New Roman" w:hAnsi="Times New Roman" w:cs="Times New Roman"/>
-          <w:color w:val="7030A0"/>
-          <w:sz w:val="20"/>
-          <w:szCs w:val="20"/>
-        </w:rPr>
-      </w:pPr>
-      <w:r>
-        <w:rPr>
-          <w:rFonts w:ascii="Times New Roman" w:eastAsia="Times New Roman" w:hAnsi="Times New Roman" w:cs="Times New Roman"/>
-          <w:color w:val="7030A0"/>
-          <w:sz w:val="20"/>
-          <w:szCs w:val="20"/>
-        </w:rPr>
-        <w:t>4.2.1 System cannot require that any software other than a web browser be installed on user computers. </w:t>
-      </w:r>
-    </w:p>
-    <w:p>
-      <w:pPr>
-        <w:spacing w:line="240" w:lineRule="auto"/>
-        <w:ind w:left="1440"/>
-        <w:rPr>
-          <w:rFonts w:ascii="Times New Roman" w:eastAsia="Times New Roman" w:hAnsi="Times New Roman" w:cs="Times New Roman"/>
-          <w:color w:val="7030A0"/>
-          <w:sz w:val="20"/>
-          <w:szCs w:val="20"/>
-        </w:rPr>
-      </w:pPr>
-      <w:bookmarkStart w:id="21" w:name="kix.mihatjxqq2f9" w:colFirst="0" w:colLast="0"/>
-      <w:bookmarkEnd w:id="21"/>
-      <w:r>
-        <w:rPr>
-          <w:rFonts w:ascii="Times New Roman" w:eastAsia="Times New Roman" w:hAnsi="Times New Roman" w:cs="Times New Roman"/>
-          <w:color w:val="7030A0"/>
-          <w:sz w:val="20"/>
-          <w:szCs w:val="20"/>
-        </w:rPr>
-        <w:t>4.2.2 System must make use of the University’s existing Oracle 9i implementation for its database. </w:t>
-      </w:r>
-    </w:p>
-    <w:p>
-      <w:pPr>
-        <w:spacing w:line="240" w:lineRule="auto"/>
-        <w:ind w:left="1440"/>
-        <w:rPr>
-          <w:rFonts w:ascii="Times New Roman" w:eastAsia="Times New Roman" w:hAnsi="Times New Roman" w:cs="Times New Roman"/>
-          <w:color w:val="7030A0"/>
-          <w:sz w:val="20"/>
-          <w:szCs w:val="20"/>
-        </w:rPr>
-      </w:pPr>
-      <w:bookmarkStart w:id="22" w:name="kix.pnoq5lj3tlq3" w:colFirst="0" w:colLast="0"/>
-      <w:bookmarkEnd w:id="22"/>
-      <w:r>
-        <w:rPr>
-          <w:rFonts w:ascii="Times New Roman" w:eastAsia="Times New Roman" w:hAnsi="Times New Roman" w:cs="Times New Roman"/>
-          <w:color w:val="7030A0"/>
-          <w:sz w:val="20"/>
-          <w:szCs w:val="20"/>
-        </w:rPr>
-        <w:t>4.2.3 System must be deployed on existing Linux-based server infrastructure. </w:t>
-      </w:r>
-    </w:p>
-    <w:p>
-      <w:pPr>
-        <w:pStyle w:val="Heading2"/>
+        <w:ind w:left="2160"/>
+        <w:rPr>
+          <w:color w:val="000000" w:themeColor="text1"/>
+          <w:lang w:eastAsia="zh-CN"/>
+        </w:rPr>
+      </w:pPr>
+      <w:r>
+        <w:rPr>
+          <w:rFonts w:hint="eastAsia"/>
+          <w:color w:val="000000" w:themeColor="text1"/>
+          <w:lang w:eastAsia="zh-CN"/>
+        </w:rPr>
+        <w:t xml:space="preserve">The system </w:t>
+      </w:r>
+      <w:proofErr w:type="gramStart"/>
+      <w:r>
+        <w:rPr>
+          <w:rFonts w:hint="eastAsia"/>
+          <w:color w:val="000000" w:themeColor="text1"/>
+          <w:lang w:eastAsia="zh-CN"/>
+        </w:rPr>
+        <w:t>shall</w:t>
+      </w:r>
+      <w:proofErr w:type="gramEnd"/>
+      <w:r>
+        <w:rPr>
+          <w:rFonts w:hint="eastAsia"/>
+          <w:color w:val="000000" w:themeColor="text1"/>
+          <w:lang w:eastAsia="zh-CN"/>
+        </w:rPr>
+        <w:t xml:space="preserve"> be developed and implemented by using Java.</w:t>
+      </w:r>
+    </w:p>
+    <w:p>
+      <w:pPr>
+        <w:ind w:left="2160"/>
+        <w:rPr>
+          <w:color w:val="000000" w:themeColor="text1"/>
+          <w:lang w:eastAsia="zh-CN"/>
+        </w:rPr>
+      </w:pPr>
+      <w:r>
+        <w:rPr>
+          <w:rFonts w:hint="eastAsia"/>
+          <w:color w:val="000000" w:themeColor="text1"/>
+          <w:lang w:eastAsia="zh-CN"/>
+        </w:rPr>
+        <w:t xml:space="preserve">Any database systems shall be </w:t>
+      </w:r>
+      <w:r>
+        <w:rPr>
+          <w:color w:val="000000" w:themeColor="text1"/>
+          <w:lang w:eastAsia="zh-CN"/>
+        </w:rPr>
+        <w:t>prohibit</w:t>
+      </w:r>
+      <w:r>
+        <w:rPr>
+          <w:rFonts w:hint="eastAsia"/>
+          <w:color w:val="000000" w:themeColor="text1"/>
+          <w:lang w:eastAsia="zh-CN"/>
+        </w:rPr>
+        <w:t>ed.</w:t>
+      </w:r>
+    </w:p>
+    <w:p>
+      <w:pPr>
+        <w:ind w:left="2160"/>
+        <w:rPr>
+          <w:color w:val="000000" w:themeColor="text1"/>
+          <w:lang w:eastAsia="zh-CN"/>
+        </w:rPr>
+      </w:pPr>
+      <w:r>
+        <w:rPr>
+          <w:rFonts w:hint="eastAsia"/>
+          <w:color w:val="000000" w:themeColor="text1"/>
+          <w:lang w:eastAsia="zh-CN"/>
+        </w:rPr>
+        <w:t xml:space="preserve">The system shall not </w:t>
+      </w:r>
+      <w:r>
+        <w:rPr>
+          <w:color w:val="000000" w:themeColor="text1"/>
+          <w:lang w:eastAsia="zh-CN"/>
+        </w:rPr>
+        <w:t>use</w:t>
+      </w:r>
+      <w:r>
+        <w:rPr>
+          <w:rFonts w:hint="eastAsia"/>
+          <w:color w:val="000000" w:themeColor="text1"/>
+          <w:lang w:eastAsia="zh-CN"/>
+        </w:rPr>
+        <w:t xml:space="preserve"> any encryption technology. </w:t>
+      </w:r>
+    </w:p>
+    <w:p>
+      <w:pPr>
+        <w:ind w:left="1440" w:firstLine="720"/>
+        <w:rPr>
+          <w:color w:val="000000" w:themeColor="text1"/>
+          <w:lang w:eastAsia="zh-CN"/>
+        </w:rPr>
+      </w:pPr>
+      <w:r>
+        <w:rPr>
+          <w:rFonts w:hint="eastAsia"/>
+          <w:color w:val="000000" w:themeColor="text1"/>
+          <w:lang w:eastAsia="zh-CN"/>
+        </w:rPr>
+        <w:t xml:space="preserve">The system </w:t>
+      </w:r>
+      <w:proofErr w:type="gramStart"/>
+      <w:r>
+        <w:rPr>
+          <w:rFonts w:hint="eastAsia"/>
+          <w:color w:val="000000" w:themeColor="text1"/>
+          <w:lang w:eastAsia="zh-CN"/>
+        </w:rPr>
+        <w:t>shall</w:t>
+      </w:r>
+      <w:proofErr w:type="gramEnd"/>
+      <w:r>
+        <w:rPr>
+          <w:rFonts w:hint="eastAsia"/>
+          <w:color w:val="000000" w:themeColor="text1"/>
+          <w:lang w:eastAsia="zh-CN"/>
+        </w:rPr>
+        <w:t xml:space="preserve"> be able to operate on </w:t>
+      </w:r>
+      <w:proofErr w:type="gramStart"/>
+      <w:r>
+        <w:rPr>
+          <w:rFonts w:hint="eastAsia"/>
+          <w:color w:val="000000" w:themeColor="text1"/>
+          <w:lang w:eastAsia="zh-CN"/>
+        </w:rPr>
+        <w:t>standard</w:t>
+      </w:r>
+      <w:proofErr w:type="gramEnd"/>
+      <w:r>
+        <w:rPr>
+          <w:rFonts w:hint="eastAsia"/>
+          <w:color w:val="000000" w:themeColor="text1"/>
+          <w:lang w:eastAsia="zh-CN"/>
+        </w:rPr>
+        <w:t xml:space="preserve"> operating system (Windows, Linux, MacOS)</w:t>
+      </w:r>
+    </w:p>
+    <w:p>
+      <w:pPr>
+        <w:ind w:left="1440" w:firstLine="720"/>
+        <w:rPr>
+          <w:color w:val="000000" w:themeColor="text1"/>
+          <w:lang w:eastAsia="zh-CN"/>
+        </w:rPr>
+      </w:pPr>
+      <w:r>
+        <w:rPr>
+          <w:rFonts w:hint="eastAsia"/>
+          <w:color w:val="000000" w:themeColor="text1"/>
+          <w:lang w:eastAsia="zh-CN"/>
+        </w:rPr>
+        <w:t>The system shall Operate in TCP/IP network environments.</w:t>
+      </w:r>
+    </w:p>
+    <w:p>
+      <w:pPr>
+        <w:ind w:left="1440" w:firstLine="720"/>
+        <w:rPr>
+          <w:color w:val="000000" w:themeColor="text1"/>
+          <w:lang w:eastAsia="zh-CN"/>
+        </w:rPr>
+      </w:pPr>
+      <w:r>
+        <w:rPr>
+          <w:rFonts w:hint="eastAsia"/>
+          <w:color w:val="000000" w:themeColor="text1"/>
+          <w:lang w:eastAsia="zh-CN"/>
+        </w:rPr>
+        <w:t xml:space="preserve">Client and server </w:t>
+      </w:r>
+      <w:r>
+        <w:rPr>
+          <w:color w:val="000000" w:themeColor="text1"/>
+          <w:lang w:eastAsia="zh-CN"/>
+        </w:rPr>
+        <w:t>systems</w:t>
+      </w:r>
+      <w:r>
+        <w:rPr>
+          <w:rFonts w:hint="eastAsia"/>
+          <w:color w:val="000000" w:themeColor="text1"/>
+          <w:lang w:eastAsia="zh-CN"/>
+        </w:rPr>
+        <w:t xml:space="preserve"> must support TCP/IP networking.</w:t>
+      </w:r>
+    </w:p>
+    <w:p>
+      <w:pPr>
+        <w:ind w:left="1440" w:firstLine="720"/>
+        <w:rPr>
+          <w:color w:val="000000" w:themeColor="text1"/>
+          <w:lang w:eastAsia="zh-CN"/>
+        </w:rPr>
+      </w:pPr>
+    </w:p>
+    <w:p>
+      <w:pPr>
+        <w:ind w:left="1440" w:firstLine="720"/>
+        <w:rPr>
+          <w:rFonts w:ascii="Times New Roman" w:eastAsia="Times New Roman" w:hAnsi="Times New Roman" w:cs="Times New Roman"/>
+          <w:b/>
+          <w:bCs/>
+          <w:sz w:val="24"/>
+          <w:szCs w:val="24"/>
+        </w:rPr>
+      </w:pPr>
+    </w:p>
+    <w:p>
+      <w:pPr>
+        <w:pStyle w:val="2"/>
         <w:keepLines w:val="0"/>
         <w:numPr>
           <w:ilvl w:val="1"/>
@@ -7125,62 +7874,354 @@
           <w:szCs w:val="24"/>
         </w:rPr>
       </w:pPr>
-      <w:bookmarkStart w:id="23" w:name="_5jq7zrvmzkyv" w:colFirst="0" w:colLast="0"/>
-      <w:bookmarkEnd w:id="23"/>
-      <w:r>
-        <w:rPr>
-          <w:rFonts w:ascii="Times New Roman" w:eastAsia="Times New Roman" w:hAnsi="Times New Roman" w:cs="Times New Roman"/>
+      <w:r>
+        <w:rPr>
+          <w:rFonts w:ascii="Times New Roman" w:hAnsi="Times New Roman" w:cs="Times New Roman" w:hint="eastAsia"/>
           <w:b/>
           <w:bCs/>
           <w:sz w:val="24"/>
           <w:szCs w:val="24"/>
-        </w:rPr>
-        <w:t>Performance Requirements</w:t>
+          <w:lang w:eastAsia="zh-CN"/>
+        </w:rPr>
+        <w:t>Performance Req</w:t>
+      </w:r>
+      <w:r>
+        <w:rPr>
+          <w:rFonts w:ascii="Times New Roman" w:eastAsia="Times New Roman" w:hAnsi="Times New Roman" w:cs="Times New Roman"/>
+          <w:b/>
+          <w:bCs/>
+          <w:sz w:val="24"/>
+          <w:szCs w:val="24"/>
+        </w:rPr>
+        <w:t>uirements</w:t>
       </w:r>
     </w:p>
     <w:p>
       <w:pPr>
         <w:spacing w:line="240" w:lineRule="auto"/>
+        <w:ind w:left="2160"/>
+        <w:rPr>
+          <w:rFonts w:ascii="Times New Roman" w:hAnsi="Times New Roman" w:cs="Times New Roman"/>
+          <w:color w:val="000000" w:themeColor="text1"/>
+          <w:sz w:val="20"/>
+          <w:szCs w:val="20"/>
+          <w:lang w:eastAsia="zh-CN"/>
+        </w:rPr>
+      </w:pPr>
+      <w:bookmarkStart w:id="20" w:name="kix.i9jxjlbd62ai" w:colFirst="0" w:colLast="0"/>
+      <w:bookmarkEnd w:id="20"/>
+      <w:r>
+        <w:rPr>
+          <w:rFonts w:ascii="Times New Roman" w:hAnsi="Times New Roman" w:cs="Times New Roman" w:hint="eastAsia"/>
+          <w:color w:val="000000" w:themeColor="text1"/>
+          <w:sz w:val="20"/>
+          <w:szCs w:val="20"/>
+          <w:lang w:eastAsia="zh-CN"/>
+        </w:rPr>
+        <w:t>Login response time shall not exceed 3 seconds.</w:t>
+      </w:r>
+    </w:p>
+    <w:p>
+      <w:pPr>
+        <w:spacing w:line="240" w:lineRule="auto"/>
+        <w:ind w:left="2160"/>
+        <w:rPr>
+          <w:rFonts w:ascii="Times New Roman" w:hAnsi="Times New Roman" w:cs="Times New Roman"/>
+          <w:color w:val="000000" w:themeColor="text1"/>
+          <w:sz w:val="20"/>
+          <w:szCs w:val="20"/>
+          <w:lang w:eastAsia="zh-CN"/>
+        </w:rPr>
+      </w:pPr>
+      <w:r>
+        <w:rPr>
+          <w:rFonts w:ascii="Times New Roman" w:hAnsi="Times New Roman" w:cs="Times New Roman" w:hint="eastAsia"/>
+          <w:color w:val="000000" w:themeColor="text1"/>
+          <w:sz w:val="20"/>
+          <w:szCs w:val="20"/>
+          <w:lang w:eastAsia="zh-CN"/>
+        </w:rPr>
+        <w:t>Message delivery time shall not exceed 3 seconds.</w:t>
+      </w:r>
+    </w:p>
+    <w:p>
+      <w:pPr>
+        <w:spacing w:line="240" w:lineRule="auto"/>
+        <w:ind w:left="2160"/>
+        <w:rPr>
+          <w:rFonts w:ascii="Times New Roman" w:hAnsi="Times New Roman" w:cs="Times New Roman"/>
+          <w:color w:val="000000" w:themeColor="text1"/>
+          <w:sz w:val="20"/>
+          <w:szCs w:val="20"/>
+          <w:lang w:eastAsia="zh-CN"/>
+        </w:rPr>
+      </w:pPr>
+      <w:r>
+        <w:rPr>
+          <w:rFonts w:ascii="Times New Roman" w:hAnsi="Times New Roman" w:cs="Times New Roman"/>
+          <w:color w:val="000000" w:themeColor="text1"/>
+          <w:sz w:val="20"/>
+          <w:szCs w:val="20"/>
+          <w:lang w:eastAsia="zh-CN"/>
+        </w:rPr>
+        <w:t>C</w:t>
+      </w:r>
+      <w:r>
+        <w:rPr>
+          <w:rFonts w:ascii="Times New Roman" w:hAnsi="Times New Roman" w:cs="Times New Roman" w:hint="eastAsia"/>
+          <w:color w:val="000000" w:themeColor="text1"/>
+          <w:sz w:val="20"/>
+          <w:szCs w:val="20"/>
+          <w:lang w:eastAsia="zh-CN"/>
+        </w:rPr>
+        <w:t>hat list updates shall not exceed 3 seconds.</w:t>
+      </w:r>
+    </w:p>
+    <w:p>
+      <w:pPr>
+        <w:spacing w:line="240" w:lineRule="auto"/>
+        <w:ind w:left="2160"/>
+        <w:rPr>
+          <w:rFonts w:ascii="Times New Roman" w:hAnsi="Times New Roman" w:cs="Times New Roman"/>
+          <w:color w:val="000000" w:themeColor="text1"/>
+          <w:sz w:val="20"/>
+          <w:szCs w:val="20"/>
+          <w:lang w:eastAsia="zh-CN"/>
+        </w:rPr>
+      </w:pPr>
+      <w:r>
+        <w:rPr>
+          <w:rFonts w:ascii="Times New Roman" w:hAnsi="Times New Roman" w:cs="Times New Roman" w:hint="eastAsia"/>
+          <w:color w:val="000000" w:themeColor="text1"/>
+          <w:sz w:val="20"/>
+          <w:szCs w:val="20"/>
+          <w:lang w:eastAsia="zh-CN"/>
+        </w:rPr>
+        <w:t xml:space="preserve">The system </w:t>
+      </w:r>
+      <w:proofErr w:type="gramStart"/>
+      <w:r>
+        <w:rPr>
+          <w:rFonts w:ascii="Times New Roman" w:hAnsi="Times New Roman" w:cs="Times New Roman" w:hint="eastAsia"/>
+          <w:color w:val="000000" w:themeColor="text1"/>
+          <w:sz w:val="20"/>
+          <w:szCs w:val="20"/>
+          <w:lang w:eastAsia="zh-CN"/>
+        </w:rPr>
+        <w:t>shall</w:t>
+      </w:r>
+      <w:proofErr w:type="gramEnd"/>
+      <w:r>
+        <w:rPr>
+          <w:rFonts w:ascii="Times New Roman" w:hAnsi="Times New Roman" w:cs="Times New Roman" w:hint="eastAsia"/>
+          <w:color w:val="000000" w:themeColor="text1"/>
+          <w:sz w:val="20"/>
+          <w:szCs w:val="20"/>
+          <w:lang w:eastAsia="zh-CN"/>
+        </w:rPr>
+        <w:t xml:space="preserve"> maintain performance with </w:t>
+      </w:r>
+      <w:proofErr w:type="gramStart"/>
+      <w:r>
+        <w:rPr>
+          <w:rFonts w:ascii="Times New Roman" w:hAnsi="Times New Roman" w:cs="Times New Roman" w:hint="eastAsia"/>
+          <w:color w:val="000000" w:themeColor="text1"/>
+          <w:sz w:val="20"/>
+          <w:szCs w:val="20"/>
+          <w:lang w:eastAsia="zh-CN"/>
+        </w:rPr>
+        <w:t>increasing</w:t>
+      </w:r>
+      <w:proofErr w:type="gramEnd"/>
+      <w:r>
+        <w:rPr>
+          <w:rFonts w:ascii="Times New Roman" w:hAnsi="Times New Roman" w:cs="Times New Roman" w:hint="eastAsia"/>
+          <w:color w:val="000000" w:themeColor="text1"/>
+          <w:sz w:val="20"/>
+          <w:szCs w:val="20"/>
+          <w:lang w:eastAsia="zh-CN"/>
+        </w:rPr>
+        <w:t xml:space="preserve"> number of chats and messages.</w:t>
+      </w:r>
+    </w:p>
+    <w:p>
+      <w:pPr>
+        <w:spacing w:line="240" w:lineRule="auto"/>
+        <w:ind w:left="2160"/>
+        <w:rPr>
+          <w:rFonts w:ascii="Times New Roman" w:hAnsi="Times New Roman" w:cs="Times New Roman"/>
+          <w:color w:val="000000" w:themeColor="text1"/>
+          <w:sz w:val="20"/>
+          <w:szCs w:val="20"/>
+          <w:lang w:eastAsia="zh-CN"/>
+        </w:rPr>
+      </w:pPr>
+      <w:r>
+        <w:rPr>
+          <w:rFonts w:ascii="Times New Roman" w:hAnsi="Times New Roman" w:cs="Times New Roman" w:hint="eastAsia"/>
+          <w:color w:val="000000" w:themeColor="text1"/>
+          <w:sz w:val="20"/>
+          <w:szCs w:val="20"/>
+          <w:lang w:eastAsia="zh-CN"/>
+        </w:rPr>
+        <w:t xml:space="preserve">The system shall reserve </w:t>
+      </w:r>
+      <w:r>
+        <w:rPr>
+          <w:rFonts w:ascii="Times New Roman" w:hAnsi="Times New Roman" w:cs="Times New Roman"/>
+          <w:color w:val="000000" w:themeColor="text1"/>
+          <w:sz w:val="20"/>
+          <w:szCs w:val="20"/>
+          <w:lang w:eastAsia="zh-CN"/>
+        </w:rPr>
+        <w:t>messages</w:t>
+      </w:r>
+      <w:r>
+        <w:rPr>
+          <w:rFonts w:ascii="Times New Roman" w:hAnsi="Times New Roman" w:cs="Times New Roman" w:hint="eastAsia"/>
+          <w:color w:val="000000" w:themeColor="text1"/>
+          <w:sz w:val="20"/>
+          <w:szCs w:val="20"/>
+          <w:lang w:eastAsia="zh-CN"/>
+        </w:rPr>
+        <w:t xml:space="preserve"> even if the server </w:t>
+      </w:r>
+      <w:proofErr w:type="gramStart"/>
+      <w:r>
+        <w:rPr>
+          <w:rFonts w:ascii="Times New Roman" w:hAnsi="Times New Roman" w:cs="Times New Roman" w:hint="eastAsia"/>
+          <w:color w:val="000000" w:themeColor="text1"/>
+          <w:sz w:val="20"/>
+          <w:szCs w:val="20"/>
+          <w:lang w:eastAsia="zh-CN"/>
+        </w:rPr>
+        <w:t>restart</w:t>
+      </w:r>
+      <w:proofErr w:type="gramEnd"/>
+      <w:r>
+        <w:rPr>
+          <w:rFonts w:ascii="Times New Roman" w:hAnsi="Times New Roman" w:cs="Times New Roman" w:hint="eastAsia"/>
+          <w:color w:val="000000" w:themeColor="text1"/>
+          <w:sz w:val="20"/>
+          <w:szCs w:val="20"/>
+          <w:lang w:eastAsia="zh-CN"/>
+        </w:rPr>
+        <w:t>.</w:t>
+      </w:r>
+    </w:p>
+    <w:p>
+      <w:pPr>
+        <w:spacing w:line="240" w:lineRule="auto"/>
+        <w:ind w:left="2160"/>
+        <w:rPr>
+          <w:rFonts w:ascii="Times New Roman" w:hAnsi="Times New Roman" w:cs="Times New Roman"/>
+          <w:color w:val="000000" w:themeColor="text1"/>
+          <w:sz w:val="20"/>
+          <w:szCs w:val="20"/>
+          <w:lang w:eastAsia="zh-CN"/>
+        </w:rPr>
+      </w:pPr>
+      <w:r>
+        <w:rPr>
+          <w:rFonts w:ascii="Times New Roman" w:hAnsi="Times New Roman" w:cs="Times New Roman" w:hint="eastAsia"/>
+          <w:color w:val="000000" w:themeColor="text1"/>
+          <w:sz w:val="20"/>
+          <w:szCs w:val="20"/>
+          <w:lang w:eastAsia="zh-CN"/>
+        </w:rPr>
+        <w:t xml:space="preserve">The system </w:t>
+      </w:r>
+      <w:proofErr w:type="gramStart"/>
+      <w:r>
+        <w:rPr>
+          <w:rFonts w:ascii="Times New Roman" w:hAnsi="Times New Roman" w:cs="Times New Roman" w:hint="eastAsia"/>
+          <w:color w:val="000000" w:themeColor="text1"/>
+          <w:sz w:val="20"/>
+          <w:szCs w:val="20"/>
+          <w:lang w:eastAsia="zh-CN"/>
+        </w:rPr>
+        <w:t>shall</w:t>
+      </w:r>
+      <w:proofErr w:type="gramEnd"/>
+      <w:r>
+        <w:rPr>
+          <w:rFonts w:ascii="Times New Roman" w:hAnsi="Times New Roman" w:cs="Times New Roman" w:hint="eastAsia"/>
+          <w:color w:val="000000" w:themeColor="text1"/>
+          <w:sz w:val="20"/>
+          <w:szCs w:val="20"/>
+          <w:lang w:eastAsia="zh-CN"/>
+        </w:rPr>
+        <w:t xml:space="preserve"> provide detailed instructions for users.</w:t>
+      </w:r>
+    </w:p>
+    <w:p>
+      <w:pPr>
+        <w:spacing w:line="240" w:lineRule="auto"/>
+        <w:ind w:left="2160"/>
+        <w:rPr>
+          <w:rFonts w:ascii="Times New Roman" w:hAnsi="Times New Roman" w:cs="Times New Roman"/>
+          <w:color w:val="000000" w:themeColor="text1"/>
+          <w:sz w:val="20"/>
+          <w:szCs w:val="20"/>
+          <w:lang w:eastAsia="zh-CN"/>
+        </w:rPr>
+      </w:pPr>
+      <w:r>
+        <w:rPr>
+          <w:rFonts w:ascii="Times New Roman" w:hAnsi="Times New Roman" w:cs="Times New Roman"/>
+          <w:color w:val="000000" w:themeColor="text1"/>
+          <w:sz w:val="20"/>
+          <w:szCs w:val="20"/>
+          <w:lang w:eastAsia="zh-CN"/>
+        </w:rPr>
+        <w:t>T</w:t>
+      </w:r>
+      <w:r>
+        <w:rPr>
+          <w:rFonts w:ascii="Times New Roman" w:hAnsi="Times New Roman" w:cs="Times New Roman" w:hint="eastAsia"/>
+          <w:color w:val="000000" w:themeColor="text1"/>
+          <w:sz w:val="20"/>
+          <w:szCs w:val="20"/>
+          <w:lang w:eastAsia="zh-CN"/>
+        </w:rPr>
+        <w:t xml:space="preserve">he interface </w:t>
+      </w:r>
+      <w:proofErr w:type="gramStart"/>
+      <w:r>
+        <w:rPr>
+          <w:rFonts w:ascii="Times New Roman" w:hAnsi="Times New Roman" w:cs="Times New Roman" w:hint="eastAsia"/>
+          <w:color w:val="000000" w:themeColor="text1"/>
+          <w:sz w:val="20"/>
+          <w:szCs w:val="20"/>
+          <w:lang w:eastAsia="zh-CN"/>
+        </w:rPr>
+        <w:t>shall</w:t>
+      </w:r>
+      <w:proofErr w:type="gramEnd"/>
+      <w:r>
+        <w:rPr>
+          <w:rFonts w:ascii="Times New Roman" w:hAnsi="Times New Roman" w:cs="Times New Roman" w:hint="eastAsia"/>
+          <w:color w:val="000000" w:themeColor="text1"/>
+          <w:sz w:val="20"/>
+          <w:szCs w:val="20"/>
+          <w:lang w:eastAsia="zh-CN"/>
+        </w:rPr>
+        <w:t xml:space="preserve"> be intuitive and consistent.</w:t>
+      </w:r>
+    </w:p>
+    <w:p>
+      <w:pPr>
+        <w:pStyle w:val="2"/>
+        <w:keepLines w:val="0"/>
+        <w:spacing w:before="240" w:after="60" w:line="240" w:lineRule="auto"/>
         <w:ind w:left="1440"/>
         <w:rPr>
-          <w:rFonts w:ascii="Times New Roman" w:eastAsia="Times New Roman" w:hAnsi="Times New Roman" w:cs="Times New Roman"/>
+          <w:rFonts w:ascii="Times New Roman" w:eastAsia="Times New Roman" w:hAnsi="Times New Roman" w:cs="Times New Roman" w:hint="eastAsia"/>
           <w:color w:val="7030A0"/>
           <w:sz w:val="20"/>
           <w:szCs w:val="20"/>
         </w:rPr>
       </w:pPr>
-      <w:bookmarkStart w:id="24" w:name="kix.i9jxjlbd62ai" w:colFirst="0" w:colLast="0"/>
-      <w:bookmarkEnd w:id="24"/>
-      <w:r>
-        <w:rPr>
-          <w:rFonts w:ascii="Times New Roman" w:eastAsia="Times New Roman" w:hAnsi="Times New Roman" w:cs="Times New Roman"/>
-          <w:color w:val="7030A0"/>
-          <w:sz w:val="20"/>
-          <w:szCs w:val="20"/>
-        </w:rPr>
-        <w:t>Example:</w:t>
-      </w:r>
-    </w:p>
-    <w:p>
-      <w:pPr>
-        <w:spacing w:line="240" w:lineRule="auto"/>
-        <w:ind w:left="1440"/>
-        <w:rPr>
-          <w:rFonts w:ascii="Times New Roman" w:eastAsia="Times New Roman" w:hAnsi="Times New Roman" w:cs="Times New Roman"/>
-          <w:color w:val="7030A0"/>
-          <w:sz w:val="20"/>
-          <w:szCs w:val="20"/>
-        </w:rPr>
-      </w:pPr>
-      <w:r>
-        <w:rPr>
-          <w:rFonts w:ascii="Times New Roman" w:eastAsia="Times New Roman" w:hAnsi="Times New Roman" w:cs="Times New Roman"/>
-          <w:color w:val="7030A0"/>
-          <w:sz w:val="20"/>
-          <w:szCs w:val="20"/>
-        </w:rPr>
-        <w:t>4.3.1 System must render all UI pages in no more than 9 seconds for dynamic pages. Static pages (HTML-only) must be rendered in less than 3 seconds. </w:t>
-      </w:r>
     </w:p>
     <w:sectPr>
       <w:headerReference w:type="default" r:id="rId8"/>
@@ -8309,7 +9350,7 @@
   <w:docDefaults>
     <w:rPrDefault>
       <w:rPr>
-        <w:rFonts w:ascii="Arial" w:eastAsia="Arial" w:hAnsi="Arial" w:cs="Arial"/>
+        <w:rFonts w:ascii="Arial" w:eastAsiaTheme="minorEastAsia" w:hAnsi="Arial" w:cs="Arial"/>
         <w:sz w:val="22"/>
         <w:szCs w:val="22"/>
         <w:lang w:val="en" w:eastAsia="en-US" w:bidi="ar-SA"/>
@@ -8699,14 +9740,14 @@
     <w:lsdException w:name="Unresolved Mention" w:semiHidden="1" w:unhideWhenUsed="1"/>
     <w:lsdException w:name="Smart Link" w:semiHidden="1" w:unhideWhenUsed="1"/>
   </w:latentStyles>
-  <w:style w:type="paragraph" w:default="1" w:styleId="Normal">
+  <w:style w:type="paragraph" w:default="1" w:styleId="a">
     <w:name w:val="Normal"/>
     <w:qFormat/>
   </w:style>
-  <w:style w:type="paragraph" w:styleId="Heading1">
+  <w:style w:type="paragraph" w:styleId="1">
     <w:name w:val="heading 1"/>
-    <w:basedOn w:val="Normal"/>
-    <w:next w:val="Normal"/>
+    <w:basedOn w:val="a"/>
+    <w:next w:val="a"/>
     <w:uiPriority w:val="9"/>
     <w:qFormat/>
     <w:pPr>
@@ -8720,10 +9761,11 @@
       <w:szCs w:val="40"/>
     </w:rPr>
   </w:style>
-  <w:style w:type="paragraph" w:styleId="Heading2">
+  <w:style w:type="paragraph" w:styleId="2">
     <w:name w:val="heading 2"/>
-    <w:basedOn w:val="Normal"/>
-    <w:next w:val="Normal"/>
+    <w:basedOn w:val="a"/>
+    <w:next w:val="a"/>
+    <w:link w:val="20"/>
     <w:uiPriority w:val="9"/>
     <w:unhideWhenUsed/>
     <w:qFormat/>
@@ -8738,10 +9780,10 @@
       <w:szCs w:val="32"/>
     </w:rPr>
   </w:style>
-  <w:style w:type="paragraph" w:styleId="Heading3">
+  <w:style w:type="paragraph" w:styleId="3">
     <w:name w:val="heading 3"/>
-    <w:basedOn w:val="Normal"/>
-    <w:next w:val="Normal"/>
+    <w:basedOn w:val="a"/>
+    <w:next w:val="a"/>
     <w:uiPriority w:val="9"/>
     <w:unhideWhenUsed/>
     <w:qFormat/>
@@ -8757,10 +9799,10 @@
       <w:szCs w:val="28"/>
     </w:rPr>
   </w:style>
-  <w:style w:type="paragraph" w:styleId="Heading4">
+  <w:style w:type="paragraph" w:styleId="4">
     <w:name w:val="heading 4"/>
-    <w:basedOn w:val="Normal"/>
-    <w:next w:val="Normal"/>
+    <w:basedOn w:val="a"/>
+    <w:next w:val="a"/>
     <w:uiPriority w:val="9"/>
     <w:semiHidden/>
     <w:unhideWhenUsed/>
@@ -8777,10 +9819,10 @@
       <w:szCs w:val="24"/>
     </w:rPr>
   </w:style>
-  <w:style w:type="paragraph" w:styleId="Heading5">
+  <w:style w:type="paragraph" w:styleId="5">
     <w:name w:val="heading 5"/>
-    <w:basedOn w:val="Normal"/>
-    <w:next w:val="Normal"/>
+    <w:basedOn w:val="a"/>
+    <w:next w:val="a"/>
     <w:uiPriority w:val="9"/>
     <w:semiHidden/>
     <w:unhideWhenUsed/>
@@ -8795,10 +9837,10 @@
       <w:color w:val="666666"/>
     </w:rPr>
   </w:style>
-  <w:style w:type="paragraph" w:styleId="Heading6">
+  <w:style w:type="paragraph" w:styleId="6">
     <w:name w:val="heading 6"/>
-    <w:basedOn w:val="Normal"/>
-    <w:next w:val="Normal"/>
+    <w:basedOn w:val="a"/>
+    <w:next w:val="a"/>
     <w:uiPriority w:val="9"/>
     <w:semiHidden/>
     <w:unhideWhenUsed/>
@@ -8815,13 +9857,13 @@
       <w:color w:val="666666"/>
     </w:rPr>
   </w:style>
-  <w:style w:type="character" w:default="1" w:styleId="DefaultParagraphFont">
+  <w:style w:type="character" w:default="1" w:styleId="a0">
     <w:name w:val="Default Paragraph Font"/>
     <w:uiPriority w:val="1"/>
     <w:semiHidden/>
     <w:unhideWhenUsed/>
   </w:style>
-  <w:style w:type="table" w:default="1" w:styleId="TableNormal">
+  <w:style w:type="table" w:default="1" w:styleId="a1">
     <w:name w:val="Normal Table"/>
     <w:uiPriority w:val="99"/>
     <w:semiHidden/>
@@ -8836,13 +9878,13 @@
       </w:tblCellMar>
     </w:tblPr>
   </w:style>
-  <w:style w:type="numbering" w:default="1" w:styleId="NoList">
+  <w:style w:type="numbering" w:default="1" w:styleId="a2">
     <w:name w:val="No List"/>
     <w:uiPriority w:val="99"/>
     <w:semiHidden/>
     <w:unhideWhenUsed/>
   </w:style>
-  <w:style w:type="table" w:customStyle="1" w:styleId="TableNormal0">
+  <w:style w:type="table" w:customStyle="1" w:styleId="TableNormal">
     <w:name w:val="TableNormal"/>
     <w:tblPr>
       <w:tblCellMar>
@@ -8853,10 +9895,10 @@
       </w:tblCellMar>
     </w:tblPr>
   </w:style>
-  <w:style w:type="paragraph" w:styleId="Title">
+  <w:style w:type="paragraph" w:styleId="a3">
     <w:name w:val="Title"/>
-    <w:basedOn w:val="Normal"/>
-    <w:next w:val="Normal"/>
+    <w:basedOn w:val="a"/>
+    <w:next w:val="a"/>
     <w:uiPriority w:val="10"/>
     <w:qFormat/>
     <w:pPr>
@@ -8869,10 +9911,10 @@
       <w:szCs w:val="52"/>
     </w:rPr>
   </w:style>
-  <w:style w:type="paragraph" w:styleId="Subtitle">
+  <w:style w:type="paragraph" w:styleId="a4">
     <w:name w:val="Subtitle"/>
-    <w:basedOn w:val="Normal"/>
-    <w:next w:val="Normal"/>
+    <w:basedOn w:val="a"/>
+    <w:next w:val="a"/>
     <w:uiPriority w:val="11"/>
     <w:qFormat/>
     <w:pPr>
@@ -8886,8 +9928,8 @@
       <w:szCs w:val="30"/>
     </w:rPr>
   </w:style>
-  <w:style w:type="table" w:customStyle="1" w:styleId="a">
-    <w:basedOn w:val="TableNormal0"/>
+  <w:style w:type="table" w:customStyle="1" w:styleId="a5">
+    <w:basedOn w:val="TableNormal"/>
     <w:tblPr>
       <w:tblStyleRowBandSize w:val="1"/>
       <w:tblStyleColBandSize w:val="1"/>
@@ -8900,8 +9942,8 @@
   </w:style>
   <w:style w:type="paragraph" w:styleId="TOC1">
     <w:name w:val="toc 1"/>
-    <w:basedOn w:val="Normal"/>
-    <w:next w:val="Normal"/>
+    <w:basedOn w:val="a"/>
+    <w:next w:val="a"/>
     <w:rsid w:val="00DD3EFC"/>
     <w:pPr>
       <w:tabs>
@@ -8921,8 +9963,8 @@
   </w:style>
   <w:style w:type="paragraph" w:styleId="TOC2">
     <w:name w:val="toc 2"/>
-    <w:basedOn w:val="Normal"/>
-    <w:next w:val="Normal"/>
+    <w:basedOn w:val="a"/>
+    <w:next w:val="a"/>
     <w:rsid w:val="00DD3EFC"/>
     <w:pPr>
       <w:tabs>
@@ -8939,6 +9981,27 @@
       <w:szCs w:val="20"/>
       <w:lang w:val="en-US" w:eastAsia="zh-CN"/>
     </w:rPr>
+  </w:style>
+  <w:style w:type="character" w:customStyle="1" w:styleId="20">
+    <w:name w:val="标题 2 字符"/>
+    <w:basedOn w:val="a0"/>
+    <w:link w:val="2"/>
+    <w:uiPriority w:val="9"/>
+    <w:rsid w:val="004C44BC"/>
+    <w:rPr>
+      <w:sz w:val="32"/>
+      <w:szCs w:val="32"/>
+    </w:rPr>
+  </w:style>
+  <w:style w:type="paragraph" w:styleId="a6">
+    <w:name w:val="List Paragraph"/>
+    <w:basedOn w:val="a"/>
+    <w:uiPriority w:val="34"/>
+    <w:qFormat/>
+    <w:rsid w:val="004C44BC"/>
+    <w:pPr>
+      <w:ind w:firstLineChars="200" w:firstLine="420"/>
+    </w:pPr>
   </w:style>
 </w:styles>
 </file>

</xml_diff>

<commit_message>
Added changes made during meeting after class
</commit_message>
<xml_diff>
--- a/Communications SRS.docx
+++ b/Communications SRS.docx
@@ -5559,17 +5559,7 @@
           <w:szCs w:val="36"/>
         </w:rPr>
         <w:lastRenderedPageBreak/>
-        <w:t>Functional</w:t>
-      </w:r>
-      <w:r>
-        <w:rPr>
-          <w:rFonts w:ascii="Times New Roman" w:eastAsia="Times New Roman" w:hAnsi="Times New Roman" w:cs="Times New Roman"/>
-          <w:b/>
-          <w:bCs/>
-          <w:sz w:val="36"/>
-          <w:szCs w:val="36"/>
-        </w:rPr>
-        <w:t xml:space="preserve"> Requirements</w:t>
+        <w:t>Functional Requirements</w:t>
       </w:r>
     </w:p>
     <w:p>
@@ -5647,21 +5637,164 @@
     <w:p>
       <w:pPr>
         <w:numPr>
+          <w:ilvl w:val="1"/>
+          <w:numId w:val="1"/>
+        </w:numPr>
+        <w:rPr>
+          <w:rFonts w:ascii="Times New Roman" w:eastAsia="Times New Roman" w:hAnsi="Times New Roman" w:cs="Times New Roman"/>
+        </w:rPr>
+      </w:pPr>
+      <w:r>
+        <w:rPr>
+          <w:rFonts w:ascii="Times New Roman" w:eastAsia="Times New Roman" w:hAnsi="Times New Roman" w:cs="Times New Roman"/>
+          <w:b/>
+          <w:bCs/>
+          <w:sz w:val="24"/>
+          <w:szCs w:val="24"/>
+        </w:rPr>
+        <w:t>User Login Module Requirements:</w:t>
+      </w:r>
+    </w:p>
+    <w:p>
+      <w:pPr>
+        <w:numPr>
           <w:ilvl w:val="2"/>
           <w:numId w:val="1"/>
         </w:numPr>
         <w:rPr>
-          <w:sz w:val="20"/>
-          <w:szCs w:val="20"/>
-        </w:rPr>
-      </w:pPr>
-      <w:r>
-        <w:rPr>
-          <w:rFonts w:ascii="Times New Roman" w:eastAsia="Times New Roman" w:hAnsi="Times New Roman" w:cs="Times New Roman"/>
-          <w:sz w:val="20"/>
-          <w:szCs w:val="20"/>
-        </w:rPr>
-        <w:t xml:space="preserve"> The application is required to provide instructions on how to use it.</w:t>
+          <w:rFonts w:ascii="Times New Roman" w:hAnsi="Times New Roman" w:cs="Times New Roman"/>
+          <w:sz w:val="20"/>
+          <w:szCs w:val="20"/>
+        </w:rPr>
+      </w:pPr>
+      <w:r>
+        <w:rPr>
+          <w:rFonts w:ascii="Times New Roman" w:hAnsi="Times New Roman" w:cs="Times New Roman"/>
+          <w:sz w:val="20"/>
+          <w:szCs w:val="20"/>
+        </w:rPr>
+        <w:t>The Login Module (</w:t>
+      </w:r>
+      <w:r>
+        <w:rPr>
+          <w:rFonts w:ascii="Times New Roman" w:hAnsi="Times New Roman" w:cs="Times New Roman"/>
+          <w:sz w:val="20"/>
+          <w:szCs w:val="20"/>
+        </w:rPr>
+        <w:t>L</w:t>
+      </w:r>
+      <w:r>
+        <w:rPr>
+          <w:rFonts w:ascii="Times New Roman" w:hAnsi="Times New Roman" w:cs="Times New Roman"/>
+          <w:sz w:val="20"/>
+          <w:szCs w:val="20"/>
+        </w:rPr>
+        <w:t>M) contains a login menu to allow users to log into the communications app. This menu is displayed upon loading the client</w:t>
+      </w:r>
+    </w:p>
+    <w:p>
+      <w:pPr>
+        <w:numPr>
+          <w:ilvl w:val="2"/>
+          <w:numId w:val="1"/>
+        </w:numPr>
+        <w:rPr>
+          <w:rFonts w:ascii="Times New Roman" w:hAnsi="Times New Roman" w:cs="Times New Roman"/>
+          <w:sz w:val="20"/>
+          <w:szCs w:val="20"/>
+        </w:rPr>
+      </w:pPr>
+      <w:r>
+        <w:rPr>
+          <w:rFonts w:ascii="Times New Roman" w:hAnsi="Times New Roman" w:cs="Times New Roman"/>
+          <w:sz w:val="20"/>
+          <w:szCs w:val="20"/>
+        </w:rPr>
+        <w:t>Users can log into their account through the login menu by entering a valid username and password.</w:t>
+      </w:r>
+    </w:p>
+    <w:p>
+      <w:pPr>
+        <w:numPr>
+          <w:ilvl w:val="2"/>
+          <w:numId w:val="1"/>
+        </w:numPr>
+        <w:rPr>
+          <w:rFonts w:ascii="Times New Roman" w:hAnsi="Times New Roman" w:cs="Times New Roman"/>
+          <w:sz w:val="20"/>
+          <w:szCs w:val="20"/>
+        </w:rPr>
+      </w:pPr>
+      <w:r>
+        <w:rPr>
+          <w:rFonts w:ascii="Times New Roman" w:hAnsi="Times New Roman" w:cs="Times New Roman"/>
+          <w:sz w:val="20"/>
+          <w:szCs w:val="20"/>
+        </w:rPr>
+        <w:t>After a user presses login, the client will send the entered username and password to the server to be authenticated</w:t>
+      </w:r>
+    </w:p>
+    <w:p>
+      <w:pPr>
+        <w:numPr>
+          <w:ilvl w:val="2"/>
+          <w:numId w:val="1"/>
+        </w:numPr>
+        <w:rPr>
+          <w:rFonts w:ascii="Times New Roman" w:hAnsi="Times New Roman" w:cs="Times New Roman"/>
+          <w:sz w:val="20"/>
+          <w:szCs w:val="20"/>
+        </w:rPr>
+      </w:pPr>
+      <w:r>
+        <w:rPr>
+          <w:rFonts w:ascii="Times New Roman" w:hAnsi="Times New Roman" w:cs="Times New Roman"/>
+          <w:sz w:val="20"/>
+          <w:szCs w:val="20"/>
+        </w:rPr>
+        <w:t>During the authorization process the user’s role is determined.</w:t>
+      </w:r>
+    </w:p>
+    <w:p>
+      <w:pPr>
+        <w:numPr>
+          <w:ilvl w:val="2"/>
+          <w:numId w:val="1"/>
+        </w:numPr>
+        <w:rPr>
+          <w:rFonts w:ascii="Times New Roman" w:hAnsi="Times New Roman" w:cs="Times New Roman"/>
+          <w:sz w:val="20"/>
+          <w:szCs w:val="20"/>
+        </w:rPr>
+      </w:pPr>
+      <w:r>
+        <w:rPr>
+          <w:rFonts w:ascii="Times New Roman" w:hAnsi="Times New Roman" w:cs="Times New Roman"/>
+          <w:sz w:val="20"/>
+          <w:szCs w:val="20"/>
+        </w:rPr>
+        <w:t xml:space="preserve">On a successful login, the user will be directed to their respective role’s user interface </w:t>
+      </w:r>
+    </w:p>
+    <w:p>
+      <w:pPr>
+        <w:numPr>
+          <w:ilvl w:val="2"/>
+          <w:numId w:val="1"/>
+        </w:numPr>
+        <w:rPr>
+          <w:rFonts w:ascii="Times New Roman" w:hAnsi="Times New Roman" w:cs="Times New Roman"/>
+          <w:sz w:val="20"/>
+          <w:szCs w:val="20"/>
+        </w:rPr>
+      </w:pPr>
+      <w:r>
+        <w:rPr>
+          <w:rFonts w:ascii="Times New Roman" w:hAnsi="Times New Roman" w:cs="Times New Roman"/>
+          <w:sz w:val="20"/>
+          <w:szCs w:val="20"/>
+        </w:rPr>
+        <w:t>On a failed login, the user will be prompted to re-enter their username and password</w:t>
       </w:r>
     </w:p>
     <w:p>
@@ -5682,7 +5815,7 @@
           <w:sz w:val="24"/>
           <w:szCs w:val="24"/>
         </w:rPr>
-        <w:t>User Login Module Requirements:</w:t>
+        <w:t>Client Module Requirements:</w:t>
       </w:r>
     </w:p>
     <w:p>
@@ -5703,23 +5836,39 @@
           <w:sz w:val="20"/>
           <w:szCs w:val="20"/>
         </w:rPr>
-        <w:t>The Login Module (</w:t>
-      </w:r>
-      <w:r>
-        <w:rPr>
-          <w:rFonts w:ascii="Times New Roman" w:hAnsi="Times New Roman" w:cs="Times New Roman"/>
-          <w:sz w:val="20"/>
-          <w:szCs w:val="20"/>
-        </w:rPr>
-        <w:t>L</w:t>
-      </w:r>
-      <w:r>
-        <w:rPr>
-          <w:rFonts w:ascii="Times New Roman" w:hAnsi="Times New Roman" w:cs="Times New Roman"/>
-          <w:sz w:val="20"/>
-          <w:szCs w:val="20"/>
-        </w:rPr>
-        <w:t>M) contains a login menu to allow users to log into the communications app. This menu is displayed upon loading the client, (?) unless the server notes the user as currently logged in on that client.</w:t>
+        <w:t>The C</w:t>
+      </w:r>
+      <w:r>
+        <w:rPr>
+          <w:rFonts w:ascii="Times New Roman" w:hAnsi="Times New Roman" w:cs="Times New Roman"/>
+          <w:sz w:val="20"/>
+          <w:szCs w:val="20"/>
+        </w:rPr>
+        <w:t xml:space="preserve">lient </w:t>
+      </w:r>
+      <w:r>
+        <w:rPr>
+          <w:rFonts w:ascii="Times New Roman" w:hAnsi="Times New Roman" w:cs="Times New Roman"/>
+          <w:sz w:val="20"/>
+          <w:szCs w:val="20"/>
+        </w:rPr>
+        <w:t>M</w:t>
+      </w:r>
+      <w:r>
+        <w:rPr>
+          <w:rFonts w:ascii="Times New Roman" w:hAnsi="Times New Roman" w:cs="Times New Roman"/>
+          <w:sz w:val="20"/>
+          <w:szCs w:val="20"/>
+        </w:rPr>
+        <w:t>odule (CM)</w:t>
+      </w:r>
+      <w:r>
+        <w:rPr>
+          <w:rFonts w:ascii="Times New Roman" w:hAnsi="Times New Roman" w:cs="Times New Roman"/>
+          <w:sz w:val="20"/>
+          <w:szCs w:val="20"/>
+        </w:rPr>
+        <w:t xml:space="preserve"> contains a communications menu to allow users to communicate with other users. This menu is displayed upon loading the client</w:t>
       </w:r>
     </w:p>
     <w:p>
@@ -5740,7 +5889,7 @@
           <w:sz w:val="20"/>
           <w:szCs w:val="20"/>
         </w:rPr>
-        <w:t>Users can log into their account through the login menu by entering a valid username and password.</w:t>
+        <w:t>The CM must be able to secure a connection to send and receive signals from the CSM</w:t>
       </w:r>
     </w:p>
     <w:p>
@@ -5761,7 +5910,23 @@
           <w:sz w:val="20"/>
           <w:szCs w:val="20"/>
         </w:rPr>
-        <w:t>After a user presses login, the client will send the entered username and password to the server to be authenticated</w:t>
+        <w:t>The communications menu contains a list of</w:t>
+      </w:r>
+      <w:r>
+        <w:rPr>
+          <w:rFonts w:ascii="Times New Roman" w:hAnsi="Times New Roman" w:cs="Times New Roman"/>
+          <w:sz w:val="20"/>
+          <w:szCs w:val="20"/>
+        </w:rPr>
+        <w:t xml:space="preserve"> chats the user is </w:t>
+      </w:r>
+      <w:r>
+        <w:rPr>
+          <w:rFonts w:ascii="Times New Roman" w:hAnsi="Times New Roman" w:cs="Times New Roman"/>
+          <w:sz w:val="20"/>
+          <w:szCs w:val="20"/>
+        </w:rPr>
+        <w:t>a part of</w:t>
       </w:r>
     </w:p>
     <w:p>
@@ -5782,7 +5947,7 @@
           <w:sz w:val="20"/>
           <w:szCs w:val="20"/>
         </w:rPr>
-        <w:t>During the authorization process the user’s role is determined.</w:t>
+        <w:t>The user can select any chat in this list to open it</w:t>
       </w:r>
     </w:p>
     <w:p>
@@ -5803,7 +5968,7 @@
           <w:sz w:val="20"/>
           <w:szCs w:val="20"/>
         </w:rPr>
-        <w:t xml:space="preserve">On a successful login, the user will be directed to their respective role’s user interface </w:t>
+        <w:t>Each chat in this list indicates if it contains unread messages</w:t>
       </w:r>
     </w:p>
     <w:p>
@@ -5824,7 +5989,39 @@
           <w:sz w:val="20"/>
           <w:szCs w:val="20"/>
         </w:rPr>
-        <w:t>On a failed login, the user will be prompted to re-enter their username and password</w:t>
+        <w:t>The list is ordered from the one with the</w:t>
+      </w:r>
+      <w:r>
+        <w:rPr>
+          <w:rFonts w:ascii="Times New Roman" w:hAnsi="Times New Roman" w:cs="Times New Roman"/>
+          <w:sz w:val="20"/>
+          <w:szCs w:val="20"/>
+        </w:rPr>
+        <w:t xml:space="preserve"> most recent date contained in the most recent message or creation date</w:t>
+      </w:r>
+      <w:r>
+        <w:rPr>
+          <w:rFonts w:ascii="Times New Roman" w:hAnsi="Times New Roman" w:cs="Times New Roman"/>
+          <w:sz w:val="20"/>
+          <w:szCs w:val="20"/>
+        </w:rPr>
+        <w:t xml:space="preserve">, to the one </w:t>
+      </w:r>
+      <w:r>
+        <w:rPr>
+          <w:rFonts w:ascii="Times New Roman" w:hAnsi="Times New Roman" w:cs="Times New Roman"/>
+          <w:sz w:val="20"/>
+          <w:szCs w:val="20"/>
+        </w:rPr>
+        <w:t>that is the oldest</w:t>
+      </w:r>
+      <w:r>
+        <w:rPr>
+          <w:rFonts w:ascii="Times New Roman" w:hAnsi="Times New Roman" w:cs="Times New Roman"/>
+          <w:sz w:val="20"/>
+          <w:szCs w:val="20"/>
+        </w:rPr>
+        <w:t>.</w:t>
       </w:r>
     </w:p>
     <w:p>
@@ -5845,28 +6042,7 @@
           <w:sz w:val="20"/>
           <w:szCs w:val="20"/>
         </w:rPr>
-        <w:t>(?) The user can select remember this username. After a successful login, the login menu will contain the username by default, with the checkbox already checked</w:t>
-      </w:r>
-    </w:p>
-    <w:p>
-      <w:pPr>
-        <w:numPr>
-          <w:ilvl w:val="1"/>
-          <w:numId w:val="1"/>
-        </w:numPr>
-        <w:rPr>
-          <w:rFonts w:ascii="Times New Roman" w:eastAsia="Times New Roman" w:hAnsi="Times New Roman" w:cs="Times New Roman"/>
-        </w:rPr>
-      </w:pPr>
-      <w:r>
-        <w:rPr>
-          <w:rFonts w:ascii="Times New Roman" w:eastAsia="Times New Roman" w:hAnsi="Times New Roman" w:cs="Times New Roman"/>
-          <w:b/>
-          <w:bCs/>
-          <w:sz w:val="24"/>
-          <w:szCs w:val="24"/>
-        </w:rPr>
-        <w:t>Client Module Requirements:</w:t>
+        <w:t>The server can signal to the client if this list needs to be updated, and in turn the client will update it, displaying the most up to date information</w:t>
       </w:r>
     </w:p>
     <w:p>
@@ -5887,39 +6063,7 @@
           <w:sz w:val="20"/>
           <w:szCs w:val="20"/>
         </w:rPr>
-        <w:t>The C</w:t>
-      </w:r>
-      <w:r>
-        <w:rPr>
-          <w:rFonts w:ascii="Times New Roman" w:hAnsi="Times New Roman" w:cs="Times New Roman"/>
-          <w:sz w:val="20"/>
-          <w:szCs w:val="20"/>
-        </w:rPr>
-        <w:t xml:space="preserve">lient </w:t>
-      </w:r>
-      <w:r>
-        <w:rPr>
-          <w:rFonts w:ascii="Times New Roman" w:hAnsi="Times New Roman" w:cs="Times New Roman"/>
-          <w:sz w:val="20"/>
-          <w:szCs w:val="20"/>
-        </w:rPr>
-        <w:t>M</w:t>
-      </w:r>
-      <w:r>
-        <w:rPr>
-          <w:rFonts w:ascii="Times New Roman" w:hAnsi="Times New Roman" w:cs="Times New Roman"/>
-          <w:sz w:val="20"/>
-          <w:szCs w:val="20"/>
-        </w:rPr>
-        <w:t>odule (CM)</w:t>
-      </w:r>
-      <w:r>
-        <w:rPr>
-          <w:rFonts w:ascii="Times New Roman" w:hAnsi="Times New Roman" w:cs="Times New Roman"/>
-          <w:sz w:val="20"/>
-          <w:szCs w:val="20"/>
-        </w:rPr>
-        <w:t xml:space="preserve"> contains a communications menu to allow users to communicate with other users. This menu is displayed upon loading the client (?) only when the server notes the user as currently logged in on that client.</w:t>
+        <w:t>The communications menu contains a new chat button, which creates a chat between you, and the users specified.</w:t>
       </w:r>
     </w:p>
     <w:p>
@@ -5940,7 +6084,31 @@
           <w:sz w:val="20"/>
           <w:szCs w:val="20"/>
         </w:rPr>
-        <w:t>The CM must be able to secure a connection to send and receive signals from the CSM</w:t>
+        <w:t>Only inputting 1 user</w:t>
+      </w:r>
+      <w:r>
+        <w:rPr>
+          <w:rFonts w:ascii="Times New Roman" w:hAnsi="Times New Roman" w:cs="Times New Roman"/>
+          <w:sz w:val="20"/>
+          <w:szCs w:val="20"/>
+        </w:rPr>
+        <w:t>name</w:t>
+      </w:r>
+      <w:r>
+        <w:rPr>
+          <w:rFonts w:ascii="Times New Roman" w:hAnsi="Times New Roman" w:cs="Times New Roman"/>
+          <w:sz w:val="20"/>
+          <w:szCs w:val="20"/>
+        </w:rPr>
+        <w:t xml:space="preserve"> </w:t>
+      </w:r>
+      <w:r>
+        <w:rPr>
+          <w:rFonts w:ascii="Times New Roman" w:hAnsi="Times New Roman" w:cs="Times New Roman"/>
+          <w:sz w:val="20"/>
+          <w:szCs w:val="20"/>
+        </w:rPr>
+        <w:t>defaults the chat’s designation as a private message chat. A user can select for the chat to be a group chat, designating it as a group message chat</w:t>
       </w:r>
     </w:p>
     <w:p>
@@ -5961,23 +6129,7 @@
           <w:sz w:val="20"/>
           <w:szCs w:val="20"/>
         </w:rPr>
-        <w:t>The communications menu contains a list of</w:t>
-      </w:r>
-      <w:r>
-        <w:rPr>
-          <w:rFonts w:ascii="Times New Roman" w:hAnsi="Times New Roman" w:cs="Times New Roman"/>
-          <w:sz w:val="20"/>
-          <w:szCs w:val="20"/>
-        </w:rPr>
-        <w:t xml:space="preserve"> chats the user is </w:t>
-      </w:r>
-      <w:r>
-        <w:rPr>
-          <w:rFonts w:ascii="Times New Roman" w:hAnsi="Times New Roman" w:cs="Times New Roman"/>
-          <w:sz w:val="20"/>
-          <w:szCs w:val="20"/>
-        </w:rPr>
-        <w:t>a part of</w:t>
+        <w:t>Inputting multiple usernames defaults the chat’s designation as a group message chat. This cannot be designated as anything other than a group message chat</w:t>
       </w:r>
     </w:p>
     <w:p>
@@ -5998,7 +6150,7 @@
           <w:sz w:val="20"/>
           <w:szCs w:val="20"/>
         </w:rPr>
-        <w:t>The user can select any chat in this list to open it (see section 3.1.2.3)</w:t>
+        <w:t>Upon creating the new chat, the client will send the request to the server, creating the chat.</w:t>
       </w:r>
     </w:p>
     <w:p>
@@ -6019,7 +6171,15 @@
           <w:sz w:val="20"/>
           <w:szCs w:val="20"/>
         </w:rPr>
-        <w:t>Each chat in this list indicates if it contains unread messages</w:t>
+        <w:t xml:space="preserve">The communications menu </w:t>
+      </w:r>
+      <w:r>
+        <w:rPr>
+          <w:rFonts w:ascii="Times New Roman" w:hAnsi="Times New Roman" w:cs="Times New Roman"/>
+          <w:sz w:val="20"/>
+          <w:szCs w:val="20"/>
+        </w:rPr>
+        <w:t>contains a profile button, displaying the user’s username, and a button to logout of the account</w:t>
       </w:r>
     </w:p>
     <w:p>
@@ -6040,39 +6200,7 @@
           <w:sz w:val="20"/>
           <w:szCs w:val="20"/>
         </w:rPr>
-        <w:t>(?) The list is ordered from the one with the</w:t>
-      </w:r>
-      <w:r>
-        <w:rPr>
-          <w:rFonts w:ascii="Times New Roman" w:hAnsi="Times New Roman" w:cs="Times New Roman"/>
-          <w:sz w:val="20"/>
-          <w:szCs w:val="20"/>
-        </w:rPr>
-        <w:t xml:space="preserve"> most recent date contained in the most recent message or creation date</w:t>
-      </w:r>
-      <w:r>
-        <w:rPr>
-          <w:rFonts w:ascii="Times New Roman" w:hAnsi="Times New Roman" w:cs="Times New Roman"/>
-          <w:sz w:val="20"/>
-          <w:szCs w:val="20"/>
-        </w:rPr>
-        <w:t xml:space="preserve">, to the one </w:t>
-      </w:r>
-      <w:r>
-        <w:rPr>
-          <w:rFonts w:ascii="Times New Roman" w:hAnsi="Times New Roman" w:cs="Times New Roman"/>
-          <w:sz w:val="20"/>
-          <w:szCs w:val="20"/>
-        </w:rPr>
-        <w:t>that is the oldest</w:t>
-      </w:r>
-      <w:r>
-        <w:rPr>
-          <w:rFonts w:ascii="Times New Roman" w:hAnsi="Times New Roman" w:cs="Times New Roman"/>
-          <w:sz w:val="20"/>
-          <w:szCs w:val="20"/>
-        </w:rPr>
-        <w:t>. Chats can be pinned to the top of this list</w:t>
+        <w:t>The logout button re-directs to the login menu upon being selected</w:t>
       </w:r>
     </w:p>
     <w:p>
@@ -6093,7 +6221,7 @@
           <w:sz w:val="20"/>
           <w:szCs w:val="20"/>
         </w:rPr>
-        <w:t>The server can signal to the client if this list needs to be updated, and in turn the client will update it, displaying the most up to date information</w:t>
+        <w:t>The communications menu contains a chat menu, displaying a specific chat, selected from the list of chats the user is involved in</w:t>
       </w:r>
     </w:p>
     <w:p>
@@ -6114,7 +6242,7 @@
           <w:sz w:val="20"/>
           <w:szCs w:val="20"/>
         </w:rPr>
-        <w:t>The communications menu contains a new chat button, which creates a chat between you, and the users specified.</w:t>
+        <w:t>The chat selected must be designated as a private or a group chat.</w:t>
       </w:r>
     </w:p>
     <w:p>
@@ -6135,31 +6263,7 @@
           <w:sz w:val="20"/>
           <w:szCs w:val="20"/>
         </w:rPr>
-        <w:t>Only inputting 1 user</w:t>
-      </w:r>
-      <w:r>
-        <w:rPr>
-          <w:rFonts w:ascii="Times New Roman" w:hAnsi="Times New Roman" w:cs="Times New Roman"/>
-          <w:sz w:val="20"/>
-          <w:szCs w:val="20"/>
-        </w:rPr>
-        <w:t>name</w:t>
-      </w:r>
-      <w:r>
-        <w:rPr>
-          <w:rFonts w:ascii="Times New Roman" w:hAnsi="Times New Roman" w:cs="Times New Roman"/>
-          <w:sz w:val="20"/>
-          <w:szCs w:val="20"/>
-        </w:rPr>
-        <w:t xml:space="preserve"> </w:t>
-      </w:r>
-      <w:r>
-        <w:rPr>
-          <w:rFonts w:ascii="Times New Roman" w:hAnsi="Times New Roman" w:cs="Times New Roman"/>
-          <w:sz w:val="20"/>
-          <w:szCs w:val="20"/>
-        </w:rPr>
-        <w:t>defaults the chat’s designation as a private message chat. A user can select for the chat to be a group chat, designating it as a group message chat</w:t>
+        <w:t>In this menu, the user can see a scrollable view of all messages previously sent in the chat.</w:t>
       </w:r>
     </w:p>
     <w:p>
@@ -6180,7 +6284,7 @@
           <w:sz w:val="20"/>
           <w:szCs w:val="20"/>
         </w:rPr>
-        <w:t>Inputting multiple usernames defaults the chat’s designation as a group message chat. This cannot be designated as anything other than a group message chat</w:t>
+        <w:t>Each message displays the username of the sender, and the message sent</w:t>
       </w:r>
     </w:p>
     <w:p>
@@ -6201,7 +6305,7 @@
           <w:sz w:val="20"/>
           <w:szCs w:val="20"/>
         </w:rPr>
-        <w:t>Upon creating the new chat, the client will send the request to the server, creating the chat.</w:t>
+        <w:t>Messages sent while the user was offline are indicated, and the client signals to the server that the user has seen these messages</w:t>
       </w:r>
     </w:p>
     <w:p>
@@ -6222,15 +6326,7 @@
           <w:sz w:val="20"/>
           <w:szCs w:val="20"/>
         </w:rPr>
-        <w:t xml:space="preserve">The communications menu </w:t>
-      </w:r>
-      <w:r>
-        <w:rPr>
-          <w:rFonts w:ascii="Times New Roman" w:hAnsi="Times New Roman" w:cs="Times New Roman"/>
-          <w:sz w:val="20"/>
-          <w:szCs w:val="20"/>
-        </w:rPr>
-        <w:t>contains a profile button, displaying the user’s username, and a button to logout of the account</w:t>
+        <w:t>Whenever a new message is sent from the server, this view is updated, displaying the new message at the forefront</w:t>
       </w:r>
     </w:p>
     <w:p>
@@ -6251,7 +6347,8 @@
           <w:sz w:val="20"/>
           <w:szCs w:val="20"/>
         </w:rPr>
-        <w:t>The logout button re-directs to the login menu upon being selected</w:t>
+        <w:lastRenderedPageBreak/>
+        <w:t>The chat menu contains a message box allowing the user to write a message, and a button to send it.</w:t>
       </w:r>
     </w:p>
     <w:p>
@@ -6272,7 +6369,31 @@
           <w:sz w:val="20"/>
           <w:szCs w:val="20"/>
         </w:rPr>
-        <w:t>The communications menu contains a chat menu, displaying a specific chat, selected from the list of chats the user is involved in (see section 3.1.2.2.1)</w:t>
+        <w:t xml:space="preserve">When a message is sent, it is sent to the server to update the client of </w:t>
+      </w:r>
+      <w:r>
+        <w:rPr>
+          <w:rFonts w:ascii="Times New Roman" w:hAnsi="Times New Roman" w:cs="Times New Roman"/>
+          <w:sz w:val="20"/>
+          <w:szCs w:val="20"/>
+        </w:rPr>
+        <w:t xml:space="preserve">online </w:t>
+      </w:r>
+      <w:r>
+        <w:rPr>
+          <w:rFonts w:ascii="Times New Roman" w:hAnsi="Times New Roman" w:cs="Times New Roman"/>
+          <w:sz w:val="20"/>
+          <w:szCs w:val="20"/>
+        </w:rPr>
+        <w:t xml:space="preserve">users </w:t>
+      </w:r>
+      <w:r>
+        <w:rPr>
+          <w:rFonts w:ascii="Times New Roman" w:hAnsi="Times New Roman" w:cs="Times New Roman"/>
+          <w:sz w:val="20"/>
+          <w:szCs w:val="20"/>
+        </w:rPr>
+        <w:t>involved in the chat</w:t>
       </w:r>
     </w:p>
     <w:p>
@@ -6293,7 +6414,7 @@
           <w:sz w:val="20"/>
           <w:szCs w:val="20"/>
         </w:rPr>
-        <w:t>The chat selected must be designated as a private or a group chat.</w:t>
+        <w:t>When a message is sent, the date and time stamp at that moment is sent to the server ensure messages are displayed in order</w:t>
       </w:r>
     </w:p>
     <w:p>
@@ -6314,8 +6435,7 @@
           <w:sz w:val="20"/>
           <w:szCs w:val="20"/>
         </w:rPr>
-        <w:lastRenderedPageBreak/>
-        <w:t>In this menu, the user can see a scrollable view of all messages previously sent in the chat.</w:t>
+        <w:t>The chat menu displays all users involved with the chat, also indicating if this is a group chat or private chat</w:t>
       </w:r>
     </w:p>
     <w:p>
@@ -6336,7 +6456,7 @@
           <w:sz w:val="20"/>
           <w:szCs w:val="20"/>
         </w:rPr>
-        <w:t>Each message displays the username of the sender, and the message sent</w:t>
+        <w:t>The group chat creator’s view of the group chat displays an invite, kick, and delete group chat button</w:t>
       </w:r>
     </w:p>
     <w:p>
@@ -6357,7 +6477,31 @@
           <w:sz w:val="20"/>
           <w:szCs w:val="20"/>
         </w:rPr>
-        <w:t>Messages sent while the user was offline are indicated, and the client signals to the server that the user has seen these messages</w:t>
+        <w:t>After pressing the invite button, t</w:t>
+      </w:r>
+      <w:r>
+        <w:rPr>
+          <w:rFonts w:ascii="Times New Roman" w:hAnsi="Times New Roman" w:cs="Times New Roman"/>
+          <w:sz w:val="20"/>
+          <w:szCs w:val="20"/>
+        </w:rPr>
+        <w:t xml:space="preserve">he </w:t>
+      </w:r>
+      <w:r>
+        <w:rPr>
+          <w:rFonts w:ascii="Times New Roman" w:hAnsi="Times New Roman" w:cs="Times New Roman"/>
+          <w:sz w:val="20"/>
+          <w:szCs w:val="20"/>
+        </w:rPr>
+        <w:t>group chat creator</w:t>
+      </w:r>
+      <w:r>
+        <w:rPr>
+          <w:rFonts w:ascii="Times New Roman" w:hAnsi="Times New Roman" w:cs="Times New Roman"/>
+          <w:sz w:val="20"/>
+          <w:szCs w:val="20"/>
+        </w:rPr>
+        <w:t xml:space="preserve"> can enter in usernames here to invite users to the chat.</w:t>
       </w:r>
     </w:p>
     <w:p>
@@ -6378,7 +6522,7 @@
           <w:sz w:val="20"/>
           <w:szCs w:val="20"/>
         </w:rPr>
-        <w:t>Whenever a new message is sent from the server, this view is updated, displaying the new message at the forefront</w:t>
+        <w:t>After pressing the kick button, the group chat creator is prompted to select the user to kick</w:t>
       </w:r>
     </w:p>
     <w:p>
@@ -6399,7 +6543,7 @@
           <w:sz w:val="20"/>
           <w:szCs w:val="20"/>
         </w:rPr>
-        <w:t>The chat menu contains a message box allowing the user to write a message, and a button to send it.</w:t>
+        <w:t>After pressing the delete group chat button, the group chat creator is prompted to confirm the action, and the group chat is deleted</w:t>
       </w:r>
     </w:p>
     <w:p>
@@ -6420,102 +6564,25 @@
           <w:sz w:val="20"/>
           <w:szCs w:val="20"/>
         </w:rPr>
-        <w:t xml:space="preserve">When a message is sent, it is sent to the server to update the client of </w:t>
-      </w:r>
-      <w:r>
-        <w:rPr>
-          <w:rFonts w:ascii="Times New Roman" w:hAnsi="Times New Roman" w:cs="Times New Roman"/>
-          <w:sz w:val="20"/>
-          <w:szCs w:val="20"/>
-        </w:rPr>
-        <w:t xml:space="preserve">online </w:t>
-      </w:r>
-      <w:r>
-        <w:rPr>
-          <w:rFonts w:ascii="Times New Roman" w:hAnsi="Times New Roman" w:cs="Times New Roman"/>
-          <w:sz w:val="20"/>
-          <w:szCs w:val="20"/>
-        </w:rPr>
-        <w:t xml:space="preserve">users </w:t>
-      </w:r>
-      <w:r>
-        <w:rPr>
-          <w:rFonts w:ascii="Times New Roman" w:hAnsi="Times New Roman" w:cs="Times New Roman"/>
-          <w:sz w:val="20"/>
-          <w:szCs w:val="20"/>
-        </w:rPr>
-        <w:t>involved in the chat</w:t>
-      </w:r>
-    </w:p>
-    <w:p>
-      <w:pPr>
-        <w:numPr>
-          <w:ilvl w:val="2"/>
-          <w:numId w:val="1"/>
-        </w:numPr>
-        <w:rPr>
-          <w:rFonts w:ascii="Times New Roman" w:hAnsi="Times New Roman" w:cs="Times New Roman"/>
-          <w:sz w:val="20"/>
-          <w:szCs w:val="20"/>
-        </w:rPr>
-      </w:pPr>
-      <w:r>
-        <w:rPr>
-          <w:rFonts w:ascii="Times New Roman" w:hAnsi="Times New Roman" w:cs="Times New Roman"/>
-          <w:sz w:val="20"/>
-          <w:szCs w:val="20"/>
-        </w:rPr>
-        <w:t>When a message is sent, the date and time stamp at that moment is sent to the server ensure messages are displayed in order</w:t>
-      </w:r>
-      <w:r>
-        <w:rPr>
-          <w:rFonts w:ascii="Times New Roman" w:hAnsi="Times New Roman" w:cs="Times New Roman"/>
-          <w:sz w:val="20"/>
-          <w:szCs w:val="20"/>
-        </w:rPr>
-        <w:t xml:space="preserve"> (? Should this be a time stamp when the message is sent or the server receives it?)</w:t>
-      </w:r>
-    </w:p>
-    <w:p>
-      <w:pPr>
-        <w:numPr>
-          <w:ilvl w:val="2"/>
-          <w:numId w:val="1"/>
-        </w:numPr>
-        <w:rPr>
-          <w:rFonts w:ascii="Times New Roman" w:hAnsi="Times New Roman" w:cs="Times New Roman"/>
-          <w:sz w:val="20"/>
-          <w:szCs w:val="20"/>
-        </w:rPr>
-      </w:pPr>
-      <w:r>
-        <w:rPr>
-          <w:rFonts w:ascii="Times New Roman" w:hAnsi="Times New Roman" w:cs="Times New Roman"/>
-          <w:sz w:val="20"/>
-          <w:szCs w:val="20"/>
-        </w:rPr>
-        <w:t>The chat menu displays all users involved with the chat, also indicating if this is a group chat or private chat</w:t>
-      </w:r>
-    </w:p>
-    <w:p>
-      <w:pPr>
-        <w:numPr>
-          <w:ilvl w:val="2"/>
-          <w:numId w:val="1"/>
-        </w:numPr>
-        <w:rPr>
-          <w:rFonts w:ascii="Times New Roman" w:hAnsi="Times New Roman" w:cs="Times New Roman"/>
-          <w:sz w:val="20"/>
-          <w:szCs w:val="20"/>
-        </w:rPr>
-      </w:pPr>
-      <w:r>
-        <w:rPr>
-          <w:rFonts w:ascii="Times New Roman" w:hAnsi="Times New Roman" w:cs="Times New Roman"/>
-          <w:sz w:val="20"/>
-          <w:szCs w:val="20"/>
-        </w:rPr>
-        <w:t>Group chats have an extra button available to the chat creator to invite users. The user can enter in usernames here to invite users to the chat. Upon finishing, the client signals to the server to update the group chat.</w:t>
+        <w:t xml:space="preserve">A deleted group chat </w:t>
+      </w:r>
+      <w:proofErr w:type="gramStart"/>
+      <w:r>
+        <w:rPr>
+          <w:rFonts w:ascii="Times New Roman" w:hAnsi="Times New Roman" w:cs="Times New Roman"/>
+          <w:sz w:val="20"/>
+          <w:szCs w:val="20"/>
+        </w:rPr>
+        <w:t>is still has</w:t>
+      </w:r>
+      <w:proofErr w:type="gramEnd"/>
+      <w:r>
+        <w:rPr>
+          <w:rFonts w:ascii="Times New Roman" w:hAnsi="Times New Roman" w:cs="Times New Roman"/>
+          <w:sz w:val="20"/>
+          <w:szCs w:val="20"/>
+        </w:rPr>
+        <w:t xml:space="preserve"> its messages logged, but must not be displayed to the related users</w:t>
       </w:r>
     </w:p>
     <w:p>
@@ -6563,10 +6630,11 @@
       <w:r>
         <w:rPr>
           <w:rFonts w:ascii="Times New Roman" w:hAnsi="Times New Roman" w:cs="Times New Roman"/>
-          <w:sz w:val="20"/>
-          <w:szCs w:val="20"/>
-        </w:rPr>
-        <w:t xml:space="preserve">The IT Module contains a login menu that is displayed upon opening the application, unless the server indicates the IT user is already logged in. </w:t>
+          <w:color w:val="000000"/>
+          <w:sz w:val="20"/>
+          <w:szCs w:val="20"/>
+        </w:rPr>
+        <w:t>The IT Module supports all features available in the Client Module (CM).</w:t>
       </w:r>
     </w:p>
     <w:p>
@@ -6587,7 +6655,7 @@
           <w:sz w:val="20"/>
           <w:szCs w:val="20"/>
         </w:rPr>
-        <w:t>The IT user can log in using a valid IT username and password</w:t>
+        <w:t>The IT module provided an Audit view that allows the IT user to review other users’ conversation in read-only mode</w:t>
       </w:r>
     </w:p>
     <w:p>
@@ -6608,7 +6676,7 @@
           <w:sz w:val="20"/>
           <w:szCs w:val="20"/>
         </w:rPr>
-        <w:t>On successful IT login, the IT user is directed to the IT audit menu</w:t>
+        <w:t>When Change View is selected, the application displays a User List screen</w:t>
       </w:r>
     </w:p>
     <w:p>
@@ -6629,7 +6697,7 @@
           <w:sz w:val="20"/>
           <w:szCs w:val="20"/>
         </w:rPr>
-        <w:t>On a failed login, the IT user is prompted to re-enter their username and password</w:t>
+        <w:t>The user list screen displays a list of available users retrieved from the server</w:t>
       </w:r>
     </w:p>
     <w:p>
@@ -6647,11 +6715,10 @@
       <w:r>
         <w:rPr>
           <w:rFonts w:ascii="Times New Roman" w:hAnsi="Times New Roman" w:cs="Times New Roman"/>
-          <w:color w:val="000000"/>
-          <w:sz w:val="20"/>
-          <w:szCs w:val="20"/>
-        </w:rPr>
-        <w:t>The IT Module supports all features available in the Client Module (CM).</w:t>
+          <w:sz w:val="20"/>
+          <w:szCs w:val="20"/>
+        </w:rPr>
+        <w:t xml:space="preserve">The user list screen includes a search bar that allows the IT user to search users by username </w:t>
       </w:r>
     </w:p>
     <w:p>
@@ -6669,11 +6736,10 @@
       <w:r>
         <w:rPr>
           <w:rFonts w:ascii="Times New Roman" w:hAnsi="Times New Roman" w:cs="Times New Roman"/>
-          <w:color w:val="000000"/>
-          <w:sz w:val="20"/>
-          <w:szCs w:val="20"/>
-        </w:rPr>
-        <w:t>Each chat in the standard chat list indicates whether it contains unread messages</w:t>
+          <w:sz w:val="20"/>
+          <w:szCs w:val="20"/>
+        </w:rPr>
+        <w:t>The IT user can select user either by searching and selecting from results or selecting directly from the displayed list.</w:t>
       </w:r>
     </w:p>
     <w:p>
@@ -6691,11 +6757,10 @@
       <w:r>
         <w:rPr>
           <w:rFonts w:ascii="Times New Roman" w:hAnsi="Times New Roman" w:cs="Times New Roman"/>
-          <w:color w:val="000000"/>
-          <w:sz w:val="20"/>
-          <w:szCs w:val="20"/>
-        </w:rPr>
-        <w:t>The chat list is ordered from most recent activity to oldest activity</w:t>
+          <w:sz w:val="20"/>
+          <w:szCs w:val="20"/>
+        </w:rPr>
+        <w:t>When the IT user selects a user, the application enters Audit Mode for that selected user and displays the selected user Chat List</w:t>
       </w:r>
     </w:p>
     <w:p>
@@ -6713,11 +6778,10 @@
       <w:r>
         <w:rPr>
           <w:rFonts w:ascii="Times New Roman" w:hAnsi="Times New Roman" w:cs="Times New Roman"/>
-          <w:color w:val="000000"/>
-          <w:sz w:val="20"/>
-          <w:szCs w:val="20"/>
-        </w:rPr>
-        <w:t>The IT user can create a new chat by entering one or more usernames</w:t>
+          <w:sz w:val="20"/>
+          <w:szCs w:val="20"/>
+        </w:rPr>
+        <w:t>In Audit Mode, when a chat is opened, the IT user can view the full message history for that chat in a scrollable view.</w:t>
       </w:r>
     </w:p>
     <w:p>
@@ -6735,11 +6799,10 @@
       <w:r>
         <w:rPr>
           <w:rFonts w:ascii="Times New Roman" w:hAnsi="Times New Roman" w:cs="Times New Roman"/>
-          <w:color w:val="000000"/>
-          <w:sz w:val="20"/>
-          <w:szCs w:val="20"/>
-        </w:rPr>
-        <w:t>If exactly one username is entered, the chat defaults to a private message chat unless the IT user designates it as a group chat</w:t>
+          <w:sz w:val="20"/>
+          <w:szCs w:val="20"/>
+        </w:rPr>
+        <w:t>The IT user can view message from both private chats and group chats</w:t>
       </w:r>
     </w:p>
     <w:p>
@@ -6757,11 +6820,10 @@
       <w:r>
         <w:rPr>
           <w:rFonts w:ascii="Times New Roman" w:hAnsi="Times New Roman" w:cs="Times New Roman"/>
-          <w:color w:val="000000"/>
-          <w:sz w:val="20"/>
-          <w:szCs w:val="20"/>
-        </w:rPr>
-        <w:t>If multiple usernames are entered, the chat defaults to a group chat and cannot be designated as a private message chat</w:t>
+          <w:sz w:val="20"/>
+          <w:szCs w:val="20"/>
+        </w:rPr>
+        <w:t>In Audit Mode, the IT user is not permitted to send, delete, or edit any chats</w:t>
       </w:r>
     </w:p>
     <w:p>
@@ -6779,11 +6841,10 @@
       <w:r>
         <w:rPr>
           <w:rFonts w:ascii="Times New Roman" w:hAnsi="Times New Roman" w:cs="Times New Roman"/>
-          <w:color w:val="000000"/>
-          <w:sz w:val="20"/>
-          <w:szCs w:val="20"/>
-        </w:rPr>
-        <w:t>Upon creating a new chat, the IT client sends the request to the server, and the server creates the chat</w:t>
+          <w:sz w:val="20"/>
+          <w:szCs w:val="20"/>
+        </w:rPr>
+        <w:t>In Audit Mode, the application visually indicates that the IT user is viewing chats as another user</w:t>
       </w:r>
     </w:p>
     <w:p>
@@ -6801,11 +6862,10 @@
       <w:r>
         <w:rPr>
           <w:rFonts w:ascii="Times New Roman" w:hAnsi="Times New Roman" w:cs="Times New Roman"/>
-          <w:color w:val="000000"/>
-          <w:sz w:val="20"/>
-          <w:szCs w:val="20"/>
-        </w:rPr>
-        <w:t>The IT user can open any chat they are involved in and view messages in a scrollable view</w:t>
+          <w:sz w:val="20"/>
+          <w:szCs w:val="20"/>
+        </w:rPr>
+        <w:t xml:space="preserve">In Audit Mode, there is a button to export the displayed chat. This saves the chat log locally to the IT user as a file </w:t>
       </w:r>
     </w:p>
     <w:p>
@@ -6823,353 +6883,18 @@
       <w:r>
         <w:rPr>
           <w:rFonts w:ascii="Times New Roman" w:hAnsi="Times New Roman" w:cs="Times New Roman"/>
-          <w:color w:val="000000"/>
-          <w:sz w:val="20"/>
-          <w:szCs w:val="20"/>
-        </w:rPr>
-        <w:t>The IT user can send messages in any chat they are involved in using a message box and send button</w:t>
-      </w:r>
-    </w:p>
-    <w:p>
-      <w:pPr>
-        <w:numPr>
-          <w:ilvl w:val="2"/>
-          <w:numId w:val="1"/>
-        </w:numPr>
-        <w:rPr>
-          <w:rFonts w:ascii="Times New Roman" w:hAnsi="Times New Roman" w:cs="Times New Roman"/>
-          <w:sz w:val="20"/>
-          <w:szCs w:val="20"/>
-        </w:rPr>
-      </w:pPr>
-      <w:r>
-        <w:rPr>
-          <w:rFonts w:ascii="Times New Roman" w:hAnsi="Times New Roman" w:cs="Times New Roman"/>
-          <w:color w:val="000000"/>
-          <w:sz w:val="20"/>
-          <w:szCs w:val="20"/>
-        </w:rPr>
-        <w:t>When the IT user sends a message, the message is sending t the server and delivered to online users in that chat</w:t>
-      </w:r>
-    </w:p>
-    <w:p>
-      <w:pPr>
-        <w:numPr>
-          <w:ilvl w:val="2"/>
-          <w:numId w:val="1"/>
-        </w:numPr>
-        <w:rPr>
-          <w:rFonts w:ascii="Times New Roman" w:hAnsi="Times New Roman" w:cs="Times New Roman"/>
-          <w:sz w:val="20"/>
-          <w:szCs w:val="20"/>
-        </w:rPr>
-      </w:pPr>
-      <w:r>
-        <w:rPr>
-          <w:rFonts w:ascii="Times New Roman" w:hAnsi="Times New Roman" w:cs="Times New Roman"/>
-          <w:color w:val="000000"/>
-          <w:sz w:val="20"/>
-          <w:szCs w:val="20"/>
-        </w:rPr>
-        <w:t>The chat menu displays the users involved in the chat and indicates whether the chat is private or group</w:t>
-      </w:r>
-    </w:p>
-    <w:p>
-      <w:pPr>
-        <w:numPr>
-          <w:ilvl w:val="2"/>
-          <w:numId w:val="1"/>
-        </w:numPr>
-        <w:rPr>
-          <w:rFonts w:ascii="Times New Roman" w:hAnsi="Times New Roman" w:cs="Times New Roman"/>
-          <w:sz w:val="20"/>
-          <w:szCs w:val="20"/>
-        </w:rPr>
-      </w:pPr>
-      <w:r>
-        <w:rPr>
-          <w:rFonts w:ascii="Times New Roman" w:hAnsi="Times New Roman" w:cs="Times New Roman"/>
-          <w:color w:val="000000"/>
-          <w:sz w:val="20"/>
-          <w:szCs w:val="20"/>
-        </w:rPr>
-        <w:t xml:space="preserve">IT user will have a profile button that displays the IT username. </w:t>
-      </w:r>
-    </w:p>
-    <w:p>
-      <w:pPr>
-        <w:numPr>
-          <w:ilvl w:val="2"/>
-          <w:numId w:val="1"/>
-        </w:numPr>
-        <w:rPr>
-          <w:rFonts w:ascii="Times New Roman" w:hAnsi="Times New Roman" w:cs="Times New Roman"/>
-          <w:sz w:val="20"/>
-          <w:szCs w:val="20"/>
-        </w:rPr>
-      </w:pPr>
-      <w:r>
-        <w:rPr>
-          <w:rFonts w:ascii="Times New Roman" w:hAnsi="Times New Roman" w:cs="Times New Roman"/>
-          <w:color w:val="000000"/>
-          <w:sz w:val="20"/>
-          <w:szCs w:val="20"/>
-        </w:rPr>
-        <w:t xml:space="preserve">The profile page will provide a log out button </w:t>
-      </w:r>
-    </w:p>
-    <w:p>
-      <w:pPr>
-        <w:numPr>
-          <w:ilvl w:val="2"/>
-          <w:numId w:val="1"/>
-        </w:numPr>
-        <w:rPr>
-          <w:rFonts w:ascii="Times New Roman" w:hAnsi="Times New Roman" w:cs="Times New Roman"/>
-          <w:sz w:val="20"/>
-          <w:szCs w:val="20"/>
-        </w:rPr>
-      </w:pPr>
-      <w:r>
-        <w:rPr>
-          <w:rFonts w:ascii="Times New Roman" w:hAnsi="Times New Roman" w:cs="Times New Roman"/>
-          <w:color w:val="000000"/>
-          <w:sz w:val="20"/>
-          <w:szCs w:val="20"/>
-        </w:rPr>
-        <w:t xml:space="preserve">When the IT user log out, they will be return to the login menu, and the server ends the session </w:t>
-      </w:r>
-    </w:p>
-    <w:p>
-      <w:pPr>
-        <w:numPr>
-          <w:ilvl w:val="2"/>
-          <w:numId w:val="1"/>
-        </w:numPr>
-        <w:rPr>
-          <w:rFonts w:ascii="Times New Roman" w:hAnsi="Times New Roman" w:cs="Times New Roman"/>
-          <w:sz w:val="20"/>
-          <w:szCs w:val="20"/>
-        </w:rPr>
-      </w:pPr>
-      <w:r>
-        <w:rPr>
-          <w:rFonts w:ascii="Times New Roman" w:hAnsi="Times New Roman" w:cs="Times New Roman"/>
-          <w:sz w:val="20"/>
-          <w:szCs w:val="20"/>
-        </w:rPr>
-        <w:t>The IT module provided an Audit view that allows the IT user to review other users’ conversation in read-only mode</w:t>
-      </w:r>
-    </w:p>
-    <w:p>
-      <w:pPr>
-        <w:numPr>
-          <w:ilvl w:val="2"/>
-          <w:numId w:val="1"/>
-        </w:numPr>
-        <w:rPr>
-          <w:rFonts w:ascii="Times New Roman" w:hAnsi="Times New Roman" w:cs="Times New Roman"/>
-          <w:sz w:val="20"/>
-          <w:szCs w:val="20"/>
-        </w:rPr>
-      </w:pPr>
-      <w:r>
-        <w:rPr>
-          <w:rFonts w:ascii="Times New Roman" w:hAnsi="Times New Roman" w:cs="Times New Roman"/>
-          <w:sz w:val="20"/>
-          <w:szCs w:val="20"/>
-        </w:rPr>
-        <w:lastRenderedPageBreak/>
-        <w:t>When Change View is selected, the application displays a User List screen</w:t>
-      </w:r>
-    </w:p>
-    <w:p>
-      <w:pPr>
-        <w:numPr>
-          <w:ilvl w:val="2"/>
-          <w:numId w:val="1"/>
-        </w:numPr>
-        <w:rPr>
-          <w:rFonts w:ascii="Times New Roman" w:hAnsi="Times New Roman" w:cs="Times New Roman"/>
-          <w:sz w:val="20"/>
-          <w:szCs w:val="20"/>
-        </w:rPr>
-      </w:pPr>
-      <w:r>
-        <w:rPr>
-          <w:rFonts w:ascii="Times New Roman" w:hAnsi="Times New Roman" w:cs="Times New Roman"/>
-          <w:sz w:val="20"/>
-          <w:szCs w:val="20"/>
-        </w:rPr>
-        <w:t>The user list screen displays a list of available users retrieved from the server</w:t>
-      </w:r>
-    </w:p>
-    <w:p>
-      <w:pPr>
-        <w:numPr>
-          <w:ilvl w:val="2"/>
-          <w:numId w:val="1"/>
-        </w:numPr>
-        <w:rPr>
-          <w:rFonts w:ascii="Times New Roman" w:hAnsi="Times New Roman" w:cs="Times New Roman"/>
-          <w:sz w:val="20"/>
-          <w:szCs w:val="20"/>
-        </w:rPr>
-      </w:pPr>
-      <w:r>
-        <w:rPr>
-          <w:rFonts w:ascii="Times New Roman" w:hAnsi="Times New Roman" w:cs="Times New Roman"/>
-          <w:sz w:val="20"/>
-          <w:szCs w:val="20"/>
-        </w:rPr>
-        <w:t xml:space="preserve">The user list screen includes a search bar that allows the IT user to search users by username </w:t>
-      </w:r>
-    </w:p>
-    <w:p>
-      <w:pPr>
-        <w:numPr>
-          <w:ilvl w:val="2"/>
-          <w:numId w:val="1"/>
-        </w:numPr>
-        <w:rPr>
-          <w:rFonts w:ascii="Times New Roman" w:hAnsi="Times New Roman" w:cs="Times New Roman"/>
-          <w:sz w:val="20"/>
-          <w:szCs w:val="20"/>
-        </w:rPr>
-      </w:pPr>
-      <w:r>
-        <w:rPr>
-          <w:rFonts w:ascii="Times New Roman" w:hAnsi="Times New Roman" w:cs="Times New Roman"/>
-          <w:sz w:val="20"/>
-          <w:szCs w:val="20"/>
-        </w:rPr>
-        <w:t>The IT user can select user either by searching and selecting from results or selecting directly from the displayed list.</w:t>
-      </w:r>
-    </w:p>
-    <w:p>
-      <w:pPr>
-        <w:numPr>
-          <w:ilvl w:val="2"/>
-          <w:numId w:val="1"/>
-        </w:numPr>
-        <w:rPr>
-          <w:rFonts w:ascii="Times New Roman" w:hAnsi="Times New Roman" w:cs="Times New Roman"/>
-          <w:sz w:val="20"/>
-          <w:szCs w:val="20"/>
-        </w:rPr>
-      </w:pPr>
-      <w:r>
-        <w:rPr>
-          <w:rFonts w:ascii="Times New Roman" w:hAnsi="Times New Roman" w:cs="Times New Roman"/>
-          <w:sz w:val="20"/>
-          <w:szCs w:val="20"/>
-        </w:rPr>
-        <w:t>When the IT user selects a user, the application enters Audit Mode for that selected user and displays the selected user Chat List</w:t>
-      </w:r>
-    </w:p>
-    <w:p>
-      <w:pPr>
-        <w:numPr>
-          <w:ilvl w:val="2"/>
-          <w:numId w:val="1"/>
-        </w:numPr>
-        <w:rPr>
-          <w:rFonts w:ascii="Times New Roman" w:hAnsi="Times New Roman" w:cs="Times New Roman"/>
-          <w:sz w:val="20"/>
-          <w:szCs w:val="20"/>
-        </w:rPr>
-      </w:pPr>
-      <w:r>
-        <w:rPr>
-          <w:rFonts w:ascii="Times New Roman" w:hAnsi="Times New Roman" w:cs="Times New Roman"/>
-          <w:sz w:val="20"/>
-          <w:szCs w:val="20"/>
-        </w:rPr>
-        <w:t>In Audit Mode, when a chat is opened, the IT user can view the full message history for that chat in a scrollable view.</w:t>
-      </w:r>
-    </w:p>
-    <w:p>
-      <w:pPr>
-        <w:numPr>
-          <w:ilvl w:val="2"/>
-          <w:numId w:val="1"/>
-        </w:numPr>
-        <w:rPr>
-          <w:rFonts w:ascii="Times New Roman" w:hAnsi="Times New Roman" w:cs="Times New Roman"/>
-          <w:sz w:val="20"/>
-          <w:szCs w:val="20"/>
-        </w:rPr>
-      </w:pPr>
-      <w:r>
-        <w:rPr>
-          <w:rFonts w:ascii="Times New Roman" w:hAnsi="Times New Roman" w:cs="Times New Roman"/>
-          <w:sz w:val="20"/>
-          <w:szCs w:val="20"/>
-        </w:rPr>
-        <w:t>The IT user can view message from both private chats and group chats</w:t>
-      </w:r>
-    </w:p>
-    <w:p>
-      <w:pPr>
-        <w:numPr>
-          <w:ilvl w:val="2"/>
-          <w:numId w:val="1"/>
-        </w:numPr>
-        <w:rPr>
-          <w:rFonts w:ascii="Times New Roman" w:hAnsi="Times New Roman" w:cs="Times New Roman"/>
-          <w:sz w:val="20"/>
-          <w:szCs w:val="20"/>
-        </w:rPr>
-      </w:pPr>
-      <w:r>
-        <w:rPr>
-          <w:rFonts w:ascii="Times New Roman" w:hAnsi="Times New Roman" w:cs="Times New Roman"/>
-          <w:sz w:val="20"/>
-          <w:szCs w:val="20"/>
-        </w:rPr>
-        <w:t>In Audit Mode, the IT user is not permitted to send, delete, or edit any chats</w:t>
-      </w:r>
-    </w:p>
-    <w:p>
-      <w:pPr>
-        <w:numPr>
-          <w:ilvl w:val="2"/>
-          <w:numId w:val="1"/>
-        </w:numPr>
-        <w:rPr>
-          <w:rFonts w:ascii="Times New Roman" w:hAnsi="Times New Roman" w:cs="Times New Roman"/>
-          <w:sz w:val="20"/>
-          <w:szCs w:val="20"/>
-        </w:rPr>
-      </w:pPr>
-      <w:r>
-        <w:rPr>
-          <w:rFonts w:ascii="Times New Roman" w:hAnsi="Times New Roman" w:cs="Times New Roman"/>
-          <w:sz w:val="20"/>
-          <w:szCs w:val="20"/>
-        </w:rPr>
-        <w:t>In Audit Mode, the application visually indicates that the IT user is viewing chats as another user</w:t>
-      </w:r>
-    </w:p>
-    <w:p>
-      <w:pPr>
-        <w:numPr>
-          <w:ilvl w:val="2"/>
-          <w:numId w:val="1"/>
-        </w:numPr>
-        <w:rPr>
-          <w:rFonts w:ascii="Times New Roman" w:hAnsi="Times New Roman" w:cs="Times New Roman"/>
-          <w:sz w:val="20"/>
-          <w:szCs w:val="20"/>
-        </w:rPr>
-      </w:pPr>
-      <w:r>
-        <w:rPr>
-          <w:rFonts w:ascii="Times New Roman" w:hAnsi="Times New Roman" w:cs="Times New Roman"/>
-          <w:sz w:val="20"/>
-          <w:szCs w:val="20"/>
-        </w:rPr>
-        <w:t>The IT user can exit Audit Mode by selecting Change View and selecting their user</w:t>
+          <w:sz w:val="20"/>
+          <w:szCs w:val="20"/>
+        </w:rPr>
+        <w:t xml:space="preserve">The IT user can exit Audit Mode by </w:t>
+      </w:r>
+      <w:r>
+        <w:rPr>
+          <w:rFonts w:ascii="Times New Roman" w:hAnsi="Times New Roman" w:cs="Times New Roman"/>
+          <w:sz w:val="20"/>
+          <w:szCs w:val="20"/>
+        </w:rPr>
+        <w:t>pressing the exit audit mode button</w:t>
       </w:r>
     </w:p>
     <w:p>
@@ -7352,16 +7077,14 @@
         </w:rPr>
         <w:t xml:space="preserve">The CSM must be able to </w:t>
       </w:r>
-      <w:proofErr w:type="spellStart"/>
-      <w:r>
-        <w:rPr>
-          <w:rFonts w:ascii="Times New Roman" w:eastAsia="Times New Roman" w:hAnsi="Times New Roman" w:cs="Times New Roman"/>
-          <w:sz w:val="20"/>
-          <w:szCs w:val="20"/>
-        </w:rPr>
-        <w:t>conncurrently</w:t>
-      </w:r>
-      <w:proofErr w:type="spellEnd"/>
+      <w:r>
+        <w:rPr>
+          <w:rFonts w:ascii="Times New Roman" w:eastAsia="Times New Roman" w:hAnsi="Times New Roman" w:cs="Times New Roman"/>
+          <w:sz w:val="20"/>
+          <w:szCs w:val="20"/>
+        </w:rPr>
+        <w:t>concurrently</w:t>
+      </w:r>
       <w:r>
         <w:rPr>
           <w:rFonts w:ascii="Times New Roman" w:eastAsia="Times New Roman" w:hAnsi="Times New Roman" w:cs="Times New Roman"/>
@@ -7388,7 +7111,7 @@
           <w:sz w:val="20"/>
           <w:szCs w:val="20"/>
         </w:rPr>
-        <w:t>(?) The CSM stores usernames and passwords for account authentications, to be compared with usernames and passwords sent from the LM</w:t>
+        <w:t>The CSM stores usernames and passwords for account authentications, to be compared with usernames and passwords sent from the LM</w:t>
       </w:r>
     </w:p>
     <w:p>
@@ -7408,6 +7131,7 @@
           <w:sz w:val="20"/>
           <w:szCs w:val="20"/>
         </w:rPr>
+        <w:lastRenderedPageBreak/>
         <w:t>Upon succeeding or failing authentication, the CSM will signal so to the LM.</w:t>
       </w:r>
     </w:p>
@@ -7781,7 +7505,6 @@
           <w:szCs w:val="20"/>
           <w:lang w:val="en-US"/>
         </w:rPr>
-        <w:lastRenderedPageBreak/>
         <w:t>The client interface shall provide a message input box and send action for transmitting messages to the server.</w:t>
       </w:r>
     </w:p>

</xml_diff>